<commit_message>
fix: calcular stand-by por colaborador e ajustar espaçamento das propostas
</commit_message>
<xml_diff>
--- a/backend/models/comercial/Proposta Comercial.docx
+++ b/backend/models/comercial/Proposta Comercial.docx
@@ -3931,7 +3931,7 @@
           <w:ilvl w:val="0"/>
           <w:numId w:val="2"/>
         </w:numPr>
-        <w:spacing w:after="0" w:line="240" w:lineRule="auto"/>
+        <w:spacing w:after="120" w:line="240" w:lineRule="auto" w:before="0"/>
         <w:jc w:val="both"/>
       </w:pPr>
       <w:r>
@@ -3955,14 +3955,6 @@
         </w:rPr>
         <w:t>Descrição dos serviços que serão executados:</w:t>
       </w:r>
-    </w:p>
-    <w:p>
-      <w:pPr>
-        <w:pStyle w:val="PargrafodaLista"/>
-        <w:spacing w:after="0" w:line="240" w:lineRule="auto"/>
-        <w:ind w:left="360"/>
-        <w:jc w:val="both"/>
-      </w:pPr>
     </w:p>
     <w:p>
       <w:pPr>
@@ -3971,7 +3963,7 @@
           <w:ilvl w:val="1"/>
           <w:numId w:val="2"/>
         </w:numPr>
-        <w:spacing w:after="0" w:line="360" w:lineRule="auto"/>
+        <w:spacing w:after="120" w:line="360" w:lineRule="auto" w:before="0"/>
         <w:jc w:val="both"/>
       </w:pPr>
       <w:r>
@@ -3990,24 +3982,12 @@
           <w:ilvl w:val="1"/>
           <w:numId w:val="2"/>
         </w:numPr>
-        <w:spacing w:after="0" w:line="360" w:lineRule="auto"/>
+        <w:spacing w:after="120" w:line="360" w:lineRule="auto" w:before="0"/>
         <w:jc w:val="both"/>
       </w:pPr>
       <w:r>
         <w:t>{{escopo_blocos}}</w:t>
       </w:r>
-    </w:p>
-    <w:p>
-      <w:pPr>
-        <w:spacing w:after="0" w:line="360" w:lineRule="auto"/>
-        <w:ind w:firstLine="708"/>
-        <w:jc w:val="both"/>
-        <w:rPr>
-          <w:rFonts w:ascii="Arial" w:eastAsia="Arial" w:hAnsi="Arial"/>
-          <w:sz w:val="20"/>
-          <w:szCs w:val="20"/>
-        </w:rPr>
-      </w:pPr>
     </w:p>
     <w:p>
       <w:pPr>
@@ -4018,6 +3998,7 @@
           <w:sz w:val="20"/>
           <w:szCs w:val="20"/>
         </w:rPr>
+        <w:spacing w:before="0" w:after="120"/>
       </w:pPr>
       <w:r>
         <w:rPr>
@@ -4055,6 +4036,7 @@
           <w:sz w:val="20"/>
           <w:szCs w:val="20"/>
         </w:rPr>
+        <w:spacing w:before="0" w:after="120"/>
       </w:pPr>
       <w:r>
         <w:rPr>
@@ -4064,28 +4046,6 @@
         </w:rPr>
         <w:t>não fazem parte do escopo.</w:t>
       </w:r>
-    </w:p>
-    <w:p>
-      <w:pPr>
-        <w:pStyle w:val="PargrafodaLista"/>
-        <w:ind w:left="360"/>
-        <w:rPr>
-          <w:rFonts w:ascii="Arial" w:hAnsi="Arial" w:cs="Arial"/>
-          <w:sz w:val="20"/>
-          <w:szCs w:val="20"/>
-        </w:rPr>
-      </w:pPr>
-    </w:p>
-    <w:p>
-      <w:pPr>
-        <w:pStyle w:val="PargrafodaLista"/>
-        <w:ind w:left="360"/>
-        <w:rPr>
-          <w:rFonts w:ascii="Arial" w:hAnsi="Arial" w:cs="Arial"/>
-          <w:sz w:val="20"/>
-          <w:szCs w:val="20"/>
-        </w:rPr>
-      </w:pPr>
     </w:p>
     <w:p>
       <w:pPr>
@@ -4100,6 +4060,7 @@
           <w:sz w:val="20"/>
           <w:szCs w:val="20"/>
         </w:rPr>
+        <w:spacing w:before="0" w:after="120"/>
       </w:pPr>
       <w:r>
         <w:rPr>
@@ -4122,18 +4083,6 @@
         </w:rPr>
         <w:t>Matriz geral de responsabilidade</w:t>
       </w:r>
-    </w:p>
-    <w:p>
-      <w:pPr>
-        <w:pStyle w:val="PargrafodaLista"/>
-        <w:ind w:left="360"/>
-        <w:rPr>
-          <w:rFonts w:ascii="Arial" w:hAnsi="Arial" w:cs="Arial"/>
-          <w:b/>
-          <w:sz w:val="20"/>
-          <w:szCs w:val="20"/>
-        </w:rPr>
-      </w:pPr>
     </w:p>
     <w:p>
       <w:pPr>
@@ -4148,6 +4097,7 @@
           <w:sz w:val="20"/>
           <w:szCs w:val="20"/>
         </w:rPr>
+        <w:spacing w:before="0" w:after="120"/>
       </w:pPr>
       <w:r>
         <w:rPr>
@@ -4437,7 +4387,7 @@
           </w:tcPr>
           <w:p>
             <w:pPr>
-              <w:spacing w:before="120" w:after="0" w:line="240" w:lineRule="auto"/>
+              <w:spacing w:before="0" w:after="120" w:line="240" w:lineRule="auto"/>
               <w:jc w:val="both"/>
               <w:rPr>
                 <w:rFonts w:ascii="Arial" w:eastAsia="Arial" w:hAnsi="Arial" w:cs="Arial"/>
@@ -4464,18 +4414,6 @@
     <w:p>
       <w:pPr>
         <w:pStyle w:val="PargrafodaLista"/>
-        <w:ind w:left="1068"/>
-        <w:rPr>
-          <w:rFonts w:ascii="Arial" w:hAnsi="Arial" w:cs="Arial"/>
-          <w:b/>
-          <w:sz w:val="20"/>
-          <w:szCs w:val="20"/>
-        </w:rPr>
-      </w:pPr>
-    </w:p>
-    <w:p>
-      <w:pPr>
-        <w:pStyle w:val="PargrafodaLista"/>
         <w:numPr>
           <w:ilvl w:val="1"/>
           <w:numId w:val="2"/>
@@ -4486,6 +4424,7 @@
           <w:sz w:val="20"/>
           <w:szCs w:val="20"/>
         </w:rPr>
+        <w:spacing w:before="0" w:after="120"/>
       </w:pPr>
       <w:r>
         <w:rPr>
@@ -4799,34 +4738,12 @@
     </w:tbl>
     <w:p>
       <w:pPr>
-        <w:spacing w:after="0" w:line="240" w:lineRule="auto"/>
-        <w:jc w:val="both"/>
-        <w:rPr>
-          <w:rFonts w:ascii="Arial" w:eastAsia="Arial" w:hAnsi="Arial"/>
-          <w:sz w:val="20"/>
-          <w:szCs w:val="20"/>
-        </w:rPr>
-      </w:pPr>
-    </w:p>
-    <w:p>
-      <w:pPr>
-        <w:spacing w:after="0" w:line="240" w:lineRule="auto"/>
-        <w:jc w:val="both"/>
-        <w:rPr>
-          <w:rFonts w:ascii="Arial" w:eastAsia="Arial" w:hAnsi="Arial"/>
-          <w:sz w:val="20"/>
-          <w:szCs w:val="20"/>
-        </w:rPr>
-      </w:pPr>
-    </w:p>
-    <w:p>
-      <w:pPr>
         <w:pStyle w:val="PargrafodaLista"/>
         <w:numPr>
           <w:ilvl w:val="0"/>
           <w:numId w:val="2"/>
         </w:numPr>
-        <w:spacing w:after="0" w:line="240" w:lineRule="auto"/>
+        <w:spacing w:after="120" w:line="240" w:lineRule="auto" w:before="0"/>
         <w:jc w:val="both"/>
       </w:pPr>
       <w:r>
@@ -4839,14 +4756,6 @@
         </w:rPr>
         <w:t>- Previsão de atendimento:</w:t>
       </w:r>
-    </w:p>
-    <w:p>
-      <w:pPr>
-        <w:pStyle w:val="PargrafodaLista"/>
-        <w:spacing w:after="0" w:line="240" w:lineRule="auto"/>
-        <w:ind w:left="360"/>
-        <w:jc w:val="both"/>
-      </w:pPr>
     </w:p>
     <w:p>
       <w:pPr>
@@ -4855,7 +4764,7 @@
           <w:ilvl w:val="1"/>
           <w:numId w:val="2"/>
         </w:numPr>
-        <w:spacing w:after="0" w:line="240" w:lineRule="auto"/>
+        <w:spacing w:after="120" w:line="240" w:lineRule="auto" w:before="0"/>
         <w:jc w:val="both"/>
       </w:pPr>
       <w:r>
@@ -4907,14 +4816,6 @@
         </w:rPr>
         <w:t>após o recebimento do pedido de compras ou assinatura do contrato.</w:t>
       </w:r>
-    </w:p>
-    <w:p>
-      <w:pPr>
-        <w:pStyle w:val="PargrafodaLista"/>
-        <w:spacing w:after="0" w:line="240" w:lineRule="auto"/>
-        <w:ind w:left="1068"/>
-        <w:jc w:val="both"/>
-      </w:pPr>
     </w:p>
     <w:p>
       <w:pPr>
@@ -4923,7 +4824,7 @@
           <w:ilvl w:val="2"/>
           <w:numId w:val="2"/>
         </w:numPr>
-        <w:spacing w:after="0" w:line="240" w:lineRule="auto"/>
+        <w:spacing w:after="120" w:line="240" w:lineRule="auto" w:before="0"/>
         <w:jc w:val="both"/>
       </w:pPr>
       <w:r>
@@ -4934,14 +4835,6 @@
         </w:rPr>
         <w:t>Nos casos em que o contrato for firmado entre a Filtrovali e a montadora, porém o faturamento ocorrer diretamente para o Cliente Final, a mobilização ficará condicionada à emissão do pedido de compra pelo Cliente Final;</w:t>
       </w:r>
-    </w:p>
-    <w:p>
-      <w:pPr>
-        <w:pStyle w:val="PargrafodaLista"/>
-        <w:spacing w:after="0" w:line="240" w:lineRule="auto"/>
-        <w:ind w:left="2136"/>
-        <w:jc w:val="both"/>
-      </w:pPr>
     </w:p>
     <w:p>
       <w:pPr>
@@ -4950,7 +4843,7 @@
           <w:ilvl w:val="2"/>
           <w:numId w:val="2"/>
         </w:numPr>
-        <w:spacing w:after="0" w:line="240" w:lineRule="auto"/>
+        <w:spacing w:after="120" w:line="240" w:lineRule="auto" w:before="0"/>
         <w:jc w:val="both"/>
       </w:pPr>
       <w:r>
@@ -4961,24 +4854,6 @@
         </w:rPr>
         <w:t xml:space="preserve">O texto acima deve ser válido a cada mudança de data para atendimento.  </w:t>
       </w:r>
-    </w:p>
-    <w:p>
-      <w:pPr>
-        <w:spacing w:after="0" w:line="240" w:lineRule="auto"/>
-        <w:jc w:val="both"/>
-        <w:rPr>
-          <w:rFonts w:ascii="Arial" w:eastAsia="Arial" w:hAnsi="Arial"/>
-        </w:rPr>
-      </w:pPr>
-    </w:p>
-    <w:p>
-      <w:pPr>
-        <w:spacing w:after="0" w:line="240" w:lineRule="auto"/>
-        <w:jc w:val="both"/>
-        <w:rPr>
-          <w:rFonts w:ascii="Arial" w:eastAsia="Arial" w:hAnsi="Arial"/>
-        </w:rPr>
-      </w:pPr>
     </w:p>
     <w:p>
       <w:pPr>
@@ -4987,7 +4862,7 @@
           <w:ilvl w:val="0"/>
           <w:numId w:val="2"/>
         </w:numPr>
-        <w:spacing w:after="0" w:line="240" w:lineRule="auto"/>
+        <w:spacing w:after="120" w:line="240" w:lineRule="auto" w:before="0"/>
         <w:jc w:val="both"/>
       </w:pPr>
       <w:r>
@@ -5004,17 +4879,9 @@
     <w:p>
       <w:pPr>
         <w:pStyle w:val="PargrafodaLista"/>
-        <w:spacing w:after="0" w:line="240" w:lineRule="auto"/>
+        <w:spacing w:after="120" w:line="240" w:lineRule="auto" w:before="0"/>
         <w:ind w:left="360"/>
         <w:jc w:val="both"/>
-      </w:pPr>
-    </w:p>
-    <w:p>
-      <w:pPr>
-        <w:pStyle w:val="PargrafodaLista"/>
-        <w:spacing w:after="0" w:line="240" w:lineRule="auto"/>
-        <w:ind w:left="360"/>
-        <w:jc w:val="both"/>
         <w:rPr>
           <w:rFonts w:ascii="Arial" w:hAnsi="Arial" w:cs="Arial"/>
           <w:sz w:val="20"/>
@@ -5029,14 +4896,6 @@
         </w:rPr>
         <w:t>O cronograma apresentado leva em consideração a disponibilidade de todas as frentes de serviço prontas e liberadas para a equipe Filtrovali. É importante ressaltar que qualquer indisponibilidade das frentes de serviço para a equipe da Filtrovali poderá resultar em alterações no cronograma.</w:t>
       </w:r>
-    </w:p>
-    <w:p>
-      <w:pPr>
-        <w:pStyle w:val="PargrafodaLista"/>
-        <w:spacing w:after="0" w:line="240" w:lineRule="auto"/>
-        <w:ind w:left="360"/>
-        <w:jc w:val="both"/>
-      </w:pPr>
     </w:p>
     <w:p>
       <w:pPr>
@@ -5045,7 +4904,7 @@
           <w:ilvl w:val="1"/>
           <w:numId w:val="2"/>
         </w:numPr>
-        <w:spacing w:after="0" w:line="240" w:lineRule="auto"/>
+        <w:spacing w:after="120" w:line="240" w:lineRule="auto" w:before="0"/>
         <w:jc w:val="both"/>
       </w:pPr>
       <w:r>
@@ -5074,14 +4933,6 @@
         </w:rPr>
         <w:t>}} dia(s);</w:t>
       </w:r>
-    </w:p>
-    <w:p>
-      <w:pPr>
-        <w:pStyle w:val="PargrafodaLista"/>
-        <w:spacing w:after="0" w:line="240" w:lineRule="auto"/>
-        <w:ind w:left="1068"/>
-        <w:jc w:val="both"/>
-      </w:pPr>
     </w:p>
     <w:p>
       <w:pPr>
@@ -5090,7 +4941,7 @@
           <w:ilvl w:val="2"/>
           <w:numId w:val="2"/>
         </w:numPr>
-        <w:spacing w:after="0" w:line="240" w:lineRule="auto"/>
+        <w:spacing w:after="120" w:line="240" w:lineRule="auto" w:before="0"/>
         <w:jc w:val="both"/>
       </w:pPr>
       <w:r>
@@ -5119,14 +4970,6 @@
         </w:rPr>
         <w:t>}} dia(s);</w:t>
       </w:r>
-    </w:p>
-    <w:p>
-      <w:pPr>
-        <w:pStyle w:val="PargrafodaLista"/>
-        <w:spacing w:after="0" w:line="240" w:lineRule="auto"/>
-        <w:ind w:left="2136"/>
-        <w:jc w:val="both"/>
-      </w:pPr>
     </w:p>
     <w:p>
       <w:pPr>
@@ -5135,7 +4978,7 @@
           <w:ilvl w:val="2"/>
           <w:numId w:val="2"/>
         </w:numPr>
-        <w:spacing w:after="0" w:line="240" w:lineRule="auto"/>
+        <w:spacing w:after="120" w:line="240" w:lineRule="auto" w:before="0"/>
         <w:jc w:val="both"/>
       </w:pPr>
       <w:r>
@@ -5164,14 +5007,6 @@
         </w:rPr>
         <w:t>}} dia(as)</w:t>
       </w:r>
-    </w:p>
-    <w:p>
-      <w:pPr>
-        <w:pStyle w:val="PargrafodaLista"/>
-        <w:spacing w:after="0" w:line="240" w:lineRule="auto"/>
-        <w:ind w:left="1068"/>
-        <w:jc w:val="both"/>
-      </w:pPr>
     </w:p>
     <w:p>
       <w:pPr>
@@ -5180,7 +5015,7 @@
           <w:ilvl w:val="1"/>
           <w:numId w:val="2"/>
         </w:numPr>
-        <w:spacing w:after="0" w:line="240" w:lineRule="auto"/>
+        <w:spacing w:after="120" w:line="240" w:lineRule="auto" w:before="0"/>
         <w:jc w:val="both"/>
       </w:pPr>
       <w:r>
@@ -5248,13 +5083,7 @@
     </w:p>
     <w:p>
       <w:pPr>
-        <w:spacing w:after="0" w:line="240" w:lineRule="auto"/>
-        <w:jc w:val="both"/>
-      </w:pPr>
-    </w:p>
-    <w:p>
-      <w:pPr>
-        <w:spacing w:after="0" w:line="240" w:lineRule="auto"/>
+        <w:spacing w:after="120" w:line="240" w:lineRule="auto" w:before="0"/>
         <w:ind w:firstLine="708"/>
         <w:jc w:val="both"/>
       </w:pPr>
@@ -5265,31 +5094,6 @@
           <w:szCs w:val="20"/>
         </w:rPr>
         <w:t>NOTA: O prazo de deslocamento não está incluso ao prazo previsto de permanência em obra.</w:t>
-      </w:r>
-    </w:p>
-    <w:p>
-      <w:pPr>
-        <w:spacing w:after="0" w:line="240" w:lineRule="auto"/>
-        <w:jc w:val="both"/>
-        <w:rPr>
-          <w:rFonts w:ascii="Arial" w:eastAsia="Arial" w:hAnsi="Arial"/>
-          <w:sz w:val="20"/>
-          <w:szCs w:val="20"/>
-        </w:rPr>
-      </w:pPr>
-    </w:p>
-    <w:p>
-      <w:pPr>
-        <w:spacing w:after="0" w:line="240" w:lineRule="auto"/>
-        <w:jc w:val="both"/>
-      </w:pPr>
-      <w:r>
-        <w:rPr>
-          <w:rFonts w:ascii="Arial" w:eastAsia="Arial" w:hAnsi="Arial"/>
-          <w:sz w:val="20"/>
-          <w:szCs w:val="20"/>
-        </w:rPr>
-        <w:t xml:space="preserve"> </w:t>
       </w:r>
     </w:p>
     <w:p>
@@ -5299,7 +5103,7 @@
           <w:ilvl w:val="0"/>
           <w:numId w:val="2"/>
         </w:numPr>
-        <w:spacing w:after="0" w:line="240" w:lineRule="auto"/>
+        <w:spacing w:after="120" w:line="240" w:lineRule="auto" w:before="0"/>
         <w:jc w:val="both"/>
       </w:pPr>
       <w:r>
@@ -5316,22 +5120,9 @@
     <w:p>
       <w:pPr>
         <w:pStyle w:val="PargrafodaLista"/>
-        <w:spacing w:after="0" w:line="240" w:lineRule="auto"/>
+        <w:spacing w:after="120" w:line="240" w:lineRule="auto" w:before="0"/>
         <w:ind w:left="360"/>
         <w:jc w:val="both"/>
-        <w:rPr>
-          <w:rFonts w:ascii="Arial" w:eastAsia="Arial" w:hAnsi="Arial"/>
-          <w:sz w:val="20"/>
-          <w:szCs w:val="20"/>
-        </w:rPr>
-      </w:pPr>
-    </w:p>
-    <w:p>
-      <w:pPr>
-        <w:pStyle w:val="PargrafodaLista"/>
-        <w:spacing w:after="0" w:line="240" w:lineRule="auto"/>
-        <w:ind w:left="360"/>
-        <w:jc w:val="both"/>
       </w:pPr>
       <w:r>
         <w:rPr>
@@ -5341,12 +5132,6 @@
         </w:rPr>
         <w:t xml:space="preserve">O horário de entrada e saída das equipes em obra é flexível podendo se adaptar ao horário do projeto em questão, desde que não ultrapasse 44 horas semanais conforme normas previstas na CLT. </w:t>
       </w:r>
-    </w:p>
-    <w:p>
-      <w:pPr>
-        <w:spacing w:after="0" w:line="240" w:lineRule="auto"/>
-        <w:jc w:val="both"/>
-      </w:pPr>
     </w:p>
     <w:p>
       <w:pPr>
@@ -5355,7 +5140,7 @@
           <w:ilvl w:val="1"/>
           <w:numId w:val="2"/>
         </w:numPr>
-        <w:spacing w:after="0" w:line="240" w:lineRule="auto"/>
+        <w:spacing w:after="120" w:line="240" w:lineRule="auto" w:before="0"/>
         <w:jc w:val="both"/>
       </w:pPr>
       <w:r>
@@ -5366,14 +5151,6 @@
         </w:rPr>
         <w:t>Turno diurno:</w:t>
       </w:r>
-    </w:p>
-    <w:p>
-      <w:pPr>
-        <w:pStyle w:val="PargrafodaLista"/>
-        <w:spacing w:after="0" w:line="240" w:lineRule="auto"/>
-        <w:ind w:left="1068"/>
-        <w:jc w:val="both"/>
-      </w:pPr>
     </w:p>
     <w:p>
       <w:pPr>
@@ -5382,7 +5159,7 @@
           <w:ilvl w:val="2"/>
           <w:numId w:val="2"/>
         </w:numPr>
-        <w:spacing w:after="0" w:line="360" w:lineRule="auto"/>
+        <w:spacing w:after="120" w:line="360" w:lineRule="auto" w:before="0"/>
         <w:jc w:val="both"/>
       </w:pPr>
       <w:r>
@@ -5401,7 +5178,7 @@
           <w:ilvl w:val="2"/>
           <w:numId w:val="2"/>
         </w:numPr>
-        <w:spacing w:after="0" w:line="360" w:lineRule="auto"/>
+        <w:spacing w:after="120" w:line="360" w:lineRule="auto" w:before="0"/>
         <w:jc w:val="both"/>
       </w:pPr>
       <w:r>
@@ -5415,24 +5192,7 @@
     </w:p>
     <w:p>
       <w:pPr>
-        <w:spacing w:after="0" w:line="240" w:lineRule="auto"/>
-        <w:jc w:val="both"/>
-        <w:rPr>
-          <w:rFonts w:ascii="Arial" w:eastAsia="Arial" w:hAnsi="Arial"/>
-        </w:rPr>
-      </w:pPr>
-      <w:r>
-        <w:rPr>
-          <w:rFonts w:ascii="Arial" w:eastAsia="Arial" w:hAnsi="Arial"/>
-          <w:sz w:val="20"/>
-          <w:szCs w:val="20"/>
-        </w:rPr>
-        <w:t xml:space="preserve"> </w:t>
-      </w:r>
-    </w:p>
-    <w:p>
-      <w:pPr>
-        <w:spacing w:after="0" w:line="360" w:lineRule="auto"/>
+        <w:spacing w:after="120" w:line="360" w:lineRule="auto" w:before="0"/>
         <w:ind w:firstLine="708"/>
         <w:jc w:val="both"/>
         <w:rPr>
@@ -5449,17 +5209,6 @@
         </w:rPr>
         <w:t xml:space="preserve">Notas: Os trabalhos em horas extras (sábados, domingos, feriados e além do previsto no item 6.1) poderão ser executados quando solicitado pela Contratante. Será feito o registro em RDO, indicado no campo Horas Extras e lançado na medição como adicional. </w:t>
       </w:r>
-    </w:p>
-    <w:p>
-      <w:pPr>
-        <w:spacing w:after="0" w:line="360" w:lineRule="auto"/>
-        <w:rPr>
-          <w:rFonts w:ascii="Arial" w:hAnsi="Arial" w:cs="Arial"/>
-          <w:b/>
-          <w:sz w:val="20"/>
-          <w:szCs w:val="20"/>
-        </w:rPr>
-      </w:pPr>
     </w:p>
     <w:p>
       <w:pPr>
@@ -5468,7 +5217,7 @@
           <w:ilvl w:val="0"/>
           <w:numId w:val="2"/>
         </w:numPr>
-        <w:spacing w:after="0" w:line="240" w:lineRule="auto"/>
+        <w:spacing w:after="120" w:line="240" w:lineRule="auto" w:before="0"/>
         <w:jc w:val="both"/>
       </w:pPr>
       <w:r>
@@ -5481,14 +5230,6 @@
         </w:rPr>
         <w:t>- Descrição dos valores:</w:t>
       </w:r>
-    </w:p>
-    <w:p>
-      <w:pPr>
-        <w:pStyle w:val="PargrafodaLista"/>
-        <w:spacing w:after="0" w:line="240" w:lineRule="auto"/>
-        <w:ind w:left="360"/>
-        <w:jc w:val="both"/>
-      </w:pPr>
     </w:p>
     <w:tbl>
       <w:tblPr>
@@ -5817,19 +5558,12 @@
     </w:tbl>
     <w:p>
       <w:pPr>
-        <w:spacing w:after="0" w:line="240" w:lineRule="auto"/>
-        <w:ind w:right="567"/>
-        <w:jc w:val="both"/>
-      </w:pPr>
-    </w:p>
-    <w:p>
-      <w:pPr>
         <w:pStyle w:val="PargrafodaLista"/>
         <w:numPr>
           <w:ilvl w:val="1"/>
           <w:numId w:val="2"/>
         </w:numPr>
-        <w:spacing w:after="0" w:line="240" w:lineRule="auto"/>
+        <w:spacing w:after="120" w:line="240" w:lineRule="auto" w:before="0"/>
         <w:jc w:val="both"/>
         <w:rPr>
           <w:rFonts w:ascii="Arial" w:eastAsia="Arial" w:hAnsi="Arial"/>
@@ -5863,19 +5597,6 @@
         </w:rPr>
         <w:t xml:space="preserve"> por litro de óleo, além dos custos com mobilização e desmobilização do equipamento, caso ele não esteja em campo.</w:t>
       </w:r>
-    </w:p>
-    <w:p>
-      <w:pPr>
-        <w:pStyle w:val="PargrafodaLista"/>
-        <w:spacing w:after="0" w:line="240" w:lineRule="auto"/>
-        <w:ind w:left="1068"/>
-        <w:jc w:val="both"/>
-        <w:rPr>
-          <w:rFonts w:ascii="Arial" w:eastAsia="Arial" w:hAnsi="Arial"/>
-          <w:sz w:val="20"/>
-          <w:szCs w:val="20"/>
-        </w:rPr>
-      </w:pPr>
     </w:p>
     <w:p>
       <w:pPr>
@@ -5884,7 +5605,7 @@
           <w:ilvl w:val="1"/>
           <w:numId w:val="2"/>
         </w:numPr>
-        <w:spacing w:after="0" w:line="240" w:lineRule="auto"/>
+        <w:spacing w:after="120" w:line="240" w:lineRule="auto" w:before="0"/>
         <w:jc w:val="both"/>
         <w:rPr>
           <w:rFonts w:ascii="Arial" w:eastAsia="Arial" w:hAnsi="Arial"/>
@@ -5918,28 +5639,6 @@
         </w:rPr>
         <w:t xml:space="preserve"> por litro de óleo, além dos custos com mobilização e desmobilização do equipamento, caso ele não esteja em campo.</w:t>
       </w:r>
-    </w:p>
-    <w:p>
-      <w:pPr>
-        <w:spacing w:after="0" w:line="240" w:lineRule="auto"/>
-        <w:jc w:val="both"/>
-        <w:rPr>
-          <w:rFonts w:ascii="Arial" w:eastAsia="Arial" w:hAnsi="Arial"/>
-          <w:sz w:val="20"/>
-          <w:szCs w:val="20"/>
-        </w:rPr>
-      </w:pPr>
-    </w:p>
-    <w:p>
-      <w:pPr>
-        <w:spacing w:after="0" w:line="240" w:lineRule="auto"/>
-        <w:jc w:val="both"/>
-        <w:rPr>
-          <w:rFonts w:ascii="Arial" w:eastAsia="Arial" w:hAnsi="Arial"/>
-          <w:sz w:val="20"/>
-          <w:szCs w:val="20"/>
-        </w:rPr>
-      </w:pPr>
     </w:p>
     <w:p>
       <w:pPr>
@@ -5948,7 +5647,7 @@
           <w:ilvl w:val="0"/>
           <w:numId w:val="2"/>
         </w:numPr>
-        <w:spacing w:after="0" w:line="240" w:lineRule="auto"/>
+        <w:spacing w:after="120" w:line="240" w:lineRule="auto" w:before="0"/>
         <w:jc w:val="both"/>
       </w:pPr>
       <w:r>
@@ -5961,14 +5660,6 @@
         </w:rPr>
         <w:t>- Condições de pagamento:</w:t>
       </w:r>
-    </w:p>
-    <w:p>
-      <w:pPr>
-        <w:pStyle w:val="PargrafodaLista"/>
-        <w:spacing w:after="0" w:line="240" w:lineRule="auto"/>
-        <w:ind w:left="360"/>
-        <w:jc w:val="both"/>
-      </w:pPr>
     </w:p>
     <w:p>
       <w:pPr>
@@ -5977,7 +5668,7 @@
           <w:ilvl w:val="1"/>
           <w:numId w:val="2"/>
         </w:numPr>
-        <w:spacing w:after="0" w:line="240" w:lineRule="auto"/>
+        <w:spacing w:after="120" w:line="240" w:lineRule="auto" w:before="0"/>
         <w:jc w:val="both"/>
       </w:pPr>
       <w:r>
@@ -6030,14 +5721,6 @@
         </w:rPr>
         <w:t xml:space="preserve"> antecipado na confirmação dos serviços (recebimento de pedido de compras, contrato ou aceite da proposta por e-mail. Favor aguardar espelho da nota de serviço para efetuar o pagamento;</w:t>
       </w:r>
-    </w:p>
-    <w:p>
-      <w:pPr>
-        <w:pStyle w:val="PargrafodaLista"/>
-        <w:spacing w:after="0" w:line="240" w:lineRule="auto"/>
-        <w:ind w:left="1068"/>
-        <w:jc w:val="both"/>
-      </w:pPr>
     </w:p>
     <w:p>
       <w:pPr>
@@ -6046,7 +5729,7 @@
           <w:ilvl w:val="1"/>
           <w:numId w:val="2"/>
         </w:numPr>
-        <w:spacing w:after="0" w:line="240" w:lineRule="auto"/>
+        <w:spacing w:after="120" w:line="240" w:lineRule="auto" w:before="0"/>
         <w:jc w:val="both"/>
       </w:pPr>
       <w:r>
@@ -6115,16 +5798,6 @@
         </w:rPr>
         <w:t>}} (Obs. após a entrega da medição a contratante deverá devolver a mesma em até 48 horas, caso não ocorra a Filtrovali irá considerar a medição como aceita e será emitida a nota para devida cobrança);</w:t>
       </w:r>
-    </w:p>
-    <w:p>
-      <w:pPr>
-        <w:pStyle w:val="PargrafodaLista"/>
-        <w:rPr>
-          <w:rFonts w:ascii="Arial" w:eastAsia="Arial" w:hAnsi="Arial"/>
-          <w:sz w:val="20"/>
-          <w:szCs w:val="20"/>
-        </w:rPr>
-      </w:pPr>
     </w:p>
     <w:p>
       <w:pPr>
@@ -6133,7 +5806,7 @@
           <w:ilvl w:val="1"/>
           <w:numId w:val="2"/>
         </w:numPr>
-        <w:spacing w:after="0" w:line="240" w:lineRule="auto"/>
+        <w:spacing w:after="120" w:line="240" w:lineRule="auto" w:before="0"/>
         <w:jc w:val="both"/>
       </w:pPr>
       <w:r>
@@ -6147,7 +5820,7 @@
     </w:p>
     <w:p>
       <w:pPr>
-        <w:spacing w:after="0" w:line="240" w:lineRule="auto"/>
+        <w:spacing w:after="120" w:line="240" w:lineRule="auto" w:before="0"/>
         <w:ind w:firstLine="708"/>
         <w:jc w:val="both"/>
         <w:rPr>
@@ -6156,18 +5829,6 @@
           <w:szCs w:val="20"/>
         </w:rPr>
       </w:pPr>
-    </w:p>
-    <w:p>
-      <w:pPr>
-        <w:spacing w:after="0" w:line="240" w:lineRule="auto"/>
-        <w:ind w:firstLine="708"/>
-        <w:jc w:val="both"/>
-        <w:rPr>
-          <w:rFonts w:ascii="Arial" w:eastAsia="Arial" w:hAnsi="Arial"/>
-          <w:sz w:val="20"/>
-          <w:szCs w:val="20"/>
-        </w:rPr>
-      </w:pPr>
       <w:r>
         <w:rPr>
           <w:rFonts w:ascii="Arial" w:eastAsia="Arial" w:hAnsi="Arial"/>
@@ -6176,18 +5837,6 @@
         </w:rPr>
         <w:t>Em caso de atraso no pagamento de qualquer valor previsto nesta proposta, incidirá sobre o montante em aberto:</w:t>
       </w:r>
-    </w:p>
-    <w:p>
-      <w:pPr>
-        <w:spacing w:after="0" w:line="240" w:lineRule="auto"/>
-        <w:ind w:firstLine="708"/>
-        <w:jc w:val="both"/>
-        <w:rPr>
-          <w:rFonts w:ascii="Arial" w:eastAsia="Arial" w:hAnsi="Arial"/>
-          <w:sz w:val="20"/>
-          <w:szCs w:val="20"/>
-        </w:rPr>
-      </w:pPr>
     </w:p>
     <w:p>
       <w:pPr>
@@ -6196,7 +5845,7 @@
           <w:ilvl w:val="0"/>
           <w:numId w:val="1"/>
         </w:numPr>
-        <w:spacing w:after="0" w:line="240" w:lineRule="auto"/>
+        <w:spacing w:after="120" w:line="240" w:lineRule="auto" w:before="0"/>
         <w:jc w:val="both"/>
         <w:rPr>
           <w:rFonts w:ascii="Arial" w:eastAsia="Arial" w:hAnsi="Arial"/>
@@ -6212,19 +5861,6 @@
         </w:rPr>
         <w:t>Multa moratória de 2% (dois por cento) sobre o valor da parcela em atraso;</w:t>
       </w:r>
-    </w:p>
-    <w:p>
-      <w:pPr>
-        <w:pStyle w:val="PargrafodaLista"/>
-        <w:spacing w:after="0" w:line="240" w:lineRule="auto"/>
-        <w:ind w:left="1068"/>
-        <w:jc w:val="both"/>
-        <w:rPr>
-          <w:rFonts w:ascii="Arial" w:eastAsia="Arial" w:hAnsi="Arial"/>
-          <w:sz w:val="20"/>
-          <w:szCs w:val="20"/>
-        </w:rPr>
-      </w:pPr>
     </w:p>
     <w:p>
       <w:pPr>
@@ -6233,7 +5869,7 @@
           <w:ilvl w:val="0"/>
           <w:numId w:val="1"/>
         </w:numPr>
-        <w:spacing w:after="0" w:line="240" w:lineRule="auto"/>
+        <w:spacing w:after="120" w:line="240" w:lineRule="auto" w:before="0"/>
         <w:jc w:val="both"/>
         <w:rPr>
           <w:rFonts w:ascii="Arial" w:eastAsia="Arial" w:hAnsi="Arial"/>
@@ -6252,18 +5888,7 @@
     </w:p>
     <w:p>
       <w:pPr>
-        <w:spacing w:after="0" w:line="240" w:lineRule="auto"/>
-        <w:jc w:val="both"/>
-        <w:rPr>
-          <w:rFonts w:ascii="Arial" w:eastAsia="Arial" w:hAnsi="Arial"/>
-          <w:sz w:val="20"/>
-          <w:szCs w:val="20"/>
-        </w:rPr>
-      </w:pPr>
-    </w:p>
-    <w:p>
-      <w:pPr>
-        <w:spacing w:after="0" w:line="240" w:lineRule="auto"/>
+        <w:spacing w:after="120" w:line="240" w:lineRule="auto" w:before="0"/>
         <w:ind w:firstLine="708"/>
         <w:jc w:val="both"/>
         <w:rPr>
@@ -6280,30 +5905,6 @@
         </w:rPr>
         <w:t>O não pagamento nos prazos acordados poderá acarretar a suspensão imediata dos serviços até a regularização dos valores pendentes, sem prejuízo da adoção das medidas legais cabíveis e da cobrança dos custos adicionais decorrentes da paralisação.</w:t>
       </w:r>
-    </w:p>
-    <w:p>
-      <w:pPr>
-        <w:spacing w:after="0" w:line="240" w:lineRule="auto"/>
-        <w:ind w:firstLine="708"/>
-        <w:jc w:val="both"/>
-        <w:rPr>
-          <w:rFonts w:ascii="Arial" w:eastAsia="Arial" w:hAnsi="Arial"/>
-          <w:sz w:val="20"/>
-          <w:szCs w:val="20"/>
-        </w:rPr>
-      </w:pPr>
-    </w:p>
-    <w:p>
-      <w:pPr>
-        <w:spacing w:after="0" w:line="240" w:lineRule="auto"/>
-        <w:ind w:firstLine="708"/>
-        <w:jc w:val="both"/>
-        <w:rPr>
-          <w:rFonts w:ascii="Arial" w:eastAsia="Arial" w:hAnsi="Arial"/>
-          <w:sz w:val="20"/>
-          <w:szCs w:val="20"/>
-        </w:rPr>
-      </w:pPr>
     </w:p>
     <w:p>
       <w:pPr>
@@ -6312,7 +5913,7 @@
           <w:ilvl w:val="0"/>
           <w:numId w:val="2"/>
         </w:numPr>
-        <w:spacing w:after="0" w:line="240" w:lineRule="auto"/>
+        <w:spacing w:after="120" w:line="240" w:lineRule="auto" w:before="0"/>
         <w:jc w:val="both"/>
       </w:pPr>
       <w:r>
@@ -6325,14 +5926,6 @@
         </w:rPr>
         <w:t>- Observações:</w:t>
       </w:r>
-    </w:p>
-    <w:p>
-      <w:pPr>
-        <w:pStyle w:val="PargrafodaLista"/>
-        <w:spacing w:after="0" w:line="240" w:lineRule="auto"/>
-        <w:ind w:left="360"/>
-        <w:jc w:val="both"/>
-      </w:pPr>
     </w:p>
     <w:p>
       <w:pPr>
@@ -6341,7 +5934,7 @@
           <w:ilvl w:val="1"/>
           <w:numId w:val="2"/>
         </w:numPr>
-        <w:spacing w:after="0" w:line="240" w:lineRule="auto"/>
+        <w:spacing w:after="120" w:line="240" w:lineRule="auto" w:before="0"/>
         <w:jc w:val="both"/>
       </w:pPr>
       <w:r>
@@ -6384,14 +5977,6 @@
         </w:rPr>
         <w:t>}};</w:t>
       </w:r>
-    </w:p>
-    <w:p>
-      <w:pPr>
-        <w:pStyle w:val="PargrafodaLista"/>
-        <w:spacing w:after="0" w:line="240" w:lineRule="auto"/>
-        <w:ind w:left="1068"/>
-        <w:jc w:val="both"/>
-      </w:pPr>
     </w:p>
     <w:p>
       <w:pPr>
@@ -6400,7 +5985,7 @@
           <w:ilvl w:val="1"/>
           <w:numId w:val="2"/>
         </w:numPr>
-        <w:spacing w:after="0" w:line="240" w:lineRule="auto"/>
+        <w:spacing w:after="120" w:line="240" w:lineRule="auto" w:before="0"/>
         <w:jc w:val="both"/>
       </w:pPr>
       <w:r>
@@ -6429,12 +6014,6 @@
         </w:rPr>
         <w:t xml:space="preserve"> e Mobilização Adicional:</w:t>
       </w:r>
-    </w:p>
-    <w:p>
-      <w:pPr>
-        <w:spacing w:after="0" w:line="240" w:lineRule="auto"/>
-        <w:jc w:val="both"/>
-      </w:pPr>
     </w:p>
     <w:tbl>
       <w:tblPr>
@@ -6554,7 +6133,7 @@
                 <w:szCs w:val="20"/>
                 <w:lang w:val="en-US"/>
               </w:rPr>
-              <w:t>R$ {{</w:t>
+              <w:t>{{valor_standby}}</w:t>
             </w:r>
             <w:proofErr w:type="spellStart"/>
             <w:r>
@@ -6564,7 +6143,7 @@
                 <w:szCs w:val="20"/>
                 <w:lang w:val="en-US"/>
               </w:rPr>
-              <w:t>valor_standby</w:t>
+              <w:t/>
             </w:r>
             <w:proofErr w:type="spellEnd"/>
             <w:r>
@@ -6574,7 +6153,7 @@
                 <w:szCs w:val="20"/>
                 <w:lang w:val="en-US"/>
               </w:rPr>
-              <w:t xml:space="preserve">}} </w:t>
+              <w:t xml:space="preserve"> </w:t>
             </w:r>
           </w:p>
         </w:tc>
@@ -6624,7 +6203,7 @@
                 <w:sz w:val="20"/>
                 <w:szCs w:val="20"/>
               </w:rPr>
-              <w:t xml:space="preserve">R$ </w:t>
+              <w:t xml:space="preserve">{{diaria_equipamento}}</w:t>
             </w:r>
             <w:r>
               <w:rPr>
@@ -6633,7 +6212,7 @@
                 <w:szCs w:val="20"/>
                 <w:lang w:val="en-US"/>
               </w:rPr>
-              <w:t>{{</w:t>
+              <w:t/>
             </w:r>
             <w:proofErr w:type="spellStart"/>
             <w:r>
@@ -6643,7 +6222,7 @@
                 <w:szCs w:val="20"/>
                 <w:lang w:val="en-US"/>
               </w:rPr>
-              <w:t>diaria_equipamento</w:t>
+              <w:t/>
             </w:r>
             <w:proofErr w:type="spellEnd"/>
             <w:r>
@@ -6653,7 +6232,7 @@
                 <w:szCs w:val="20"/>
                 <w:lang w:val="en-US"/>
               </w:rPr>
-              <w:t>}}</w:t>
+              <w:t/>
             </w:r>
           </w:p>
         </w:tc>
@@ -6703,7 +6282,7 @@
                 <w:sz w:val="20"/>
                 <w:szCs w:val="20"/>
               </w:rPr>
-              <w:t>R</w:t>
+              <w:t>{{valor_desmob_extra}}</w:t>
             </w:r>
             <w:proofErr w:type="gramStart"/>
             <w:r>
@@ -6712,7 +6291,7 @@
                 <w:sz w:val="20"/>
                 <w:szCs w:val="20"/>
               </w:rPr>
-              <w:t xml:space="preserve">$  </w:t>
+              <w:t xml:space="preserve"/>
             </w:r>
             <w:r>
               <w:rPr>
@@ -6721,7 +6300,7 @@
                 <w:szCs w:val="20"/>
                 <w:lang w:val="en-US"/>
               </w:rPr>
-              <w:t>{</w:t>
+              <w:t/>
             </w:r>
             <w:proofErr w:type="gramEnd"/>
             <w:r>
@@ -6731,7 +6310,7 @@
                 <w:szCs w:val="20"/>
                 <w:lang w:val="en-US"/>
               </w:rPr>
-              <w:t>{</w:t>
+              <w:t/>
             </w:r>
             <w:proofErr w:type="spellStart"/>
             <w:r>
@@ -6741,7 +6320,7 @@
                 <w:szCs w:val="20"/>
                 <w:lang w:val="en-US"/>
               </w:rPr>
-              <w:t>valor_desmob_extra</w:t>
+              <w:t/>
             </w:r>
             <w:proofErr w:type="spellEnd"/>
             <w:r>
@@ -6751,13 +6330,12 @@
                 <w:szCs w:val="20"/>
                 <w:lang w:val="en-US"/>
               </w:rPr>
-              <w:t>}}</w:t>
+              <w:t/>
             </w:r>
           </w:p>
         </w:tc>
       </w:tr>
     </w:tbl>
-    <w:p/>
     <w:p>
       <w:pPr>
         <w:pStyle w:val="PargrafodaLista"/>
@@ -6765,7 +6343,7 @@
           <w:ilvl w:val="2"/>
           <w:numId w:val="2"/>
         </w:numPr>
-        <w:spacing w:after="0" w:line="240" w:lineRule="auto"/>
+        <w:spacing w:after="120" w:line="240" w:lineRule="auto" w:before="0"/>
         <w:jc w:val="both"/>
       </w:pPr>
       <w:r>
@@ -6783,29 +6361,13 @@
     <w:p>
       <w:pPr>
         <w:pStyle w:val="PargrafodaLista"/>
-        <w:spacing w:after="0" w:line="240" w:lineRule="auto"/>
+        <w:spacing w:after="120" w:line="240" w:lineRule="auto" w:before="0"/>
         <w:ind w:left="2136"/>
         <w:jc w:val="both"/>
       </w:pPr>
-    </w:p>
-    <w:p>
-      <w:pPr>
-        <w:pStyle w:val="PargrafodaLista"/>
-        <w:spacing w:after="0" w:line="240" w:lineRule="auto"/>
-        <w:ind w:left="2136"/>
-        <w:jc w:val="both"/>
-      </w:pPr>
       <w:r>
         <w:t>O serviço é um pacote fechado, sendo assim, qualquer interferência que gere impacto ou não no cronograma será aplicada a diária (stand-by) por ter interferência direta na performance do projeto.</w:t>
       </w:r>
-    </w:p>
-    <w:p>
-      <w:pPr>
-        <w:pStyle w:val="PargrafodaLista"/>
-        <w:spacing w:after="0" w:line="240" w:lineRule="auto"/>
-        <w:ind w:left="2136"/>
-        <w:jc w:val="both"/>
-      </w:pPr>
     </w:p>
     <w:p>
       <w:pPr>
@@ -6814,7 +6376,7 @@
           <w:ilvl w:val="2"/>
           <w:numId w:val="2"/>
         </w:numPr>
-        <w:spacing w:after="0" w:line="240" w:lineRule="auto"/>
+        <w:spacing w:after="120" w:line="240" w:lineRule="auto" w:before="0"/>
         <w:jc w:val="both"/>
       </w:pPr>
       <w:r>
@@ -6830,26 +6392,14 @@
     </w:p>
     <w:p>
       <w:pPr>
-        <w:spacing w:after="0" w:line="240" w:lineRule="auto"/>
-        <w:jc w:val="both"/>
-      </w:pPr>
-    </w:p>
-    <w:p>
-      <w:pPr>
         <w:pStyle w:val="PargrafodaLista"/>
-        <w:spacing w:after="0" w:line="240" w:lineRule="auto"/>
+        <w:spacing w:after="120" w:line="240" w:lineRule="auto" w:before="0"/>
         <w:ind w:left="2136"/>
         <w:jc w:val="both"/>
       </w:pPr>
       <w:r>
         <w:t>O serviço é um pacote fechado, sendo assim, qualquer interferência que gere impacto ou não no cronograma será aplicada a diária (stand-by) por ter interferência direta na performance do projeto.</w:t>
       </w:r>
-    </w:p>
-    <w:p>
-      <w:pPr>
-        <w:spacing w:after="0" w:line="240" w:lineRule="auto"/>
-        <w:jc w:val="both"/>
-      </w:pPr>
     </w:p>
     <w:p>
       <w:pPr>
@@ -6858,7 +6408,7 @@
           <w:ilvl w:val="2"/>
           <w:numId w:val="2"/>
         </w:numPr>
-        <w:spacing w:after="0" w:line="240" w:lineRule="auto"/>
+        <w:spacing w:after="120" w:line="240" w:lineRule="auto" w:before="0"/>
         <w:jc w:val="both"/>
       </w:pPr>
       <w:r>
@@ -6874,34 +6424,13 @@
     </w:p>
     <w:p>
       <w:pPr>
-        <w:spacing w:after="0" w:line="240" w:lineRule="auto"/>
-        <w:jc w:val="both"/>
-        <w:rPr>
-          <w:rFonts w:ascii="Arial" w:eastAsia="Arial" w:hAnsi="Arial"/>
-          <w:sz w:val="20"/>
-          <w:szCs w:val="20"/>
-        </w:rPr>
-      </w:pPr>
-    </w:p>
-    <w:p>
-      <w:pPr>
-        <w:spacing w:after="0" w:line="240" w:lineRule="auto"/>
-        <w:jc w:val="both"/>
-        <w:rPr>
-          <w:rFonts w:ascii="Arial" w:eastAsia="Arial" w:hAnsi="Arial"/>
-          <w:sz w:val="20"/>
-          <w:szCs w:val="20"/>
-        </w:rPr>
-      </w:pPr>
-    </w:p>
-    <w:p>
-      <w:pPr>
         <w:pStyle w:val="PargrafodaLista"/>
         <w:rPr>
           <w:rFonts w:ascii="Arial" w:eastAsia="Arial" w:hAnsi="Arial"/>
           <w:sz w:val="20"/>
           <w:szCs w:val="20"/>
         </w:rPr>
+        <w:spacing w:before="0" w:after="120"/>
       </w:pPr>
       <w:r>
         <w:rPr>
@@ -6911,16 +6440,6 @@
         </w:rPr>
         <w:t>NOTA: O solicitante terá que formalizar o pedido de desmobilização por e-mail expressando acordo com o item 9.3 /ou item 9.4.</w:t>
       </w:r>
-    </w:p>
-    <w:p>
-      <w:pPr>
-        <w:pStyle w:val="PargrafodaLista"/>
-        <w:rPr>
-          <w:rFonts w:ascii="Arial" w:eastAsia="Arial" w:hAnsi="Arial"/>
-          <w:sz w:val="20"/>
-          <w:szCs w:val="20"/>
-        </w:rPr>
-      </w:pPr>
     </w:p>
     <w:p>
       <w:pPr>
@@ -6929,7 +6448,7 @@
           <w:ilvl w:val="1"/>
           <w:numId w:val="2"/>
         </w:numPr>
-        <w:spacing w:after="0" w:line="240" w:lineRule="auto"/>
+        <w:spacing w:after="120" w:line="240" w:lineRule="auto" w:before="0"/>
         <w:jc w:val="both"/>
       </w:pPr>
       <w:r>
@@ -6958,14 +6477,6 @@
         </w:rPr>
         <w:t xml:space="preserve"> de equipe e equipamento;</w:t>
       </w:r>
-    </w:p>
-    <w:p>
-      <w:pPr>
-        <w:pStyle w:val="PargrafodaLista"/>
-        <w:spacing w:after="0" w:line="240" w:lineRule="auto"/>
-        <w:ind w:left="1068"/>
-        <w:jc w:val="both"/>
-      </w:pPr>
     </w:p>
     <w:p>
       <w:pPr>
@@ -6974,7 +6485,7 @@
           <w:ilvl w:val="1"/>
           <w:numId w:val="2"/>
         </w:numPr>
-        <w:spacing w:after="0" w:line="240" w:lineRule="auto"/>
+        <w:spacing w:after="120" w:line="240" w:lineRule="auto" w:before="0"/>
         <w:jc w:val="both"/>
       </w:pPr>
       <w:r>
@@ -6985,16 +6496,6 @@
         </w:rPr>
         <w:t>Índice de reajuste anual pelo IGPM ou 10%, será aplicado o maior índice anual;</w:t>
       </w:r>
-    </w:p>
-    <w:p>
-      <w:pPr>
-        <w:pStyle w:val="PargrafodaLista"/>
-        <w:rPr>
-          <w:rFonts w:ascii="Arial" w:eastAsia="Arial" w:hAnsi="Arial"/>
-          <w:sz w:val="20"/>
-          <w:szCs w:val="20"/>
-        </w:rPr>
-      </w:pPr>
     </w:p>
     <w:p>
       <w:pPr>
@@ -7003,7 +6504,7 @@
           <w:ilvl w:val="1"/>
           <w:numId w:val="2"/>
         </w:numPr>
-        <w:spacing w:after="0" w:line="240" w:lineRule="auto"/>
+        <w:spacing w:after="120" w:line="240" w:lineRule="auto" w:before="0"/>
         <w:jc w:val="both"/>
       </w:pPr>
       <w:r>
@@ -7014,16 +6515,6 @@
         </w:rPr>
         <w:t xml:space="preserve"> A proposta deverá fazer parte integrante do contrato;</w:t>
       </w:r>
-    </w:p>
-    <w:p>
-      <w:pPr>
-        <w:pStyle w:val="PargrafodaLista"/>
-        <w:rPr>
-          <w:rFonts w:ascii="Arial" w:eastAsia="Arial" w:hAnsi="Arial"/>
-          <w:sz w:val="20"/>
-          <w:szCs w:val="20"/>
-        </w:rPr>
-      </w:pPr>
     </w:p>
     <w:p>
       <w:pPr>
@@ -7032,7 +6523,7 @@
           <w:ilvl w:val="1"/>
           <w:numId w:val="2"/>
         </w:numPr>
-        <w:spacing w:after="0" w:line="240" w:lineRule="auto"/>
+        <w:spacing w:after="120" w:line="240" w:lineRule="auto" w:before="0"/>
         <w:jc w:val="both"/>
       </w:pPr>
       <w:r>
@@ -7061,16 +6552,6 @@
         </w:rPr>
         <w:t>, PCMSO, PGR, LTCAT e ASO, inclusive Seguro de responsabilidade Civil, específicos para o projeto em questão, por intermédio do Cliente final ou Contratante, os custos para emissão destes documentos específicos, serão repassados a Contratante;</w:t>
       </w:r>
-    </w:p>
-    <w:p>
-      <w:pPr>
-        <w:pStyle w:val="PargrafodaLista"/>
-        <w:rPr>
-          <w:rFonts w:ascii="Arial" w:eastAsia="Arial" w:hAnsi="Arial"/>
-          <w:sz w:val="20"/>
-          <w:szCs w:val="20"/>
-        </w:rPr>
-      </w:pPr>
     </w:p>
     <w:p>
       <w:pPr>
@@ -7079,7 +6560,7 @@
           <w:ilvl w:val="1"/>
           <w:numId w:val="2"/>
         </w:numPr>
-        <w:spacing w:after="0" w:line="240" w:lineRule="auto"/>
+        <w:spacing w:after="120" w:line="240" w:lineRule="auto" w:before="0"/>
         <w:jc w:val="both"/>
       </w:pPr>
       <w:r>
@@ -7090,16 +6571,6 @@
         </w:rPr>
         <w:t>A garantia mínima de faturamento é o quantitativo descrito como escopo original (item 7);</w:t>
       </w:r>
-    </w:p>
-    <w:p>
-      <w:pPr>
-        <w:pStyle w:val="PargrafodaLista"/>
-        <w:rPr>
-          <w:rFonts w:ascii="Arial" w:hAnsi="Arial" w:cs="Arial"/>
-          <w:sz w:val="20"/>
-          <w:szCs w:val="20"/>
-        </w:rPr>
-      </w:pPr>
     </w:p>
     <w:p>
       <w:pPr>
@@ -7108,7 +6579,7 @@
           <w:ilvl w:val="1"/>
           <w:numId w:val="2"/>
         </w:numPr>
-        <w:spacing w:after="0" w:line="240" w:lineRule="auto"/>
+        <w:spacing w:after="120" w:line="240" w:lineRule="auto" w:before="0"/>
         <w:jc w:val="both"/>
       </w:pPr>
       <w:r>
@@ -7119,16 +6590,6 @@
         </w:rPr>
         <w:t>Caso a Filtrovali conclua os serviços em prazo inferior ao previsto, tal circunstância não ensejará qualquer direito à Contratante de requerer descontos, abatimentos ou reduções no valor contratado, uma vez que a remuneração pactuada decorre do cumprimento integral das obrigações assumidas, independentemente do tempo efetivamente despendido para sua execução;</w:t>
       </w:r>
-    </w:p>
-    <w:p>
-      <w:pPr>
-        <w:pStyle w:val="PargrafodaLista"/>
-        <w:rPr>
-          <w:rFonts w:ascii="Arial" w:hAnsi="Arial" w:cs="Arial"/>
-          <w:sz w:val="20"/>
-          <w:szCs w:val="20"/>
-        </w:rPr>
-      </w:pPr>
     </w:p>
     <w:p>
       <w:pPr>
@@ -7137,7 +6598,7 @@
           <w:ilvl w:val="1"/>
           <w:numId w:val="2"/>
         </w:numPr>
-        <w:spacing w:after="0" w:line="240" w:lineRule="auto"/>
+        <w:spacing w:after="120" w:line="240" w:lineRule="auto" w:before="0"/>
         <w:jc w:val="both"/>
       </w:pPr>
       <w:r>
@@ -7157,18 +6618,6 @@
         <w:lastRenderedPageBreak/>
         <w:t>serviço incluído no pacote não dará direito à Contratante a reembolso, abatimento ou desconto proporcional sobre o valor total contratado, permanecendo a obrigação de pagamento integral nos termos acordados.</w:t>
       </w:r>
-    </w:p>
-    <w:p>
-      <w:pPr>
-        <w:spacing w:after="0" w:line="240" w:lineRule="auto"/>
-        <w:jc w:val="both"/>
-      </w:pPr>
-    </w:p>
-    <w:p>
-      <w:pPr>
-        <w:spacing w:after="0" w:line="240" w:lineRule="auto"/>
-        <w:jc w:val="both"/>
-      </w:pPr>
     </w:p>
     <w:p>
       <w:pPr>
@@ -7177,7 +6626,7 @@
           <w:ilvl w:val="0"/>
           <w:numId w:val="2"/>
         </w:numPr>
-        <w:spacing w:after="0" w:line="240" w:lineRule="auto"/>
+        <w:spacing w:after="120" w:line="240" w:lineRule="auto" w:before="0"/>
         <w:jc w:val="both"/>
         <w:rPr>
           <w:rFonts w:ascii="Arial" w:eastAsia="Arial" w:hAnsi="Arial"/>
@@ -7200,21 +6649,6 @@
       <w:r>
         <w:t xml:space="preserve"> </w:t>
       </w:r>
-    </w:p>
-    <w:p>
-      <w:pPr>
-        <w:pStyle w:val="PargrafodaLista"/>
-        <w:spacing w:after="0" w:line="240" w:lineRule="auto"/>
-        <w:ind w:left="360"/>
-        <w:jc w:val="both"/>
-        <w:rPr>
-          <w:rFonts w:ascii="Arial" w:eastAsia="Arial" w:hAnsi="Arial"/>
-          <w:b/>
-          <w:bCs/>
-          <w:sz w:val="20"/>
-          <w:szCs w:val="20"/>
-        </w:rPr>
-      </w:pPr>
     </w:p>
     <w:p>
       <w:pPr>
@@ -7223,7 +6657,7 @@
           <w:ilvl w:val="1"/>
           <w:numId w:val="2"/>
         </w:numPr>
-        <w:spacing w:after="0" w:line="240" w:lineRule="auto"/>
+        <w:spacing w:after="120" w:line="240" w:lineRule="auto" w:before="0"/>
         <w:jc w:val="both"/>
         <w:rPr>
           <w:rFonts w:ascii="Arial" w:eastAsia="Arial" w:hAnsi="Arial"/>
@@ -7241,21 +6675,6 @@
         </w:rPr>
         <w:t>A Filtrovali se enquadra no regime tributário do lucro presumido.</w:t>
       </w:r>
-    </w:p>
-    <w:p>
-      <w:pPr>
-        <w:pStyle w:val="PargrafodaLista"/>
-        <w:spacing w:after="0" w:line="240" w:lineRule="auto"/>
-        <w:ind w:left="1068"/>
-        <w:jc w:val="both"/>
-        <w:rPr>
-          <w:rFonts w:ascii="Arial" w:eastAsia="Arial" w:hAnsi="Arial"/>
-          <w:b/>
-          <w:bCs/>
-          <w:sz w:val="20"/>
-          <w:szCs w:val="20"/>
-        </w:rPr>
-      </w:pPr>
     </w:p>
     <w:p>
       <w:pPr>
@@ -7264,7 +6683,7 @@
           <w:ilvl w:val="2"/>
           <w:numId w:val="2"/>
         </w:numPr>
-        <w:spacing w:after="0" w:line="240" w:lineRule="auto"/>
+        <w:spacing w:after="120" w:line="240" w:lineRule="auto" w:before="0"/>
         <w:jc w:val="both"/>
         <w:rPr>
           <w:rFonts w:ascii="Arial" w:eastAsia="Arial" w:hAnsi="Arial"/>
@@ -7286,7 +6705,7 @@
     <w:p>
       <w:pPr>
         <w:pStyle w:val="PargrafodaLista"/>
-        <w:spacing w:after="0" w:line="240" w:lineRule="auto"/>
+        <w:spacing w:after="120" w:line="240" w:lineRule="auto" w:before="0"/>
         <w:ind w:left="360"/>
         <w:jc w:val="both"/>
         <w:rPr>
@@ -7295,65 +6714,39 @@
           <w:szCs w:val="20"/>
         </w:rPr>
       </w:pPr>
+      <w:r>
+        <w:rPr>
+          <w:rFonts w:ascii="Arial" w:eastAsia="Arial" w:hAnsi="Arial"/>
+          <w:sz w:val="20"/>
+          <w:szCs w:val="20"/>
+        </w:rPr>
+        <w:t xml:space="preserve">Em conformidade com a Constituição Federal (Art. 146) e a Lei Complementar nº 116/2003, o serviço realizado pela Filtrovali está enquadrado no código </w:t>
+      </w:r>
+      <w:r>
+        <w:rPr>
+          <w:rFonts w:ascii="Arial" w:eastAsia="Arial" w:hAnsi="Arial"/>
+          <w:b/>
+          <w:bCs/>
+          <w:sz w:val="20"/>
+          <w:szCs w:val="20"/>
+        </w:rPr>
+        <w:t>07.02.02</w:t>
+      </w:r>
+      <w:r>
+        <w:rPr>
+          <w:rFonts w:ascii="Arial" w:eastAsia="Arial" w:hAnsi="Arial"/>
+          <w:sz w:val="20"/>
+          <w:szCs w:val="20"/>
+        </w:rPr>
+        <w:t>. Para esse enquadramento, o ISS deve ser recolhido diretamente no local da execução do serviço. Dessa forma, o recolhimento no município da prestação passa a ser obrigatório, não cabendo retenção ou recolhimento em município diverso.</w:t>
+      </w:r>
     </w:p>
     <w:p>
       <w:pPr>
         <w:pStyle w:val="PargrafodaLista"/>
-        <w:spacing w:after="0" w:line="240" w:lineRule="auto"/>
+        <w:spacing w:after="120" w:line="240" w:lineRule="auto" w:before="0"/>
         <w:ind w:left="360"/>
         <w:jc w:val="both"/>
-        <w:rPr>
-          <w:rFonts w:ascii="Arial" w:eastAsia="Arial" w:hAnsi="Arial"/>
-          <w:sz w:val="20"/>
-          <w:szCs w:val="20"/>
-        </w:rPr>
-      </w:pPr>
-      <w:r>
-        <w:rPr>
-          <w:rFonts w:ascii="Arial" w:eastAsia="Arial" w:hAnsi="Arial"/>
-          <w:sz w:val="20"/>
-          <w:szCs w:val="20"/>
-        </w:rPr>
-        <w:t xml:space="preserve">Em conformidade com a Constituição Federal (Art. 146) e a Lei Complementar nº 116/2003, o serviço realizado pela Filtrovali está enquadrado no código </w:t>
-      </w:r>
-      <w:r>
-        <w:rPr>
-          <w:rFonts w:ascii="Arial" w:eastAsia="Arial" w:hAnsi="Arial"/>
-          <w:b/>
-          <w:bCs/>
-          <w:sz w:val="20"/>
-          <w:szCs w:val="20"/>
-        </w:rPr>
-        <w:t>07.02.02</w:t>
-      </w:r>
-      <w:r>
-        <w:rPr>
-          <w:rFonts w:ascii="Arial" w:eastAsia="Arial" w:hAnsi="Arial"/>
-          <w:sz w:val="20"/>
-          <w:szCs w:val="20"/>
-        </w:rPr>
-        <w:t>. Para esse enquadramento, o ISS deve ser recolhido diretamente no local da execução do serviço. Dessa forma, o recolhimento no município da prestação passa a ser obrigatório, não cabendo retenção ou recolhimento em município diverso.</w:t>
-      </w:r>
-    </w:p>
-    <w:p>
-      <w:pPr>
-        <w:pStyle w:val="PargrafodaLista"/>
-        <w:spacing w:after="0" w:line="240" w:lineRule="auto"/>
-        <w:ind w:left="360"/>
-        <w:jc w:val="both"/>
-        <w:rPr>
-          <w:rFonts w:ascii="Arial" w:eastAsia="Arial" w:hAnsi="Arial"/>
-          <w:sz w:val="20"/>
-          <w:szCs w:val="20"/>
-        </w:rPr>
-      </w:pPr>
-    </w:p>
-    <w:p>
-      <w:pPr>
-        <w:pStyle w:val="PargrafodaLista"/>
-        <w:spacing w:after="0" w:line="240" w:lineRule="auto"/>
-        <w:ind w:left="360"/>
-        <w:jc w:val="both"/>
       </w:pPr>
       <w:r>
         <w:rPr>
@@ -7363,21 +6756,6 @@
         </w:rPr>
         <w:t>Caso a Contratante julgue necessário adotar algum procedimento adicional referente ao pagamento do imposto no local da execução, assumirá a responsabilidade pelo referido procedimento</w:t>
       </w:r>
-    </w:p>
-    <w:p>
-      <w:pPr>
-        <w:pStyle w:val="PargrafodaLista"/>
-        <w:spacing w:after="0" w:line="240" w:lineRule="auto"/>
-        <w:ind w:left="1068"/>
-        <w:jc w:val="both"/>
-        <w:rPr>
-          <w:rFonts w:ascii="Arial" w:eastAsia="Arial" w:hAnsi="Arial"/>
-          <w:b/>
-          <w:bCs/>
-          <w:sz w:val="20"/>
-          <w:szCs w:val="20"/>
-        </w:rPr>
-      </w:pPr>
     </w:p>
     <w:p>
       <w:pPr>
@@ -7386,7 +6764,7 @@
           <w:ilvl w:val="1"/>
           <w:numId w:val="2"/>
         </w:numPr>
-        <w:spacing w:after="0" w:line="240" w:lineRule="auto"/>
+        <w:spacing w:after="120" w:line="240" w:lineRule="auto" w:before="0"/>
         <w:jc w:val="both"/>
         <w:rPr>
           <w:rFonts w:ascii="Arial" w:eastAsia="Arial" w:hAnsi="Arial"/>
@@ -7407,18 +6785,7 @@
     </w:p>
     <w:p>
       <w:pPr>
-        <w:spacing w:after="0" w:line="240" w:lineRule="auto"/>
-        <w:jc w:val="both"/>
-        <w:rPr>
-          <w:rFonts w:ascii="Arial" w:eastAsia="Arial" w:hAnsi="Arial"/>
-          <w:sz w:val="20"/>
-          <w:szCs w:val="20"/>
-        </w:rPr>
-      </w:pPr>
-    </w:p>
-    <w:p>
-      <w:pPr>
-        <w:spacing w:after="0" w:line="240" w:lineRule="auto"/>
+        <w:spacing w:after="120" w:line="240" w:lineRule="auto" w:before="0"/>
         <w:ind w:left="708" w:firstLine="708"/>
         <w:jc w:val="both"/>
         <w:rPr>
@@ -7438,7 +6805,7 @@
     </w:p>
     <w:p>
       <w:pPr>
-        <w:spacing w:after="0" w:line="240" w:lineRule="auto"/>
+        <w:spacing w:after="120" w:line="240" w:lineRule="auto" w:before="0"/>
         <w:ind w:left="708" w:firstLine="708"/>
         <w:jc w:val="both"/>
         <w:rPr>
@@ -7447,18 +6814,6 @@
           <w:szCs w:val="20"/>
         </w:rPr>
       </w:pPr>
-    </w:p>
-    <w:p>
-      <w:pPr>
-        <w:spacing w:after="0" w:line="240" w:lineRule="auto"/>
-        <w:ind w:left="708" w:firstLine="708"/>
-        <w:jc w:val="both"/>
-        <w:rPr>
-          <w:rFonts w:ascii="Arial" w:eastAsia="Arial" w:hAnsi="Arial"/>
-          <w:sz w:val="20"/>
-          <w:szCs w:val="20"/>
-        </w:rPr>
-      </w:pPr>
       <w:r>
         <w:rPr>
           <w:rFonts w:ascii="Arial" w:eastAsia="Arial" w:hAnsi="Arial"/>
@@ -7467,31 +6822,6 @@
         </w:rPr>
         <w:t>O eventual acréscimo de custos decorrente de tais alterações será repassado à CONTRATANTE, mediante comprovação do impacto financeiro e apresentação da respectiva atualização de valores.</w:t>
       </w:r>
-    </w:p>
-    <w:p>
-      <w:pPr>
-        <w:spacing w:after="0" w:line="240" w:lineRule="auto"/>
-        <w:jc w:val="both"/>
-        <w:rPr>
-          <w:rFonts w:ascii="Arial" w:eastAsia="Arial" w:hAnsi="Arial"/>
-          <w:sz w:val="20"/>
-          <w:szCs w:val="20"/>
-        </w:rPr>
-      </w:pPr>
-      <w:r>
-        <w:rPr>
-          <w:rFonts w:ascii="Arial" w:eastAsia="Arial" w:hAnsi="Arial"/>
-          <w:sz w:val="20"/>
-          <w:szCs w:val="20"/>
-        </w:rPr>
-        <w:t xml:space="preserve"> </w:t>
-      </w:r>
-    </w:p>
-    <w:p>
-      <w:pPr>
-        <w:spacing w:after="0" w:line="240" w:lineRule="auto"/>
-        <w:jc w:val="both"/>
-      </w:pPr>
     </w:p>
     <w:p>
       <w:pPr>
@@ -7500,7 +6830,7 @@
           <w:ilvl w:val="0"/>
           <w:numId w:val="2"/>
         </w:numPr>
-        <w:spacing w:after="0" w:line="240" w:lineRule="auto"/>
+        <w:spacing w:after="120" w:line="240" w:lineRule="auto" w:before="0"/>
         <w:jc w:val="both"/>
       </w:pPr>
       <w:r>
@@ -7513,14 +6843,6 @@
         </w:rPr>
         <w:t>- Validade da proposta:</w:t>
       </w:r>
-    </w:p>
-    <w:p>
-      <w:pPr>
-        <w:pStyle w:val="PargrafodaLista"/>
-        <w:spacing w:after="0" w:line="240" w:lineRule="auto"/>
-        <w:ind w:left="360"/>
-        <w:jc w:val="both"/>
-      </w:pPr>
     </w:p>
     <w:p>
       <w:pPr>
@@ -7529,7 +6851,7 @@
           <w:ilvl w:val="1"/>
           <w:numId w:val="2"/>
         </w:numPr>
-        <w:spacing w:after="0" w:line="240" w:lineRule="auto"/>
+        <w:spacing w:after="120" w:line="240" w:lineRule="auto" w:before="0"/>
         <w:jc w:val="both"/>
       </w:pPr>
       <w:r>
@@ -7561,25 +6883,6 @@
       <w:r>
         <w:t xml:space="preserve"> </w:t>
       </w:r>
-    </w:p>
-    <w:p>
-      <w:pPr>
-        <w:spacing w:after="0" w:line="240" w:lineRule="auto"/>
-        <w:ind w:firstLine="708"/>
-        <w:jc w:val="both"/>
-      </w:pPr>
-    </w:p>
-    <w:p>
-      <w:pPr>
-        <w:spacing w:after="0" w:line="240" w:lineRule="auto"/>
-        <w:jc w:val="both"/>
-        <w:rPr>
-          <w:rFonts w:ascii="Arial" w:hAnsi="Arial" w:cs="Arial"/>
-          <w:b/>
-          <w:sz w:val="20"/>
-          <w:szCs w:val="20"/>
-        </w:rPr>
-      </w:pPr>
     </w:p>
     <w:p>
       <w:pPr>
@@ -7588,7 +6891,7 @@
           <w:ilvl w:val="0"/>
           <w:numId w:val="2"/>
         </w:numPr>
-        <w:spacing w:after="0" w:line="240" w:lineRule="auto"/>
+        <w:spacing w:after="120" w:line="240" w:lineRule="auto" w:before="0"/>
         <w:jc w:val="both"/>
         <w:rPr>
           <w:rFonts w:ascii="Arial" w:eastAsia="Arial" w:hAnsi="Arial"/>
@@ -7608,21 +6911,6 @@
         </w:rPr>
         <w:t>- Proteção à propriedade intelectual e know-how:</w:t>
       </w:r>
-    </w:p>
-    <w:p>
-      <w:pPr>
-        <w:pStyle w:val="PargrafodaLista"/>
-        <w:spacing w:after="0" w:line="240" w:lineRule="auto"/>
-        <w:ind w:left="360"/>
-        <w:jc w:val="both"/>
-        <w:rPr>
-          <w:rFonts w:ascii="Arial" w:eastAsia="Arial" w:hAnsi="Arial"/>
-          <w:b/>
-          <w:bCs/>
-          <w:sz w:val="20"/>
-          <w:szCs w:val="20"/>
-        </w:rPr>
-      </w:pPr>
     </w:p>
     <w:p>
       <w:pPr>
@@ -7631,7 +6919,7 @@
           <w:ilvl w:val="1"/>
           <w:numId w:val="2"/>
         </w:numPr>
-        <w:spacing w:after="0" w:line="240" w:lineRule="auto"/>
+        <w:spacing w:after="120" w:line="240" w:lineRule="auto" w:before="0"/>
         <w:jc w:val="both"/>
         <w:rPr>
           <w:rFonts w:ascii="Arial" w:eastAsia="Arial" w:hAnsi="Arial"/>
@@ -7649,21 +6937,6 @@
         </w:rPr>
         <w:t>Todos os métodos, processos, procedimentos operacionais, técnicas, especificações, relatórios, documentos, estudos, desenhos, fluxogramas, parâmetros operacionais e quaisquer outras informações técnicas ou comerciais utilizadas ou desenvolvidas pela FILTROVALI para a execução dos serviços constituem propriedade intelectual exclusiva da Filtrovali, sendo protegidos pela legislação vigente aplicável.</w:t>
       </w:r>
-    </w:p>
-    <w:p>
-      <w:pPr>
-        <w:pStyle w:val="PargrafodaLista"/>
-        <w:spacing w:after="0" w:line="240" w:lineRule="auto"/>
-        <w:ind w:left="1068"/>
-        <w:jc w:val="both"/>
-        <w:rPr>
-          <w:rFonts w:ascii="Arial" w:eastAsia="Arial" w:hAnsi="Arial"/>
-          <w:b/>
-          <w:bCs/>
-          <w:sz w:val="20"/>
-          <w:szCs w:val="20"/>
-        </w:rPr>
-      </w:pPr>
     </w:p>
     <w:p>
       <w:pPr>
@@ -7672,7 +6945,7 @@
           <w:ilvl w:val="1"/>
           <w:numId w:val="2"/>
         </w:numPr>
-        <w:spacing w:after="0" w:line="240" w:lineRule="auto"/>
+        <w:spacing w:after="120" w:line="240" w:lineRule="auto" w:before="0"/>
         <w:jc w:val="both"/>
         <w:rPr>
           <w:rFonts w:ascii="Arial" w:eastAsia="Arial" w:hAnsi="Arial"/>
@@ -7690,16 +6963,6 @@
         </w:rPr>
         <w:t>A contratação dos serviços não implica, em hipótese alguma, cessão, transferência ou compartilhamento definitivo de tais direitos, limitando-se o seu uso exclusivamente ao escopo do contrato firmado.</w:t>
       </w:r>
-    </w:p>
-    <w:p>
-      <w:pPr>
-        <w:pStyle w:val="PargrafodaLista"/>
-        <w:rPr>
-          <w:rFonts w:ascii="Arial" w:eastAsia="Arial" w:hAnsi="Arial"/>
-          <w:sz w:val="20"/>
-          <w:szCs w:val="20"/>
-        </w:rPr>
-      </w:pPr>
     </w:p>
     <w:p>
       <w:pPr>
@@ -7708,7 +6971,7 @@
           <w:ilvl w:val="1"/>
           <w:numId w:val="2"/>
         </w:numPr>
-        <w:spacing w:after="0" w:line="240" w:lineRule="auto"/>
+        <w:spacing w:after="120" w:line="240" w:lineRule="auto" w:before="0"/>
         <w:jc w:val="both"/>
         <w:rPr>
           <w:rFonts w:ascii="Arial" w:eastAsia="Arial" w:hAnsi="Arial"/>
@@ -7726,16 +6989,6 @@
         </w:rPr>
         <w:t>Fica expressamente vedado à CONTRATANTE, seus colaboradores ou terceiros por ela designados:</w:t>
       </w:r>
-    </w:p>
-    <w:p>
-      <w:pPr>
-        <w:pStyle w:val="PargrafodaLista"/>
-        <w:rPr>
-          <w:rFonts w:ascii="Arial" w:eastAsia="Arial" w:hAnsi="Arial"/>
-          <w:sz w:val="20"/>
-          <w:szCs w:val="20"/>
-        </w:rPr>
-      </w:pPr>
     </w:p>
     <w:p>
       <w:pPr>
@@ -7744,7 +6997,7 @@
           <w:ilvl w:val="2"/>
           <w:numId w:val="2"/>
         </w:numPr>
-        <w:spacing w:after="0" w:line="240" w:lineRule="auto"/>
+        <w:spacing w:after="120" w:line="240" w:lineRule="auto" w:before="0"/>
         <w:jc w:val="both"/>
         <w:rPr>
           <w:rFonts w:ascii="Arial" w:eastAsia="Arial" w:hAnsi="Arial"/>
@@ -7762,21 +7015,6 @@
         </w:rPr>
         <w:t>Reproduzir, copiar, divulgar ou compartilhar, total ou parcialmente, os métodos e processos utilizados pela Filtrovali;</w:t>
       </w:r>
-    </w:p>
-    <w:p>
-      <w:pPr>
-        <w:pStyle w:val="PargrafodaLista"/>
-        <w:spacing w:after="0" w:line="240" w:lineRule="auto"/>
-        <w:ind w:left="2136"/>
-        <w:jc w:val="both"/>
-        <w:rPr>
-          <w:rFonts w:ascii="Arial" w:eastAsia="Arial" w:hAnsi="Arial"/>
-          <w:b/>
-          <w:bCs/>
-          <w:sz w:val="20"/>
-          <w:szCs w:val="20"/>
-        </w:rPr>
-      </w:pPr>
     </w:p>
     <w:p>
       <w:pPr>
@@ -7785,7 +7023,7 @@
           <w:ilvl w:val="2"/>
           <w:numId w:val="2"/>
         </w:numPr>
-        <w:spacing w:after="0" w:line="240" w:lineRule="auto"/>
+        <w:spacing w:after="120" w:line="240" w:lineRule="auto" w:before="0"/>
         <w:jc w:val="both"/>
         <w:rPr>
           <w:rFonts w:ascii="Arial" w:eastAsia="Arial" w:hAnsi="Arial"/>
@@ -7803,19 +7041,6 @@
         </w:rPr>
         <w:t>Utilizar tais informações para execução própria ou por terceiros de serviços similares ou concorrentes;</w:t>
       </w:r>
-    </w:p>
-    <w:p>
-      <w:pPr>
-        <w:spacing w:after="0" w:line="240" w:lineRule="auto"/>
-        <w:jc w:val="both"/>
-        <w:rPr>
-          <w:rFonts w:ascii="Arial" w:eastAsia="Arial" w:hAnsi="Arial"/>
-          <w:b/>
-          <w:bCs/>
-          <w:sz w:val="20"/>
-          <w:szCs w:val="20"/>
-        </w:rPr>
-      </w:pPr>
     </w:p>
     <w:p>
       <w:pPr>
@@ -7824,7 +7049,7 @@
           <w:ilvl w:val="2"/>
           <w:numId w:val="2"/>
         </w:numPr>
-        <w:spacing w:after="0" w:line="240" w:lineRule="auto"/>
+        <w:spacing w:after="120" w:line="240" w:lineRule="auto" w:before="0"/>
         <w:jc w:val="both"/>
         <w:rPr>
           <w:rFonts w:ascii="Arial" w:eastAsia="Arial" w:hAnsi="Arial"/>
@@ -7845,7 +7070,7 @@
     </w:p>
     <w:p>
       <w:pPr>
-        <w:spacing w:after="0" w:line="240" w:lineRule="auto"/>
+        <w:spacing w:after="120" w:line="240" w:lineRule="auto" w:before="0"/>
         <w:jc w:val="both"/>
         <w:rPr>
           <w:rFonts w:ascii="Arial" w:eastAsia="Arial" w:hAnsi="Arial"/>
@@ -7855,19 +7080,6 @@
           <w:szCs w:val="20"/>
         </w:rPr>
       </w:pPr>
-    </w:p>
-    <w:p>
-      <w:pPr>
-        <w:spacing w:after="0" w:line="240" w:lineRule="auto"/>
-        <w:jc w:val="both"/>
-        <w:rPr>
-          <w:rFonts w:ascii="Arial" w:eastAsia="Arial" w:hAnsi="Arial"/>
-          <w:b/>
-          <w:bCs/>
-          <w:sz w:val="20"/>
-          <w:szCs w:val="20"/>
-        </w:rPr>
-      </w:pPr>
       <w:r>
         <w:rPr>
           <w:rFonts w:ascii="Arial" w:eastAsia="Arial" w:hAnsi="Arial"/>
@@ -7876,28 +7088,6 @@
         </w:rPr>
         <w:t>Qualquer utilização indevida ou violação desta cláusula sujeitará a CONTRATANTE às medidas legais cabíveis, incluindo, mas não se limitando, à responsabilização por perdas e danos, lucros cessantes e demais sanções previstas na legislação.</w:t>
       </w:r>
-    </w:p>
-    <w:p>
-      <w:pPr>
-        <w:spacing w:after="0" w:line="240" w:lineRule="auto"/>
-        <w:jc w:val="both"/>
-        <w:rPr>
-          <w:rFonts w:ascii="Arial" w:eastAsia="Arial" w:hAnsi="Arial"/>
-          <w:sz w:val="20"/>
-          <w:szCs w:val="20"/>
-        </w:rPr>
-      </w:pPr>
-    </w:p>
-    <w:p>
-      <w:pPr>
-        <w:spacing w:after="0" w:line="240" w:lineRule="auto"/>
-        <w:jc w:val="both"/>
-        <w:rPr>
-          <w:rFonts w:ascii="Arial" w:eastAsia="Arial" w:hAnsi="Arial"/>
-          <w:sz w:val="20"/>
-          <w:szCs w:val="20"/>
-        </w:rPr>
-      </w:pPr>
     </w:p>
     <w:p>
       <w:pPr>
@@ -7906,7 +7096,7 @@
           <w:ilvl w:val="0"/>
           <w:numId w:val="2"/>
         </w:numPr>
-        <w:spacing w:after="0" w:line="240" w:lineRule="auto"/>
+        <w:spacing w:after="120" w:line="240" w:lineRule="auto" w:before="0"/>
         <w:jc w:val="both"/>
         <w:rPr>
           <w:b/>
@@ -7926,19 +7116,7 @@
     </w:p>
     <w:p>
       <w:pPr>
-        <w:spacing w:after="0" w:line="240" w:lineRule="auto"/>
-        <w:jc w:val="both"/>
-        <w:rPr>
-          <w:rFonts w:ascii="Arial" w:hAnsi="Arial" w:cs="Arial"/>
-          <w:bCs/>
-          <w:sz w:val="20"/>
-          <w:szCs w:val="20"/>
-        </w:rPr>
-      </w:pPr>
-    </w:p>
-    <w:p>
-      <w:pPr>
-        <w:spacing w:after="0" w:line="240" w:lineRule="auto"/>
+        <w:spacing w:after="120" w:line="240" w:lineRule="auto" w:before="0"/>
         <w:ind w:firstLine="708"/>
         <w:jc w:val="both"/>
         <w:rPr>
@@ -7971,7 +7149,7 @@
     </w:p>
     <w:p>
       <w:pPr>
-        <w:spacing w:after="0" w:line="240" w:lineRule="auto"/>
+        <w:spacing w:after="120" w:line="240" w:lineRule="auto" w:before="0"/>
         <w:jc w:val="both"/>
         <w:rPr>
           <w:rFonts w:ascii="Arial" w:hAnsi="Arial" w:cs="Arial"/>
@@ -7992,7 +7170,7 @@
     </w:p>
     <w:p>
       <w:pPr>
-        <w:spacing w:after="0" w:line="240" w:lineRule="auto"/>
+        <w:spacing w:after="120" w:line="240" w:lineRule="auto" w:before="0"/>
         <w:jc w:val="both"/>
         <w:rPr>
           <w:rFonts w:ascii="Arial" w:hAnsi="Arial" w:cs="Arial"/>
@@ -8001,30 +7179,6 @@
           <w:szCs w:val="20"/>
         </w:rPr>
       </w:pPr>
-    </w:p>
-    <w:p>
-      <w:pPr>
-        <w:spacing w:after="0" w:line="240" w:lineRule="auto"/>
-        <w:jc w:val="both"/>
-        <w:rPr>
-          <w:rFonts w:ascii="Arial" w:hAnsi="Arial" w:cs="Arial"/>
-          <w:b/>
-          <w:sz w:val="20"/>
-          <w:szCs w:val="20"/>
-        </w:rPr>
-      </w:pPr>
-    </w:p>
-    <w:p>
-      <w:pPr>
-        <w:spacing w:after="0" w:line="240" w:lineRule="auto"/>
-        <w:jc w:val="both"/>
-        <w:rPr>
-          <w:rFonts w:ascii="Arial" w:hAnsi="Arial" w:cs="Arial"/>
-          <w:b/>
-          <w:sz w:val="20"/>
-          <w:szCs w:val="20"/>
-        </w:rPr>
-      </w:pPr>
       <w:r>
         <w:rPr>
           <w:rFonts w:ascii="Arial" w:hAnsi="Arial" w:cs="Arial"/>
@@ -8037,30 +7191,7 @@
     </w:p>
     <w:p>
       <w:pPr>
-        <w:spacing w:after="0" w:line="240" w:lineRule="auto"/>
-        <w:jc w:val="both"/>
-        <w:rPr>
-          <w:rFonts w:ascii="Arial" w:hAnsi="Arial" w:cs="Arial"/>
-          <w:b/>
-          <w:sz w:val="20"/>
-          <w:szCs w:val="20"/>
-        </w:rPr>
-      </w:pPr>
-    </w:p>
-    <w:p>
-      <w:pPr>
-        <w:spacing w:after="0" w:line="240" w:lineRule="auto"/>
-        <w:rPr>
-          <w:rFonts w:ascii="Arial" w:hAnsi="Arial" w:cs="Arial"/>
-          <w:b/>
-          <w:sz w:val="20"/>
-          <w:szCs w:val="20"/>
-        </w:rPr>
-      </w:pPr>
-    </w:p>
-    <w:p>
-      <w:pPr>
-        <w:spacing w:after="0" w:line="240" w:lineRule="auto"/>
+        <w:spacing w:after="120" w:line="240" w:lineRule="auto" w:before="0"/>
         <w:jc w:val="center"/>
         <w:rPr>
           <w:rFonts w:ascii="Arial" w:hAnsi="Arial" w:cs="Arial"/>
@@ -8069,10 +7200,19 @@
           <w:szCs w:val="20"/>
         </w:rPr>
       </w:pPr>
-    </w:p>
-    <w:p>
-      <w:pPr>
-        <w:spacing w:after="0" w:line="240" w:lineRule="auto"/>
+      <w:r>
+        <w:rPr>
+          <w:rFonts w:ascii="Arial" w:hAnsi="Arial" w:cs="Arial"/>
+          <w:b/>
+          <w:sz w:val="20"/>
+          <w:szCs w:val="20"/>
+        </w:rPr>
+        <w:t>______________________________________</w:t>
+      </w:r>
+    </w:p>
+    <w:p>
+      <w:pPr>
+        <w:spacing w:after="120" w:line="240" w:lineRule="auto" w:before="0"/>
         <w:jc w:val="center"/>
         <w:rPr>
           <w:rFonts w:ascii="Arial" w:hAnsi="Arial" w:cs="Arial"/>
@@ -8088,53 +7228,8 @@
           <w:sz w:val="20"/>
           <w:szCs w:val="20"/>
         </w:rPr>
-        <w:t>______________________________________</w:t>
-      </w:r>
-    </w:p>
-    <w:p>
-      <w:pPr>
-        <w:spacing w:after="0" w:line="240" w:lineRule="auto"/>
-        <w:jc w:val="center"/>
-        <w:rPr>
-          <w:rFonts w:ascii="Arial" w:hAnsi="Arial" w:cs="Arial"/>
-          <w:b/>
-          <w:sz w:val="20"/>
-          <w:szCs w:val="20"/>
-        </w:rPr>
-      </w:pPr>
-    </w:p>
-    <w:p>
-      <w:pPr>
-        <w:spacing w:after="0" w:line="240" w:lineRule="auto"/>
-        <w:jc w:val="center"/>
-        <w:rPr>
-          <w:rFonts w:ascii="Arial" w:hAnsi="Arial" w:cs="Arial"/>
-          <w:b/>
-          <w:sz w:val="20"/>
-          <w:szCs w:val="20"/>
-        </w:rPr>
-      </w:pPr>
-      <w:r>
-        <w:rPr>
-          <w:rFonts w:ascii="Arial" w:hAnsi="Arial" w:cs="Arial"/>
-          <w:b/>
-          <w:sz w:val="20"/>
-          <w:szCs w:val="20"/>
-        </w:rPr>
         <w:t>Contratante</w:t>
       </w:r>
-    </w:p>
-    <w:p>
-      <w:pPr>
-        <w:pStyle w:val="PargrafodaLista"/>
-        <w:spacing w:after="0" w:line="240" w:lineRule="auto"/>
-        <w:rPr>
-          <w:rFonts w:ascii="Arial" w:hAnsi="Arial" w:cs="Arial"/>
-          <w:b/>
-          <w:sz w:val="20"/>
-          <w:szCs w:val="20"/>
-        </w:rPr>
-      </w:pPr>
     </w:p>
     <w:sectPr>
       <w:type w:val="continuous"/>

</xml_diff>

<commit_message>
fix: preparar deploy rootless do comercial na porta 8083
</commit_message>
<xml_diff>
--- a/backend/models/comercial/Proposta Comercial.docx
+++ b/backend/models/comercial/Proposta Comercial.docx
@@ -663,76 +663,60 @@
           <w:sz w:val="28"/>
           <w:szCs w:val="28"/>
         </w:rPr>
-        <w:sectPr>
-          <w:headerReference w:type="default" r:id="rId13"/>
-          <w:footerReference w:type="default" r:id="rId14"/>
-          <w:headerReference w:type="first" r:id="rId15"/>
-          <w:footerReference w:type="first" r:id="rId16"/>
-          <w:pgSz w:w="11906" w:h="16838"/>
-          <w:pgMar w:top="2977" w:right="566" w:bottom="1417" w:left="567" w:header="737" w:footer="132" w:gutter="0"/>
-          <w:cols w:space="720"/>
-          <w:formProt w:val="0"/>
-          <w:docGrid w:linePitch="299"/>
-        </w:sectPr>
-      </w:pPr>
-    </w:p>
-    <w:p>
-      <w:pPr>
-        <w:spacing w:after="0" w:line="240" w:lineRule="auto"/>
-        <w:jc w:val="center"/>
+      </w:pPr>
+      <w:r>
         <w:rPr>
           <w:rFonts w:ascii="Arial" w:hAnsi="Arial" w:cs="Arial"/>
           <w:b/>
           <w:sz w:val="28"/>
           <w:szCs w:val="28"/>
         </w:rPr>
-      </w:pPr>
-      <w:r>
-        <w:rPr>
-          <w:rFonts w:ascii="Arial" w:hAnsi="Arial" w:cs="Arial"/>
-          <w:b/>
-          <w:sz w:val="28"/>
-          <w:szCs w:val="28"/>
-        </w:rPr>
         <w:lastRenderedPageBreak/>
         <w:t>Proposta Comercial</w:t>
       </w:r>
-      <w:bookmarkStart w:id="0" w:name="_Hlk219204069"/>
-    </w:p>
-    <w:p>
-      <w:pPr>
-        <w:spacing w:after="0" w:line="276" w:lineRule="auto"/>
-        <w:jc w:val="center"/>
-        <w:rPr>
-          <w:rFonts w:ascii="Arial" w:hAnsi="Arial" w:cs="Arial"/>
-          <w:b/>
+    </w:p>
+    <w:p>
+      <w:pPr>
+        <w:spacing w:after="0" w:line="240" w:lineRule="auto"/>
+        <w:rPr>
+          <w:rFonts w:ascii="Arial" w:hAnsi="Arial" w:cs="Arial"/>
           <w:bCs/>
           <w:sz w:val="24"/>
           <w:szCs w:val="24"/>
         </w:rPr>
       </w:pPr>
-      <w:r>
-        <w:rPr>
-          <w:rFonts w:ascii="Arial" w:hAnsi="Arial" w:cs="Arial"/>
-          <w:b/>
+      <w:bookmarkStart w:id="0" w:name="_Hlk219204069"/>
+    </w:p>
+    <w:p>
+      <w:pPr>
+        <w:spacing w:after="0" w:line="240" w:lineRule="auto"/>
+        <w:rPr>
+          <w:rFonts w:ascii="Arial" w:hAnsi="Arial" w:cs="Arial"/>
+          <w:b/>
+          <w:sz w:val="20"/>
+          <w:szCs w:val="20"/>
+        </w:rPr>
+      </w:pPr>
+    </w:p>
+    <w:p>
+      <w:pPr>
+        <w:spacing w:after="0" w:line="240" w:lineRule="auto"/>
+        <w:rPr>
+          <w:rFonts w:ascii="Arial" w:hAnsi="Arial" w:cs="Arial"/>
           <w:bCs/>
           <w:sz w:val="24"/>
           <w:szCs w:val="24"/>
         </w:rPr>
-        <w:t xml:space="preserve"> N°: {{</w:t>
-      </w:r>
-      <w:proofErr w:type="spellStart"/>
-      <w:r>
-        <w:rPr>
-          <w:rFonts w:ascii="Arial" w:hAnsi="Arial" w:cs="Arial"/>
-          <w:b/>
-          <w:bCs/>
+      </w:pPr>
+      <w:r>
+        <w:rPr>
+          <w:rFonts w:ascii="Arial" w:hAnsi="Arial" w:cs="Arial"/>
+          <w:b/>
           <w:sz w:val="24"/>
           <w:szCs w:val="24"/>
         </w:rPr>
-        <w:t>cod_prop</w:t>
-      </w:r>
-      <w:proofErr w:type="spellEnd"/>
+        <w:t>Consultor de Vendas:</w:t>
+      </w:r>
       <w:r>
         <w:rPr>
           <w:rFonts w:ascii="Arial" w:hAnsi="Arial" w:cs="Arial"/>
@@ -741,684 +725,432 @@
           <w:sz w:val="24"/>
           <w:szCs w:val="24"/>
         </w:rPr>
-        <w:t xml:space="preserve">}} REV - </w:t>
-      </w:r>
-      <w:r>
-        <w:rPr>
-          <w:rFonts w:ascii="Arial" w:eastAsia="Arial" w:hAnsi="Arial"/>
-          <w:sz w:val="20"/>
-          <w:szCs w:val="20"/>
-        </w:rPr>
-        <w:t>{{</w:t>
+        <w:t xml:space="preserve"> {{</w:t>
       </w:r>
       <w:proofErr w:type="spellStart"/>
       <w:r>
         <w:rPr>
-          <w:rFonts w:ascii="Arial" w:eastAsia="Arial" w:hAnsi="Arial"/>
-          <w:sz w:val="20"/>
-          <w:szCs w:val="20"/>
-        </w:rPr>
-        <w:t>n_rev</w:t>
-      </w:r>
-      <w:proofErr w:type="spellEnd"/>
-      <w:r>
-        <w:rPr>
-          <w:rFonts w:ascii="Arial" w:eastAsia="Arial" w:hAnsi="Arial"/>
-          <w:sz w:val="20"/>
-          <w:szCs w:val="20"/>
-        </w:rPr>
-        <w:t>}}</w:t>
-      </w:r>
-    </w:p>
-    <w:p>
-      <w:pPr>
-        <w:spacing w:after="0" w:line="240" w:lineRule="auto"/>
-        <w:jc w:val="center"/>
-        <w:rPr>
-          <w:rFonts w:ascii="Arial" w:hAnsi="Arial" w:cs="Arial"/>
-          <w:b/>
-          <w:sz w:val="28"/>
-          <w:szCs w:val="28"/>
-        </w:rPr>
-        <w:sectPr>
-          <w:type w:val="continuous"/>
-          <w:pgSz w:w="11906" w:h="16838"/>
-          <w:pgMar w:top="2977" w:right="566" w:bottom="1417" w:left="567" w:header="737" w:footer="132" w:gutter="0"/>
-          <w:cols w:num="2" w:space="720"/>
-          <w:formProt w:val="0"/>
-          <w:docGrid w:linePitch="299"/>
-        </w:sectPr>
-      </w:pPr>
-    </w:p>
-    <w:p>
-      <w:pPr>
-        <w:spacing w:after="0" w:line="240" w:lineRule="auto"/>
-        <w:jc w:val="center"/>
-        <w:rPr>
-          <w:rFonts w:ascii="Arial" w:hAnsi="Arial" w:cs="Arial"/>
-          <w:b/>
-          <w:sz w:val="28"/>
-          <w:szCs w:val="28"/>
-        </w:rPr>
-      </w:pPr>
-    </w:p>
-    <w:tbl>
-      <w:tblPr>
-        <w:tblStyle w:val="Tabelacomgrade"/>
-        <w:tblW w:w="10700" w:type="dxa"/>
-        <w:tblBorders>
-          <w:left w:val="none" w:sz="0" w:space="0" w:color="auto"/>
-          <w:bottom w:val="none" w:sz="0" w:space="0" w:color="auto"/>
-          <w:right w:val="none" w:sz="0" w:space="0" w:color="auto"/>
-        </w:tblBorders>
-        <w:tblLook w:val="04A0" w:firstRow="1" w:lastRow="0" w:firstColumn="1" w:lastColumn="0" w:noHBand="0" w:noVBand="1"/>
-      </w:tblPr>
-      <w:tblGrid>
-        <w:gridCol w:w="5393"/>
-        <w:gridCol w:w="5307"/>
-      </w:tblGrid>
-      <w:tr>
-        <w:trPr>
-          <w:trHeight w:val="623"/>
-        </w:trPr>
-        <w:tc>
-          <w:tcPr>
-            <w:tcW w:w="5393" w:type="dxa"/>
-            <w:tcBorders>
-              <w:top w:val="single" w:sz="4" w:space="0" w:color="A6A6A6" w:themeColor="background1" w:themeShade="A6"/>
-              <w:bottom w:val="nil"/>
-              <w:right w:val="nil"/>
-            </w:tcBorders>
-          </w:tcPr>
-          <w:p>
-            <w:pPr>
-              <w:spacing w:after="0" w:line="276" w:lineRule="auto"/>
-              <w:rPr>
-                <w:rFonts w:ascii="Arial" w:hAnsi="Arial" w:cs="Arial"/>
-                <w:b/>
-                <w:sz w:val="4"/>
-                <w:szCs w:val="4"/>
-              </w:rPr>
-            </w:pPr>
-          </w:p>
-          <w:p>
-            <w:pPr>
-              <w:spacing w:after="0" w:line="276" w:lineRule="auto"/>
-              <w:rPr>
-                <w:rFonts w:ascii="Arial" w:hAnsi="Arial" w:cs="Arial"/>
-                <w:b/>
-                <w:sz w:val="24"/>
-                <w:szCs w:val="24"/>
-              </w:rPr>
-            </w:pPr>
-            <w:r>
-              <w:rPr>
-                <w:rFonts w:ascii="Arial" w:hAnsi="Arial" w:cs="Arial"/>
-                <w:b/>
-                <w:sz w:val="24"/>
-                <w:szCs w:val="24"/>
-              </w:rPr>
-              <w:t>DADOS INTERNOS</w:t>
-            </w:r>
-          </w:p>
-          <w:p>
-            <w:pPr>
-              <w:spacing w:after="0" w:line="276" w:lineRule="auto"/>
-              <w:rPr>
-                <w:rFonts w:ascii="Arial" w:hAnsi="Arial" w:cs="Arial"/>
-                <w:b/>
-                <w:sz w:val="10"/>
-                <w:szCs w:val="10"/>
-              </w:rPr>
-            </w:pPr>
-          </w:p>
-        </w:tc>
-        <w:tc>
-          <w:tcPr>
-            <w:tcW w:w="5307" w:type="dxa"/>
-            <w:tcBorders>
-              <w:top w:val="single" w:sz="4" w:space="0" w:color="A6A6A6" w:themeColor="background1" w:themeShade="A6"/>
-              <w:left w:val="nil"/>
-              <w:bottom w:val="nil"/>
-            </w:tcBorders>
-          </w:tcPr>
-          <w:p>
-            <w:pPr>
-              <w:spacing w:after="0" w:line="276" w:lineRule="auto"/>
-              <w:ind w:left="3102" w:hanging="3102"/>
-              <w:rPr>
-                <w:rFonts w:ascii="Arial" w:hAnsi="Arial" w:cs="Arial"/>
-                <w:b/>
-                <w:bCs/>
-                <w:sz w:val="4"/>
-                <w:szCs w:val="4"/>
-              </w:rPr>
-            </w:pPr>
-          </w:p>
-          <w:p>
-            <w:pPr>
-              <w:spacing w:after="0" w:line="276" w:lineRule="auto"/>
-              <w:ind w:left="3102" w:hanging="3102"/>
-              <w:rPr>
-                <w:rFonts w:ascii="Arial" w:hAnsi="Arial" w:cs="Arial"/>
-                <w:b/>
-                <w:bCs/>
-                <w:sz w:val="24"/>
-                <w:szCs w:val="24"/>
-              </w:rPr>
-            </w:pPr>
-            <w:r>
-              <w:rPr>
-                <w:rFonts w:ascii="Arial" w:hAnsi="Arial" w:cs="Arial"/>
-                <w:b/>
-                <w:bCs/>
-                <w:sz w:val="24"/>
-                <w:szCs w:val="24"/>
-              </w:rPr>
-              <w:t>DADOS DO CLIENTE</w:t>
-            </w:r>
-          </w:p>
-          <w:p>
-            <w:pPr>
-              <w:spacing w:after="0" w:line="276" w:lineRule="auto"/>
-              <w:ind w:left="3102" w:hanging="3102"/>
-              <w:rPr>
-                <w:rFonts w:ascii="Arial" w:hAnsi="Arial" w:cs="Arial"/>
-                <w:b/>
-                <w:bCs/>
-                <w:sz w:val="10"/>
-                <w:szCs w:val="10"/>
-              </w:rPr>
-            </w:pPr>
-          </w:p>
-        </w:tc>
-      </w:tr>
-      <w:tr>
-        <w:trPr>
-          <w:trHeight w:val="1026"/>
-        </w:trPr>
-        <w:tc>
-          <w:tcPr>
-            <w:tcW w:w="5393" w:type="dxa"/>
-            <w:tcBorders>
-              <w:top w:val="nil"/>
-              <w:right w:val="single" w:sz="4" w:space="0" w:color="A6A6A6" w:themeColor="background1" w:themeShade="A6"/>
-            </w:tcBorders>
-          </w:tcPr>
-          <w:p>
-            <w:pPr>
-              <w:spacing w:after="0" w:line="276" w:lineRule="auto"/>
-              <w:rPr>
-                <w:rFonts w:ascii="Arial" w:hAnsi="Arial" w:cs="Arial"/>
-                <w:bCs/>
-                <w:sz w:val="24"/>
-                <w:szCs w:val="24"/>
-              </w:rPr>
-            </w:pPr>
-            <w:r>
-              <w:rPr>
-                <w:rFonts w:ascii="Arial" w:hAnsi="Arial" w:cs="Arial"/>
-                <w:b/>
-                <w:sz w:val="24"/>
-                <w:szCs w:val="24"/>
-              </w:rPr>
-              <w:t>Consultor de Vendas:</w:t>
-            </w:r>
-            <w:r>
-              <w:rPr>
-                <w:rFonts w:ascii="Arial" w:hAnsi="Arial" w:cs="Arial"/>
-                <w:b/>
-                <w:bCs/>
-                <w:sz w:val="24"/>
-                <w:szCs w:val="24"/>
-              </w:rPr>
-              <w:t xml:space="preserve"> {{</w:t>
-            </w:r>
-            <w:proofErr w:type="spellStart"/>
-            <w:r>
-              <w:rPr>
-                <w:rFonts w:ascii="Arial" w:hAnsi="Arial" w:cs="Arial"/>
-                <w:b/>
-                <w:bCs/>
-                <w:sz w:val="24"/>
-                <w:szCs w:val="24"/>
-              </w:rPr>
-              <w:t>nome_vendedor</w:t>
-            </w:r>
-            <w:proofErr w:type="spellEnd"/>
-            <w:r>
-              <w:rPr>
-                <w:rFonts w:ascii="Arial" w:hAnsi="Arial" w:cs="Arial"/>
-                <w:b/>
-                <w:bCs/>
-                <w:sz w:val="24"/>
-                <w:szCs w:val="24"/>
-              </w:rPr>
-              <w:t>}}</w:t>
-            </w:r>
-          </w:p>
-          <w:p>
-            <w:pPr>
-              <w:spacing w:after="0" w:line="276" w:lineRule="auto"/>
-              <w:rPr>
-                <w:rFonts w:ascii="Arial" w:hAnsi="Arial" w:cs="Arial"/>
-                <w:b/>
-                <w:sz w:val="20"/>
-                <w:szCs w:val="20"/>
-              </w:rPr>
-            </w:pPr>
-            <w:r>
-              <w:rPr>
-                <w:rFonts w:ascii="Arial" w:hAnsi="Arial" w:cs="Arial"/>
-                <w:b/>
-                <w:sz w:val="24"/>
-                <w:szCs w:val="24"/>
-              </w:rPr>
-              <w:t>Orçamentista:</w:t>
-            </w:r>
-            <w:r>
-              <w:rPr>
-                <w:rFonts w:ascii="Arial" w:hAnsi="Arial" w:cs="Arial"/>
-                <w:bCs/>
-                <w:sz w:val="24"/>
-                <w:szCs w:val="24"/>
-              </w:rPr>
-              <w:t xml:space="preserve"> {{</w:t>
-            </w:r>
-            <w:proofErr w:type="spellStart"/>
-            <w:r>
-              <w:rPr>
-                <w:rFonts w:ascii="Arial" w:hAnsi="Arial" w:cs="Arial"/>
-                <w:bCs/>
-                <w:sz w:val="24"/>
-                <w:szCs w:val="24"/>
-              </w:rPr>
-              <w:t>elaborador_proposta</w:t>
-            </w:r>
-            <w:proofErr w:type="spellEnd"/>
-            <w:r>
-              <w:rPr>
-                <w:rFonts w:ascii="Arial" w:hAnsi="Arial" w:cs="Arial"/>
-                <w:bCs/>
-                <w:sz w:val="24"/>
-                <w:szCs w:val="24"/>
-              </w:rPr>
-              <w:t>}}</w:t>
-            </w:r>
-          </w:p>
-          <w:p>
-            <w:pPr>
-              <w:spacing w:after="0" w:line="276" w:lineRule="auto"/>
-              <w:rPr>
-                <w:rFonts w:ascii="Arial" w:hAnsi="Arial" w:cs="Arial"/>
-                <w:b/>
-                <w:sz w:val="24"/>
-                <w:szCs w:val="24"/>
-              </w:rPr>
-            </w:pPr>
-          </w:p>
-        </w:tc>
-        <w:tc>
-          <w:tcPr>
-            <w:tcW w:w="5307" w:type="dxa"/>
-            <w:tcBorders>
-              <w:top w:val="nil"/>
-              <w:left w:val="single" w:sz="4" w:space="0" w:color="A6A6A6" w:themeColor="background1" w:themeShade="A6"/>
-            </w:tcBorders>
-          </w:tcPr>
-          <w:p>
-            <w:pPr>
-              <w:spacing w:after="0" w:line="276" w:lineRule="auto"/>
-              <w:ind w:left="3102" w:hanging="3102"/>
-              <w:rPr>
-                <w:rFonts w:ascii="Arial" w:hAnsi="Arial" w:cs="Arial"/>
-                <w:b/>
-                <w:bCs/>
-                <w:sz w:val="24"/>
-                <w:szCs w:val="24"/>
-              </w:rPr>
-            </w:pPr>
-            <w:r>
-              <w:rPr>
-                <w:rFonts w:ascii="Arial" w:hAnsi="Arial" w:cs="Arial"/>
-                <w:b/>
-                <w:bCs/>
-                <w:sz w:val="24"/>
-                <w:szCs w:val="24"/>
-              </w:rPr>
-              <w:t>{{</w:t>
-            </w:r>
-            <w:proofErr w:type="spellStart"/>
-            <w:r>
-              <w:rPr>
-                <w:rFonts w:ascii="Arial" w:hAnsi="Arial" w:cs="Arial"/>
-                <w:b/>
-                <w:bCs/>
-                <w:sz w:val="24"/>
-                <w:szCs w:val="24"/>
-              </w:rPr>
-              <w:t>nome_cliente</w:t>
-            </w:r>
-            <w:proofErr w:type="spellEnd"/>
-            <w:r>
-              <w:rPr>
-                <w:rFonts w:ascii="Arial" w:hAnsi="Arial" w:cs="Arial"/>
-                <w:b/>
-                <w:bCs/>
-                <w:sz w:val="24"/>
-                <w:szCs w:val="24"/>
-              </w:rPr>
-              <w:t>}}</w:t>
-            </w:r>
-          </w:p>
-          <w:p>
-            <w:pPr>
-              <w:spacing w:after="0" w:line="276" w:lineRule="auto"/>
-              <w:ind w:left="3102" w:hanging="3102"/>
-              <w:rPr>
-                <w:rFonts w:ascii="Arial" w:hAnsi="Arial" w:cs="Arial"/>
-                <w:sz w:val="24"/>
-                <w:szCs w:val="24"/>
-              </w:rPr>
-            </w:pPr>
-            <w:r>
-              <w:rPr>
-                <w:rFonts w:ascii="Arial" w:hAnsi="Arial" w:cs="Arial"/>
-                <w:b/>
-                <w:bCs/>
-                <w:sz w:val="24"/>
-                <w:szCs w:val="24"/>
-              </w:rPr>
-              <w:t xml:space="preserve">A/C </w:t>
-            </w:r>
-            <w:r>
-              <w:rPr>
-                <w:rFonts w:ascii="Arial" w:hAnsi="Arial" w:cs="Arial"/>
-                <w:sz w:val="24"/>
-                <w:szCs w:val="24"/>
-              </w:rPr>
-              <w:t>{{</w:t>
-            </w:r>
-            <w:proofErr w:type="spellStart"/>
-            <w:r>
-              <w:rPr>
-                <w:rFonts w:ascii="Arial" w:hAnsi="Arial" w:cs="Arial"/>
-                <w:sz w:val="24"/>
-                <w:szCs w:val="24"/>
-              </w:rPr>
-              <w:t>contato_cliente</w:t>
-            </w:r>
-            <w:proofErr w:type="spellEnd"/>
-            <w:r>
-              <w:rPr>
-                <w:rFonts w:ascii="Arial" w:hAnsi="Arial" w:cs="Arial"/>
-                <w:sz w:val="24"/>
-                <w:szCs w:val="24"/>
-              </w:rPr>
-              <w:t>}}</w:t>
-            </w:r>
-          </w:p>
-          <w:p>
-            <w:pPr>
-              <w:spacing w:after="0" w:line="276" w:lineRule="auto"/>
-              <w:ind w:left="3102" w:hanging="3102"/>
-              <w:rPr>
-                <w:rFonts w:ascii="Arial" w:hAnsi="Arial" w:cs="Arial"/>
-                <w:sz w:val="24"/>
-                <w:szCs w:val="24"/>
-              </w:rPr>
-            </w:pPr>
-            <w:r>
-              <w:rPr>
-                <w:rFonts w:ascii="Arial" w:hAnsi="Arial" w:cs="Arial"/>
-                <w:b/>
-                <w:bCs/>
-                <w:sz w:val="24"/>
-                <w:szCs w:val="24"/>
-              </w:rPr>
-              <w:t>E-mail do solicitante:</w:t>
-            </w:r>
-            <w:r>
-              <w:rPr>
-                <w:rFonts w:ascii="Arial" w:hAnsi="Arial" w:cs="Arial"/>
-                <w:sz w:val="24"/>
-                <w:szCs w:val="24"/>
-              </w:rPr>
-              <w:t xml:space="preserve"> {{</w:t>
-            </w:r>
-            <w:proofErr w:type="spellStart"/>
-            <w:r>
-              <w:rPr>
-                <w:rFonts w:ascii="Arial" w:hAnsi="Arial" w:cs="Arial"/>
-                <w:sz w:val="24"/>
-                <w:szCs w:val="24"/>
-              </w:rPr>
-              <w:t>email_cliente</w:t>
-            </w:r>
-            <w:proofErr w:type="spellEnd"/>
-            <w:r>
-              <w:rPr>
-                <w:rFonts w:ascii="Arial" w:hAnsi="Arial" w:cs="Arial"/>
-                <w:sz w:val="24"/>
-                <w:szCs w:val="24"/>
-              </w:rPr>
-              <w:t>}}</w:t>
-            </w:r>
-          </w:p>
-          <w:p>
-            <w:pPr>
-              <w:spacing w:after="0" w:line="276" w:lineRule="auto"/>
-              <w:ind w:left="3102" w:hanging="3102"/>
-              <w:rPr>
-                <w:rFonts w:ascii="Arial" w:hAnsi="Arial" w:cs="Arial"/>
-                <w:sz w:val="24"/>
-                <w:szCs w:val="24"/>
-              </w:rPr>
-            </w:pPr>
-            <w:r>
-              <w:rPr>
-                <w:rFonts w:ascii="Arial" w:hAnsi="Arial" w:cs="Arial"/>
-                <w:b/>
-                <w:bCs/>
-                <w:sz w:val="24"/>
-                <w:szCs w:val="24"/>
-              </w:rPr>
-              <w:t>Departamento:</w:t>
-            </w:r>
-            <w:r>
-              <w:rPr>
-                <w:rFonts w:ascii="Arial" w:hAnsi="Arial" w:cs="Arial"/>
-                <w:sz w:val="24"/>
-                <w:szCs w:val="24"/>
-              </w:rPr>
-              <w:t xml:space="preserve"> {{</w:t>
-            </w:r>
-            <w:proofErr w:type="spellStart"/>
-            <w:r>
-              <w:rPr>
-                <w:rFonts w:ascii="Arial" w:hAnsi="Arial" w:cs="Arial"/>
-                <w:sz w:val="24"/>
-                <w:szCs w:val="24"/>
-              </w:rPr>
-              <w:t>dpto_solicitante</w:t>
-            </w:r>
-            <w:proofErr w:type="spellEnd"/>
-            <w:r>
-              <w:rPr>
-                <w:rFonts w:ascii="Arial" w:hAnsi="Arial" w:cs="Arial"/>
-                <w:sz w:val="24"/>
-                <w:szCs w:val="24"/>
-              </w:rPr>
-              <w:t>}}</w:t>
-            </w:r>
-          </w:p>
-          <w:p>
-            <w:pPr>
-              <w:tabs>
-                <w:tab w:val="left" w:pos="9945"/>
-              </w:tabs>
-              <w:spacing w:after="0" w:line="276" w:lineRule="auto"/>
-              <w:ind w:left="3102" w:hanging="3102"/>
-              <w:rPr>
-                <w:rFonts w:ascii="Arial" w:hAnsi="Arial" w:cs="Arial"/>
-                <w:sz w:val="24"/>
-                <w:szCs w:val="24"/>
-              </w:rPr>
-            </w:pPr>
-            <w:r>
-              <w:rPr>
-                <w:rFonts w:ascii="Arial" w:hAnsi="Arial" w:cs="Arial"/>
-                <w:sz w:val="24"/>
-                <w:szCs w:val="24"/>
-              </w:rPr>
-              <w:tab/>
-            </w:r>
-          </w:p>
-          <w:p>
-            <w:pPr>
-              <w:spacing w:after="0" w:line="276" w:lineRule="auto"/>
-              <w:ind w:left="3102" w:hanging="3102"/>
-              <w:rPr>
-                <w:rFonts w:ascii="Arial" w:hAnsi="Arial" w:cs="Arial"/>
-                <w:sz w:val="24"/>
-                <w:szCs w:val="24"/>
-              </w:rPr>
-            </w:pPr>
-            <w:r>
-              <w:rPr>
-                <w:rFonts w:ascii="Arial" w:hAnsi="Arial" w:cs="Arial"/>
-                <w:b/>
-                <w:bCs/>
-                <w:sz w:val="24"/>
-                <w:szCs w:val="24"/>
-              </w:rPr>
-              <w:t xml:space="preserve">Local da obra: </w:t>
-            </w:r>
-            <w:r>
-              <w:rPr>
-                <w:rFonts w:ascii="Arial" w:hAnsi="Arial" w:cs="Arial"/>
-                <w:sz w:val="24"/>
-                <w:szCs w:val="24"/>
-              </w:rPr>
-              <w:t>{{</w:t>
-            </w:r>
-            <w:proofErr w:type="spellStart"/>
-            <w:r>
-              <w:rPr>
-                <w:rFonts w:ascii="Arial" w:hAnsi="Arial" w:cs="Arial"/>
-                <w:sz w:val="24"/>
-                <w:szCs w:val="24"/>
-              </w:rPr>
-              <w:t>local_obra</w:t>
-            </w:r>
-            <w:proofErr w:type="spellEnd"/>
-            <w:r>
-              <w:rPr>
-                <w:rFonts w:ascii="Arial" w:hAnsi="Arial" w:cs="Arial"/>
-                <w:sz w:val="24"/>
-                <w:szCs w:val="24"/>
-              </w:rPr>
-              <w:t>}}</w:t>
-            </w:r>
-          </w:p>
-          <w:p>
-            <w:pPr>
-              <w:spacing w:after="0" w:line="276" w:lineRule="auto"/>
-              <w:ind w:left="3102" w:right="-55" w:hanging="3102"/>
-              <w:rPr>
-                <w:rFonts w:ascii="Arial" w:hAnsi="Arial" w:cs="Arial"/>
-                <w:b/>
-                <w:bCs/>
-                <w:sz w:val="24"/>
-                <w:szCs w:val="24"/>
-              </w:rPr>
-            </w:pPr>
-          </w:p>
-          <w:p>
-            <w:pPr>
-              <w:spacing w:after="0" w:line="276" w:lineRule="auto"/>
-              <w:ind w:left="3102" w:hanging="3102"/>
-              <w:rPr>
-                <w:rFonts w:ascii="Arial" w:hAnsi="Arial" w:cs="Arial"/>
-                <w:b/>
-                <w:bCs/>
-                <w:sz w:val="24"/>
-                <w:szCs w:val="24"/>
-              </w:rPr>
-            </w:pPr>
-            <w:r>
-              <w:rPr>
-                <w:rFonts w:ascii="Arial" w:hAnsi="Arial" w:cs="Arial"/>
-                <w:b/>
-                <w:bCs/>
-                <w:sz w:val="24"/>
-                <w:szCs w:val="24"/>
-              </w:rPr>
-              <w:t xml:space="preserve">CNPJ: </w:t>
-            </w:r>
-            <w:r>
-              <w:rPr>
-                <w:rFonts w:ascii="Arial" w:hAnsi="Arial" w:cs="Arial"/>
-                <w:sz w:val="24"/>
-                <w:szCs w:val="24"/>
-              </w:rPr>
-              <w:t>{{</w:t>
-            </w:r>
-            <w:proofErr w:type="spellStart"/>
-            <w:r>
-              <w:rPr>
-                <w:rFonts w:ascii="Arial" w:hAnsi="Arial" w:cs="Arial"/>
-                <w:sz w:val="24"/>
-                <w:szCs w:val="24"/>
-              </w:rPr>
-              <w:t>cnpj_texto</w:t>
-            </w:r>
-            <w:proofErr w:type="spellEnd"/>
-            <w:r>
-              <w:rPr>
-                <w:rFonts w:ascii="Arial" w:hAnsi="Arial" w:cs="Arial"/>
-                <w:sz w:val="24"/>
-                <w:szCs w:val="24"/>
-              </w:rPr>
-              <w:t>}}</w:t>
-            </w:r>
-          </w:p>
-          <w:p>
-            <w:pPr>
-              <w:spacing w:after="0" w:line="276" w:lineRule="auto"/>
-              <w:ind w:left="3102" w:hanging="3102"/>
-              <w:rPr>
-                <w:rFonts w:ascii="Arial" w:hAnsi="Arial" w:cs="Arial"/>
-                <w:b/>
-                <w:bCs/>
-                <w:sz w:val="24"/>
-                <w:szCs w:val="24"/>
-              </w:rPr>
-            </w:pPr>
-          </w:p>
-        </w:tc>
-      </w:tr>
-    </w:tbl>
-    <w:p>
-      <w:pPr>
-        <w:spacing w:after="0" w:line="276" w:lineRule="auto"/>
-        <w:rPr>
-          <w:rFonts w:ascii="Arial" w:hAnsi="Arial" w:cs="Arial"/>
-          <w:b/>
+          <w:rFonts w:ascii="Arial" w:hAnsi="Arial" w:cs="Arial"/>
+          <w:b/>
+          <w:bCs/>
           <w:sz w:val="24"/>
           <w:szCs w:val="24"/>
         </w:rPr>
-        <w:sectPr>
-          <w:type w:val="continuous"/>
-          <w:pgSz w:w="11906" w:h="16838"/>
-          <w:pgMar w:top="2977" w:right="566" w:bottom="1417" w:left="567" w:header="737" w:footer="132" w:gutter="0"/>
-          <w:cols w:space="720"/>
-          <w:formProt w:val="0"/>
-          <w:docGrid w:linePitch="299"/>
-        </w:sectPr>
-      </w:pPr>
-    </w:p>
-    <w:bookmarkEnd w:id="0"/>
+        <w:t>nome_vendedor</w:t>
+      </w:r>
+      <w:proofErr w:type="spellEnd"/>
+      <w:r>
+        <w:rPr>
+          <w:rFonts w:ascii="Arial" w:hAnsi="Arial" w:cs="Arial"/>
+          <w:b/>
+          <w:bCs/>
+          <w:sz w:val="24"/>
+          <w:szCs w:val="24"/>
+        </w:rPr>
+        <w:t>}}</w:t>
+      </w:r>
+    </w:p>
+    <w:p>
+      <w:pPr>
+        <w:spacing w:after="0" w:line="240" w:lineRule="auto"/>
+        <w:rPr>
+          <w:rFonts w:ascii="Arial" w:hAnsi="Arial" w:cs="Arial"/>
+          <w:b/>
+          <w:sz w:val="20"/>
+          <w:szCs w:val="20"/>
+        </w:rPr>
+      </w:pPr>
+      <w:r>
+        <w:rPr>
+          <w:rFonts w:ascii="Arial" w:hAnsi="Arial" w:cs="Arial"/>
+          <w:bCs/>
+          <w:sz w:val="24"/>
+          <w:szCs w:val="24"/>
+        </w:rPr>
+        <w:t>Orçamentista: {{</w:t>
+      </w:r>
+      <w:proofErr w:type="spellStart"/>
+      <w:r>
+        <w:rPr>
+          <w:rFonts w:ascii="Arial" w:hAnsi="Arial" w:cs="Arial"/>
+          <w:bCs/>
+          <w:sz w:val="24"/>
+          <w:szCs w:val="24"/>
+        </w:rPr>
+        <w:t>elaborador_proposta</w:t>
+      </w:r>
+      <w:proofErr w:type="spellEnd"/>
+      <w:r>
+        <w:rPr>
+          <w:rFonts w:ascii="Arial" w:hAnsi="Arial" w:cs="Arial"/>
+          <w:bCs/>
+          <w:sz w:val="24"/>
+          <w:szCs w:val="24"/>
+        </w:rPr>
+        <w:t>}}</w:t>
+      </w:r>
+    </w:p>
+    <w:p>
+      <w:pPr>
+        <w:spacing w:after="0" w:line="240" w:lineRule="auto"/>
+        <w:rPr>
+          <w:rFonts w:ascii="Arial" w:hAnsi="Arial" w:cs="Arial"/>
+          <w:b/>
+          <w:sz w:val="20"/>
+          <w:szCs w:val="20"/>
+        </w:rPr>
+      </w:pPr>
+    </w:p>
+    <w:p>
+      <w:pPr>
+        <w:spacing w:after="0" w:line="240" w:lineRule="auto"/>
+        <w:rPr>
+          <w:rFonts w:ascii="Arial" w:hAnsi="Arial" w:cs="Arial"/>
+          <w:b/>
+          <w:bCs/>
+          <w:sz w:val="24"/>
+          <w:szCs w:val="24"/>
+        </w:rPr>
+      </w:pPr>
+      <w:r>
+        <w:rPr>
+          <w:rFonts w:ascii="Arial" w:hAnsi="Arial" w:cs="Arial"/>
+          <w:b/>
+          <w:bCs/>
+          <w:sz w:val="24"/>
+          <w:szCs w:val="24"/>
+        </w:rPr>
+        <w:t>PROPOSTA N°: {{</w:t>
+      </w:r>
+      <w:proofErr w:type="spellStart"/>
+      <w:r>
+        <w:rPr>
+          <w:rFonts w:ascii="Arial" w:hAnsi="Arial" w:cs="Arial"/>
+          <w:b/>
+          <w:bCs/>
+          <w:sz w:val="24"/>
+          <w:szCs w:val="24"/>
+        </w:rPr>
+        <w:t>cod_prop</w:t>
+      </w:r>
+      <w:proofErr w:type="spellEnd"/>
+      <w:r>
+        <w:rPr>
+          <w:rFonts w:ascii="Arial" w:hAnsi="Arial" w:cs="Arial"/>
+          <w:b/>
+          <w:bCs/>
+          <w:sz w:val="24"/>
+          <w:szCs w:val="24"/>
+        </w:rPr>
+        <w:t xml:space="preserve">}} REV - </w:t>
+      </w:r>
+      <w:r>
+        <w:rPr>
+          <w:rFonts w:ascii="Arial" w:eastAsia="Arial" w:hAnsi="Arial"/>
+          <w:sz w:val="20"/>
+          <w:szCs w:val="20"/>
+        </w:rPr>
+        <w:t>{{</w:t>
+      </w:r>
+      <w:proofErr w:type="spellStart"/>
+      <w:r>
+        <w:rPr>
+          <w:rFonts w:ascii="Arial" w:eastAsia="Arial" w:hAnsi="Arial"/>
+          <w:sz w:val="20"/>
+          <w:szCs w:val="20"/>
+        </w:rPr>
+        <w:t>n_rev</w:t>
+      </w:r>
+      <w:proofErr w:type="spellEnd"/>
+      <w:r>
+        <w:rPr>
+          <w:rFonts w:ascii="Arial" w:eastAsia="Arial" w:hAnsi="Arial"/>
+          <w:sz w:val="20"/>
+          <w:szCs w:val="20"/>
+        </w:rPr>
+        <w:t>}}</w:t>
+      </w:r>
+    </w:p>
+    <w:p>
+      <w:pPr>
+        <w:spacing w:after="0" w:line="240" w:lineRule="auto"/>
+        <w:rPr>
+          <w:rFonts w:ascii="Arial" w:hAnsi="Arial" w:cs="Arial"/>
+          <w:b/>
+          <w:bCs/>
+          <w:sz w:val="24"/>
+          <w:szCs w:val="24"/>
+        </w:rPr>
+      </w:pPr>
+      <w:r>
+        <w:rPr>
+          <w:rFonts w:ascii="Arial" w:hAnsi="Arial" w:cs="Arial"/>
+          <w:b/>
+          <w:bCs/>
+          <w:sz w:val="24"/>
+          <w:szCs w:val="24"/>
+        </w:rPr>
+        <w:t>CLIENTE: {{</w:t>
+      </w:r>
+      <w:proofErr w:type="spellStart"/>
+      <w:r>
+        <w:rPr>
+          <w:rFonts w:ascii="Arial" w:hAnsi="Arial" w:cs="Arial"/>
+          <w:b/>
+          <w:bCs/>
+          <w:sz w:val="24"/>
+          <w:szCs w:val="24"/>
+        </w:rPr>
+        <w:t>nome_cliente</w:t>
+      </w:r>
+      <w:proofErr w:type="spellEnd"/>
+      <w:r>
+        <w:rPr>
+          <w:rFonts w:ascii="Arial" w:hAnsi="Arial" w:cs="Arial"/>
+          <w:b/>
+          <w:bCs/>
+          <w:sz w:val="24"/>
+          <w:szCs w:val="24"/>
+        </w:rPr>
+        <w:t>}}</w:t>
+      </w:r>
+    </w:p>
+    <w:p>
+      <w:pPr>
+        <w:spacing w:after="0" w:line="240" w:lineRule="auto"/>
+        <w:rPr>
+          <w:rFonts w:ascii="Arial" w:hAnsi="Arial" w:cs="Arial"/>
+          <w:sz w:val="24"/>
+          <w:szCs w:val="24"/>
+        </w:rPr>
+      </w:pPr>
+      <w:r>
+        <w:rPr>
+          <w:rFonts w:ascii="Arial" w:hAnsi="Arial" w:cs="Arial"/>
+          <w:sz w:val="24"/>
+          <w:szCs w:val="24"/>
+        </w:rPr>
+        <w:t>A/C: {{</w:t>
+      </w:r>
+      <w:proofErr w:type="spellStart"/>
+      <w:r>
+        <w:rPr>
+          <w:rFonts w:ascii="Arial" w:hAnsi="Arial" w:cs="Arial"/>
+          <w:sz w:val="24"/>
+          <w:szCs w:val="24"/>
+        </w:rPr>
+        <w:t>contato_cliente</w:t>
+      </w:r>
+      <w:proofErr w:type="spellEnd"/>
+      <w:r>
+        <w:rPr>
+          <w:rFonts w:ascii="Arial" w:hAnsi="Arial" w:cs="Arial"/>
+          <w:sz w:val="24"/>
+          <w:szCs w:val="24"/>
+        </w:rPr>
+        <w:t>}}</w:t>
+      </w:r>
+    </w:p>
+    <w:p>
+      <w:pPr>
+        <w:spacing w:after="0" w:line="240" w:lineRule="auto"/>
+        <w:rPr>
+          <w:rFonts w:ascii="Arial" w:hAnsi="Arial" w:cs="Arial"/>
+          <w:sz w:val="24"/>
+          <w:szCs w:val="24"/>
+        </w:rPr>
+      </w:pPr>
+      <w:r>
+        <w:rPr>
+          <w:rFonts w:ascii="Arial" w:hAnsi="Arial" w:cs="Arial"/>
+          <w:sz w:val="24"/>
+          <w:szCs w:val="24"/>
+        </w:rPr>
+        <w:t>E-mail do solicitante: {{</w:t>
+      </w:r>
+      <w:proofErr w:type="spellStart"/>
+      <w:r>
+        <w:rPr>
+          <w:rFonts w:ascii="Arial" w:hAnsi="Arial" w:cs="Arial"/>
+          <w:sz w:val="24"/>
+          <w:szCs w:val="24"/>
+        </w:rPr>
+        <w:t>email_cliente</w:t>
+      </w:r>
+      <w:proofErr w:type="spellEnd"/>
+      <w:r>
+        <w:rPr>
+          <w:rFonts w:ascii="Arial" w:hAnsi="Arial" w:cs="Arial"/>
+          <w:sz w:val="24"/>
+          <w:szCs w:val="24"/>
+        </w:rPr>
+        <w:t>}}</w:t>
+      </w:r>
+    </w:p>
+    <w:p>
+      <w:pPr>
+        <w:spacing w:after="0" w:line="240" w:lineRule="auto"/>
+        <w:rPr>
+          <w:rFonts w:ascii="Arial" w:hAnsi="Arial" w:cs="Arial"/>
+          <w:sz w:val="24"/>
+          <w:szCs w:val="24"/>
+        </w:rPr>
+      </w:pPr>
+      <w:r>
+        <w:rPr>
+          <w:rFonts w:ascii="Arial" w:hAnsi="Arial" w:cs="Arial"/>
+          <w:sz w:val="24"/>
+          <w:szCs w:val="24"/>
+        </w:rPr>
+        <w:t>Departamento: {{</w:t>
+      </w:r>
+      <w:proofErr w:type="spellStart"/>
+      <w:r>
+        <w:rPr>
+          <w:rFonts w:ascii="Arial" w:hAnsi="Arial" w:cs="Arial"/>
+          <w:sz w:val="24"/>
+          <w:szCs w:val="24"/>
+        </w:rPr>
+        <w:t>dpto_solicitante</w:t>
+      </w:r>
+      <w:proofErr w:type="spellEnd"/>
+      <w:r>
+        <w:rPr>
+          <w:rFonts w:ascii="Arial" w:hAnsi="Arial" w:cs="Arial"/>
+          <w:sz w:val="24"/>
+          <w:szCs w:val="24"/>
+        </w:rPr>
+        <w:t>}}</w:t>
+      </w:r>
+    </w:p>
+    <w:p>
+      <w:pPr>
+        <w:tabs>
+          <w:tab w:val="left" w:pos="9945"/>
+        </w:tabs>
+        <w:spacing w:after="0" w:line="240" w:lineRule="auto"/>
+        <w:rPr>
+          <w:rFonts w:ascii="Arial" w:hAnsi="Arial" w:cs="Arial"/>
+          <w:sz w:val="24"/>
+          <w:szCs w:val="24"/>
+        </w:rPr>
+      </w:pPr>
+      <w:r>
+        <w:rPr>
+          <w:rFonts w:ascii="Arial" w:hAnsi="Arial" w:cs="Arial"/>
+          <w:sz w:val="24"/>
+          <w:szCs w:val="24"/>
+        </w:rPr>
+        <w:tab/>
+      </w:r>
+    </w:p>
+    <w:p>
+      <w:pPr>
+        <w:spacing w:after="0" w:line="240" w:lineRule="auto"/>
+        <w:rPr>
+          <w:rFonts w:ascii="Arial" w:hAnsi="Arial" w:cs="Arial"/>
+          <w:sz w:val="24"/>
+          <w:szCs w:val="24"/>
+        </w:rPr>
+      </w:pPr>
+      <w:r>
+        <w:rPr>
+          <w:rFonts w:ascii="Arial" w:hAnsi="Arial" w:cs="Arial"/>
+          <w:b/>
+          <w:bCs/>
+          <w:sz w:val="24"/>
+          <w:szCs w:val="24"/>
+        </w:rPr>
+        <w:t xml:space="preserve">Local da obra: </w:t>
+      </w:r>
+      <w:r>
+        <w:rPr>
+          <w:rFonts w:ascii="Arial" w:hAnsi="Arial" w:cs="Arial"/>
+          <w:sz w:val="24"/>
+          <w:szCs w:val="24"/>
+        </w:rPr>
+        <w:t>{{</w:t>
+      </w:r>
+      <w:proofErr w:type="spellStart"/>
+      <w:r>
+        <w:rPr>
+          <w:rFonts w:ascii="Arial" w:hAnsi="Arial" w:cs="Arial"/>
+          <w:sz w:val="24"/>
+          <w:szCs w:val="24"/>
+        </w:rPr>
+        <w:t>local_obra</w:t>
+      </w:r>
+      <w:proofErr w:type="spellEnd"/>
+      <w:r>
+        <w:rPr>
+          <w:rFonts w:ascii="Arial" w:hAnsi="Arial" w:cs="Arial"/>
+          <w:sz w:val="24"/>
+          <w:szCs w:val="24"/>
+        </w:rPr>
+        <w:t>}}</w:t>
+      </w:r>
+    </w:p>
+    <w:p>
+      <w:pPr>
+        <w:spacing w:after="0" w:line="240" w:lineRule="auto"/>
+        <w:rPr>
+          <w:rFonts w:ascii="Arial" w:hAnsi="Arial" w:cs="Arial"/>
+          <w:b/>
+          <w:bCs/>
+          <w:sz w:val="24"/>
+          <w:szCs w:val="24"/>
+        </w:rPr>
+      </w:pPr>
+    </w:p>
+    <w:p>
+      <w:pPr>
+        <w:spacing w:after="0" w:line="240" w:lineRule="auto"/>
+        <w:rPr>
+          <w:rFonts w:ascii="Arial" w:hAnsi="Arial" w:cs="Arial"/>
+          <w:b/>
+          <w:bCs/>
+          <w:sz w:val="24"/>
+          <w:szCs w:val="24"/>
+        </w:rPr>
+      </w:pPr>
+      <w:r>
+        <w:rPr>
+          <w:rFonts w:ascii="Arial" w:hAnsi="Arial" w:cs="Arial"/>
+          <w:b/>
+          <w:bCs/>
+          <w:sz w:val="24"/>
+          <w:szCs w:val="24"/>
+        </w:rPr>
+        <w:t xml:space="preserve">CNPJ: </w:t>
+      </w:r>
+      <w:r>
+        <w:rPr>
+          <w:rFonts w:ascii="Arial" w:hAnsi="Arial" w:cs="Arial"/>
+          <w:sz w:val="24"/>
+          <w:szCs w:val="24"/>
+        </w:rPr>
+        <w:t>{{</w:t>
+      </w:r>
+      <w:proofErr w:type="spellStart"/>
+      <w:r>
+        <w:rPr>
+          <w:rFonts w:ascii="Arial" w:hAnsi="Arial" w:cs="Arial"/>
+          <w:sz w:val="24"/>
+          <w:szCs w:val="24"/>
+        </w:rPr>
+        <w:t>cnpj_texto</w:t>
+      </w:r>
+      <w:proofErr w:type="spellEnd"/>
+      <w:r>
+        <w:rPr>
+          <w:rFonts w:ascii="Arial" w:hAnsi="Arial" w:cs="Arial"/>
+          <w:sz w:val="24"/>
+          <w:szCs w:val="24"/>
+        </w:rPr>
+        <w:t>}}</w:t>
+      </w:r>
+      <w:bookmarkEnd w:id="0"/>
+    </w:p>
     <w:p>
       <w:pPr>
         <w:spacing w:after="0" w:line="240" w:lineRule="auto"/>
@@ -1429,14 +1161,19 @@
           <w:sz w:val="20"/>
           <w:szCs w:val="20"/>
         </w:rPr>
-        <w:sectPr>
-          <w:type w:val="continuous"/>
-          <w:pgSz w:w="11906" w:h="16838"/>
-          <w:pgMar w:top="2977" w:right="566" w:bottom="1417" w:left="567" w:header="737" w:footer="132" w:gutter="0"/>
-          <w:cols w:space="720"/>
-          <w:formProt w:val="0"/>
-          <w:docGrid w:linePitch="299"/>
-        </w:sectPr>
+      </w:pPr>
+    </w:p>
+    <w:p>
+      <w:pPr>
+        <w:spacing w:after="0" w:line="240" w:lineRule="auto"/>
+        <w:jc w:val="center"/>
+        <w:rPr>
+          <w:rFonts w:ascii="Arial" w:hAnsi="Arial" w:cs="Arial"/>
+          <w:b/>
+          <w:bCs/>
+          <w:sz w:val="26"/>
+          <w:szCs w:val="26"/>
+        </w:rPr>
       </w:pPr>
     </w:p>
     <w:p>

</xml_diff>

<commit_message>
fix: corrigir finalização e formatação das propostas
</commit_message>
<xml_diff>
--- a/backend/models/comercial/Proposta Comercial.docx
+++ b/backend/models/comercial/Proposta Comercial.docx
@@ -7304,9 +7304,12 @@
     <w:p>
       <w:pPr>
         <w:spacing w:after="120" w:line="360" w:lineRule="auto"/>
+        <w:ind w:left="2136" w:right="0" w:firstLine="0"/>
         <w:jc w:val="both"/>
         <w:rPr>
           <w:rFonts w:cstheme="minorHAnsi"/>
+          <w:b w:val="false"/>
+          <w:bCs w:val="false"/>
           <w:sz w:val="20"/>
           <w:szCs w:val="20"/>
         </w:rPr>
@@ -7314,8 +7317,8 @@
       <w:r>
         <w:rPr>
           <w:rFonts w:cstheme="minorHAnsi"/>
-          <w:b/>
-          <w:bCs/>
+          <w:b w:val="false"/>
+          <w:bCs w:val="false"/>
           <w:sz w:val="20"/>
           <w:szCs w:val="20"/>
         </w:rPr>
@@ -7324,12 +7327,14 @@
     </w:p>
     <w:p>
       <w:pPr>
-        <w:pStyle w:val="PargrafodaLista"/>
+        <w:pStyle w:val="Normal"/>
         <w:spacing w:after="120" w:line="360" w:lineRule="auto"/>
-        <w:ind w:left="2136"/>
+        <w:ind w:left="2136" w:right="0" w:firstLine="0"/>
         <w:jc w:val="both"/>
         <w:rPr>
           <w:rFonts w:cstheme="minorHAnsi"/>
+          <w:b w:val="false"/>
+          <w:bCs w:val="false"/>
           <w:sz w:val="20"/>
           <w:szCs w:val="20"/>
         </w:rPr>
@@ -7337,6 +7342,8 @@
       <w:r>
         <w:rPr>
           <w:rFonts w:cstheme="minorHAnsi"/>
+          <w:b w:val="false"/>
+          <w:bCs w:val="false"/>
           <w:sz w:val="20"/>
           <w:szCs w:val="20"/>
         </w:rPr>
@@ -7372,9 +7379,12 @@
     <w:p>
       <w:pPr>
         <w:spacing w:after="120" w:line="360" w:lineRule="auto"/>
+        <w:ind w:left="2136" w:right="0" w:firstLine="0"/>
         <w:jc w:val="both"/>
         <w:rPr>
           <w:rFonts w:cstheme="minorHAnsi"/>
+          <w:b w:val="false"/>
+          <w:bCs w:val="false"/>
           <w:sz w:val="20"/>
           <w:szCs w:val="20"/>
         </w:rPr>
@@ -7382,8 +7392,8 @@
       <w:r>
         <w:rPr>
           <w:rFonts w:cstheme="minorHAnsi"/>
-          <w:b/>
-          <w:bCs/>
+          <w:b w:val="false"/>
+          <w:bCs w:val="false"/>
           <w:sz w:val="20"/>
           <w:szCs w:val="20"/>
         </w:rPr>
@@ -7392,12 +7402,14 @@
     </w:p>
     <w:p>
       <w:pPr>
-        <w:pStyle w:val="PargrafodaLista"/>
+        <w:pStyle w:val="Normal"/>
         <w:spacing w:after="120" w:line="360" w:lineRule="auto"/>
-        <w:ind w:left="2136"/>
+        <w:ind w:left="2136" w:right="0" w:firstLine="0"/>
         <w:jc w:val="both"/>
         <w:rPr>
           <w:rFonts w:cstheme="minorHAnsi"/>
+          <w:b w:val="false"/>
+          <w:bCs w:val="false"/>
           <w:sz w:val="20"/>
           <w:szCs w:val="20"/>
         </w:rPr>
@@ -7405,6 +7417,8 @@
       <w:r>
         <w:rPr>
           <w:rFonts w:cstheme="minorHAnsi"/>
+          <w:b w:val="false"/>
+          <w:bCs w:val="false"/>
           <w:sz w:val="20"/>
           <w:szCs w:val="20"/>
         </w:rPr>
@@ -7441,9 +7455,12 @@
     <w:p>
       <w:pPr>
         <w:spacing w:after="120" w:line="360" w:lineRule="auto"/>
+        <w:ind w:left="2136" w:right="0" w:firstLine="0"/>
         <w:jc w:val="both"/>
         <w:rPr>
           <w:rFonts w:cstheme="minorHAnsi"/>
+          <w:b w:val="false"/>
+          <w:bCs w:val="false"/>
           <w:sz w:val="20"/>
           <w:szCs w:val="20"/>
         </w:rPr>
@@ -7451,8 +7468,8 @@
       <w:r>
         <w:rPr>
           <w:rFonts w:cstheme="minorHAnsi"/>
-          <w:b/>
-          <w:bCs/>
+          <w:b w:val="false"/>
+          <w:bCs w:val="false"/>
           <w:sz w:val="20"/>
           <w:szCs w:val="20"/>
         </w:rPr>
@@ -7461,17 +7478,23 @@
     </w:p>
     <w:p>
       <w:pPr>
-        <w:pStyle w:val="PargrafodaLista"/>
+        <w:pStyle w:val="Normal"/>
         <w:spacing w:after="120" w:line="360" w:lineRule="auto"/>
-        <w:rPr>
-          <w:rFonts w:eastAsia="Arial" w:cstheme="minorHAnsi"/>
-          <w:sz w:val="20"/>
-          <w:szCs w:val="20"/>
-        </w:rPr>
-      </w:pPr>
-      <w:r>
-        <w:rPr>
-          <w:rFonts w:eastAsia="Arial" w:cstheme="minorHAnsi"/>
+        <w:ind w:left="2136" w:right="0" w:firstLine="0"/>
+        <w:jc w:val="both"/>
+        <w:rPr>
+          <w:rFonts w:eastAsia="Arial" w:cstheme="minorHAnsi"/>
+          <w:b w:val="false"/>
+          <w:bCs w:val="false"/>
+          <w:sz w:val="20"/>
+          <w:szCs w:val="20"/>
+        </w:rPr>
+      </w:pPr>
+      <w:r>
+        <w:rPr>
+          <w:rFonts w:eastAsia="Arial" w:cstheme="minorHAnsi"/>
+          <w:b w:val="false"/>
+          <w:bCs w:val="false"/>
           <w:sz w:val="20"/>
           <w:szCs w:val="20"/>
         </w:rPr>

</xml_diff>

<commit_message>
fix: restaurar nome e subitens da proposta comercial
</commit_message>
<xml_diff>
--- a/backend/models/comercial/Proposta Comercial.docx
+++ b/backend/models/comercial/Proposta Comercial.docx
@@ -868,6 +868,28 @@
           <w:szCs w:val="24"/>
         </w:rPr>
         <w:t>}}</w:t>
+      </w:r>
+    </w:p>
+    <w:p>
+      <w:pPr>
+        <w:spacing w:after="0" w:line="240" w:lineRule="auto"/>
+        <w:rPr>
+          <w:rFonts w:ascii="Arial" w:hAnsi="Arial" w:cs="Arial"/>
+          <w:b/>
+          <w:bCs/>
+          <w:sz w:val="24"/>
+          <w:szCs w:val="24"/>
+        </w:rPr>
+      </w:pPr>
+      <w:r>
+        <w:rPr>
+          <w:rFonts w:ascii="Arial" w:hAnsi="Arial" w:cs="Arial"/>
+          <w:b/>
+          <w:bCs/>
+          <w:sz w:val="24"/>
+          <w:szCs w:val="24"/>
+        </w:rPr>
+        <w:t>{{nome_proposta}}</w:t>
       </w:r>
     </w:p>
     <w:p>

</xml_diff>

<commit_message>
fix: preencher orçamentista no modelo comercial atualizado
</commit_message>
<xml_diff>
--- a/backend/models/comercial/Proposta Comercial.docx
+++ b/backend/models/comercial/Proposta Comercial.docx
@@ -792,6 +792,70 @@
     <w:p>
       <w:pPr>
         <w:spacing w:after="0" w:line="240" w:lineRule="auto"/>
+        <w:jc w:val="center"/>
+        <w:rPr>
+          <w:rFonts w:ascii="Arial" w:hAnsi="Arial" w:cs="Arial"/>
+          <w:b/>
+          <w:bCs/>
+          <w:sz w:val="28"/>
+          <w:szCs w:val="28"/>
+        </w:rPr>
+      </w:pPr>
+      <w:r>
+        <w:rPr>
+          <w:rFonts w:ascii="Arial" w:hAnsi="Arial" w:cs="Arial"/>
+          <w:b/>
+          <w:bCs/>
+          <w:sz w:val="28"/>
+          <w:szCs w:val="28"/>
+        </w:rPr>
+        <w:lastRenderedPageBreak/>
+        <w:t>Proposta Comercial</w:t>
+      </w:r>
+    </w:p>
+    <w:p>
+      <w:pPr>
+        <w:spacing w:after="0" w:line="240" w:lineRule="auto"/>
+        <w:rPr>
+          <w:rFonts w:ascii="Arial" w:hAnsi="Arial" w:cs="Arial"/>
+          <w:b/>
+          <w:sz w:val="24"/>
+          <w:szCs w:val="24"/>
+        </w:rPr>
+      </w:pPr>
+    </w:p>
+    <w:p>
+      <w:pPr>
+        <w:spacing w:after="0" w:line="240" w:lineRule="auto"/>
+        <w:rPr>
+          <w:rFonts w:ascii="Arial" w:hAnsi="Arial" w:cs="Arial"/>
+          <w:bCs/>
+          <w:sz w:val="24"/>
+          <w:szCs w:val="24"/>
+        </w:rPr>
+      </w:pPr>
+      <w:r>
+        <w:rPr>
+          <w:rFonts w:ascii="Arial" w:hAnsi="Arial" w:cs="Arial"/>
+          <w:b/>
+          <w:sz w:val="24"/>
+          <w:szCs w:val="24"/>
+        </w:rPr>
+        <w:t xml:space="preserve">Orçamentista: </w:t>
+      </w:r>
+      <w:r>
+        <w:rPr>
+          <w:rFonts w:ascii="Arial" w:hAnsi="Arial" w:cs="Arial"/>
+          <w:bCs/>
+          <w:sz w:val="24"/>
+          <w:szCs w:val="24"/>
+        </w:rPr>
+        <w:t>{{orçamentista}}</w:t>
+      </w:r>
+    </w:p>
+    <w:p>
+      <w:pPr>
+        <w:spacing w:after="0" w:line="240" w:lineRule="auto"/>
         <w:rPr>
           <w:rFonts w:ascii="Arial" w:hAnsi="Arial" w:cs="Arial"/>
           <w:b/>
@@ -868,28 +932,6 @@
           <w:szCs w:val="24"/>
         </w:rPr>
         <w:t>}}</w:t>
-      </w:r>
-    </w:p>
-    <w:p>
-      <w:pPr>
-        <w:spacing w:after="0" w:line="240" w:lineRule="auto"/>
-        <w:rPr>
-          <w:rFonts w:ascii="Arial" w:hAnsi="Arial" w:cs="Arial"/>
-          <w:b/>
-          <w:bCs/>
-          <w:sz w:val="24"/>
-          <w:szCs w:val="24"/>
-        </w:rPr>
-      </w:pPr>
-      <w:r>
-        <w:rPr>
-          <w:rFonts w:ascii="Arial" w:hAnsi="Arial" w:cs="Arial"/>
-          <w:b/>
-          <w:bCs/>
-          <w:sz w:val="24"/>
-          <w:szCs w:val="24"/>
-        </w:rPr>
-        <w:t>{{nome_proposta}}</w:t>
       </w:r>
     </w:p>
     <w:p>
@@ -2815,63 +2857,21 @@
     </w:sdt>
     <w:p>
       <w:pPr>
-        <w:spacing w:after="0" w:line="240" w:lineRule="auto"/>
-        <w:jc w:val="both"/>
-        <w:rPr>
-          <w:rFonts w:ascii="Arial" w:hAnsi="Arial" w:cs="Arial"/>
-          <w:b/>
-          <w:sz w:val="24"/>
-          <w:szCs w:val="24"/>
-        </w:rPr>
-      </w:pPr>
-    </w:p>
-    <w:p>
-      <w:pPr>
-        <w:spacing w:after="0" w:line="240" w:lineRule="auto"/>
-        <w:jc w:val="both"/>
-        <w:rPr>
-          <w:rFonts w:ascii="Arial" w:hAnsi="Arial" w:cs="Arial"/>
-          <w:b/>
-          <w:sz w:val="24"/>
-          <w:szCs w:val="24"/>
-        </w:rPr>
-      </w:pPr>
-    </w:p>
-    <w:p>
-      <w:pPr>
-        <w:spacing w:after="0" w:line="240" w:lineRule="auto"/>
-        <w:jc w:val="both"/>
-        <w:rPr>
-          <w:rFonts w:ascii="Arial" w:hAnsi="Arial" w:cs="Arial"/>
-          <w:b/>
-          <w:sz w:val="24"/>
-          <w:szCs w:val="24"/>
-        </w:rPr>
-      </w:pPr>
-    </w:p>
-    <w:p>
-      <w:pPr>
         <w:pStyle w:val="Ttulo1"/>
         <w:pageBreakBefore/>
         <w:rPr>
           <w:b w:val="0"/>
-          <w:sz w:val="20"/>
-          <w:szCs w:val="20"/>
         </w:rPr>
       </w:pPr>
       <w:bookmarkStart w:id="1" w:name="_Toc241759573"/>
-      <w:bookmarkStart w:id="2" w:name="_Hlk219203928"/>
-      <w:bookmarkStart w:id="3" w:name="_Toc241762336"/>
-      <w:r>
-        <w:rPr>
-          <w:sz w:val="20"/>
-          <w:szCs w:val="20"/>
-        </w:rPr>
+      <w:bookmarkStart w:id="2" w:name="_Toc241762336"/>
+      <w:bookmarkStart w:id="3" w:name="_Hlk219203928"/>
+      <w:r>
         <w:lastRenderedPageBreak/>
         <w:t>Filtrovali é a escolha certa para a sua obra</w:t>
       </w:r>
       <w:bookmarkEnd w:id="1"/>
-      <w:bookmarkEnd w:id="3"/>
+      <w:bookmarkEnd w:id="2"/>
     </w:p>
     <w:p>
       <w:pPr>
@@ -3671,21 +3671,9 @@
     <w:p>
       <w:pPr>
         <w:pStyle w:val="Ttulo2"/>
-        <w:rPr>
-          <w:bCs w:val="false"/>
-          <w:b w:val="false"/>
-          <w:sz w:val="20"/>
-          <w:szCs w:val="20"/>
-        </w:rPr>
       </w:pPr>
       <w:bookmarkStart w:id="4" w:name="__RefHeading___Toc532_2124872291"/>
       <w:r>
-        <w:rPr>
-          <w:bCs w:val="false"/>
-          <w:b w:val="false"/>
-          <w:sz w:val="20"/>
-          <w:szCs w:val="20"/>
-        </w:rPr>
         <w:t>- Tradição, excelência e referência em serviços industriais</w:t>
       </w:r>
       <w:bookmarkEnd w:id="4"/>
@@ -4340,22 +4328,9 @@
     <w:p>
       <w:pPr>
         <w:pStyle w:val="Ttulo2"/>
-        <w:rPr>
-          <w:bCs w:val="false"/>
-          <w:b w:val="false"/>
-          <w:szCs w:val="20"/>
-          <w:sz w:val="20"/>
-        </w:rPr>
       </w:pPr>
       <w:bookmarkStart w:id="5" w:name="__RefHeading___Toc534_2124872291"/>
       <w:r>
-        <w:rPr>
-          <w:bCs w:val="false"/>
-          <w:b w:val="false"/>
-          <w:szCs w:val="20"/>
-          <w:sz w:val="20"/>
-        </w:rPr>
-        <w:lastRenderedPageBreak/>
         <w:t>- Equipamentos modernos, revisados e alto desempenho e tecnologia para atender qualquer demanda.</w:t>
       </w:r>
       <w:bookmarkEnd w:id="5"/>
@@ -4677,21 +4652,9 @@
     <w:p>
       <w:pPr>
         <w:pStyle w:val="Ttulo2"/>
-        <w:rPr>
-          <w:bCs w:val="false"/>
-          <w:b w:val="false"/>
-          <w:szCs w:val="20"/>
-          <w:sz w:val="20"/>
-        </w:rPr>
       </w:pPr>
       <w:bookmarkStart w:id="6" w:name="__RefHeading___Toc536_2124872291"/>
       <w:r>
-        <w:rPr>
-          <w:bCs w:val="false"/>
-          <w:b w:val="false"/>
-          <w:szCs w:val="20"/>
-          <w:sz w:val="20"/>
-        </w:rPr>
         <w:t>- Clientes que confiam e atestam a excelência da Filtrovali</w:t>
       </w:r>
       <w:bookmarkEnd w:id="6"/>
@@ -4772,8 +4735,6 @@
         <w:jc w:val="both"/>
         <w:rPr>
           <w:rFonts w:cstheme="minorHAnsi"/>
-          <w:szCs w:val="20"/>
-          <w:sz w:val="20"/>
         </w:rPr>
       </w:pPr>
       <w:bookmarkStart w:id="7" w:name="_Toc241762337"/>
@@ -4781,18 +4742,14 @@
         <w:rPr>
           <w:rFonts w:eastAsia="Arial" w:cstheme="minorHAnsi"/>
           <w:bCs/>
-          <w:szCs w:val="20"/>
-          <w:sz w:val="20"/>
         </w:rPr>
         <w:t xml:space="preserve">- </w:t>
       </w:r>
-      <w:bookmarkEnd w:id="2"/>
+      <w:bookmarkEnd w:id="3"/>
       <w:r>
         <w:rPr>
           <w:rFonts w:eastAsia="Arial" w:cstheme="minorHAnsi"/>
           <w:bCs/>
-          <w:szCs w:val="20"/>
-          <w:sz w:val="20"/>
         </w:rPr>
         <w:t>Descrição dos serviços que serão executados:</w:t>
       </w:r>
@@ -4805,20 +4762,12 @@
         <w:jc w:val="both"/>
         <w:rPr>
           <w:rFonts w:cstheme="minorHAnsi"/>
-          <w:bCs w:val="false"/>
-          <w:b w:val="false"/>
-          <w:szCs w:val="20"/>
-          <w:sz w:val="20"/>
         </w:rPr>
       </w:pPr>
       <w:bookmarkStart w:id="8" w:name="__RefHeading___Toc540_2124872291"/>
       <w:r>
         <w:rPr>
           <w:rFonts w:cstheme="minorHAnsi"/>
-          <w:bCs w:val="false"/>
-          <w:b w:val="false"/>
-          <w:szCs w:val="20"/>
-          <w:sz w:val="20"/>
         </w:rPr>
         <w:t>{{servico}}</w:t>
       </w:r>
@@ -4835,8 +4784,6 @@
         <w:jc w:val="both"/>
         <w:rPr>
           <w:rFonts w:cstheme="minorHAnsi"/>
-          <w:bCs w:val="false"/>
-          <w:b w:val="false"/>
           <w:sz w:val="20"/>
           <w:szCs w:val="20"/>
         </w:rPr>
@@ -4844,8 +4791,6 @@
       <w:r>
         <w:rPr>
           <w:rFonts w:cstheme="minorHAnsi"/>
-          <w:bCs w:val="false"/>
-          <w:b w:val="false"/>
           <w:sz w:val="20"/>
           <w:szCs w:val="20"/>
         </w:rPr>
@@ -4907,7 +4852,6 @@
           <w:sz w:val="20"/>
           <w:szCs w:val="20"/>
         </w:rPr>
-        <w:lastRenderedPageBreak/>
         <w:t>não fazem parte do escopo.</w:t>
       </w:r>
     </w:p>
@@ -4917,8 +4861,6 @@
         <w:spacing w:after="120"/>
         <w:rPr>
           <w:rFonts w:cstheme="minorHAnsi"/>
-          <w:szCs w:val="20"/>
-          <w:sz w:val="20"/>
         </w:rPr>
       </w:pPr>
       <w:bookmarkStart w:id="9" w:name="_Toc241762338"/>
@@ -4926,8 +4868,6 @@
         <w:rPr>
           <w:rFonts w:eastAsia="Arial" w:cstheme="minorHAnsi"/>
           <w:bCs/>
-          <w:szCs w:val="20"/>
-          <w:sz w:val="20"/>
         </w:rPr>
         <w:t xml:space="preserve">- </w:t>
       </w:r>
@@ -4936,8 +4876,6 @@
           <w:rFonts w:cstheme="minorHAnsi"/>
           <w:bCs/>
           <w:color w:val="000000"/>
-          <w:szCs w:val="20"/>
-          <w:sz w:val="20"/>
         </w:rPr>
         <w:t>Matriz geral de responsabilidade</w:t>
       </w:r>
@@ -4949,31 +4887,19 @@
         <w:spacing w:after="120"/>
         <w:rPr>
           <w:rFonts w:cstheme="minorHAnsi"/>
-          <w:bCs w:val="false"/>
-          <w:b w:val="false"/>
-          <w:szCs w:val="20"/>
-          <w:sz w:val="20"/>
         </w:rPr>
       </w:pPr>
       <w:bookmarkStart w:id="10" w:name="__RefHeading___Toc544_2124872291"/>
       <w:r>
         <w:rPr>
           <w:rFonts w:cstheme="minorHAnsi"/>
-          <w:b w:val="false"/>
-          <w:bCs w:val="false"/>
           <w:color w:val="000000"/>
-          <w:szCs w:val="20"/>
-          <w:sz w:val="20"/>
         </w:rPr>
         <w:t>Responsabilidade da Filtrovali</w:t>
       </w:r>
       <w:r>
         <w:rPr>
           <w:rFonts w:eastAsia="Arial" w:cstheme="minorHAnsi"/>
-          <w:b w:val="false"/>
-          <w:bCs w:val="false"/>
-          <w:szCs w:val="20"/>
-          <w:sz w:val="20"/>
         </w:rPr>
         <w:t>:</w:t>
       </w:r>
@@ -5191,8 +5117,6 @@
               <w:jc w:val="center"/>
               <w:rPr>
                 <w:rFonts w:eastAsia="Arial" w:cstheme="minorHAnsi"/>
-                <w:bCs w:val="false"/>
-                <w:b w:val="false"/>
                 <w:color w:val="000000"/>
                 <w:sz w:val="20"/>
                 <w:szCs w:val="20"/>
@@ -5277,31 +5201,19 @@
         <w:spacing w:after="120"/>
         <w:rPr>
           <w:rFonts w:cstheme="minorHAnsi"/>
-          <w:bCs w:val="false"/>
-          <w:b w:val="false"/>
-          <w:szCs w:val="20"/>
-          <w:sz w:val="20"/>
         </w:rPr>
       </w:pPr>
       <w:bookmarkStart w:id="11" w:name="__RefHeading___Toc546_2124872291"/>
       <w:r>
         <w:rPr>
           <w:rFonts w:cstheme="minorHAnsi"/>
-          <w:b w:val="false"/>
-          <w:bCs w:val="false"/>
           <w:color w:val="000000"/>
-          <w:szCs w:val="20"/>
-          <w:sz w:val="20"/>
         </w:rPr>
         <w:t>Responsabilidade do Contratante</w:t>
       </w:r>
       <w:r>
         <w:rPr>
           <w:rFonts w:eastAsia="Arial" w:cstheme="minorHAnsi"/>
-          <w:b w:val="false"/>
-          <w:bCs w:val="false"/>
-          <w:szCs w:val="20"/>
-          <w:sz w:val="20"/>
         </w:rPr>
         <w:t>:</w:t>
       </w:r>
@@ -5485,6 +5397,7 @@
                 <w:szCs w:val="20"/>
                 <w:lang w:eastAsia="pt-BR"/>
               </w:rPr>
+              <w:lastRenderedPageBreak/>
               <w:t>{{categoria_contratante}}</w:t>
             </w:r>
           </w:p>
@@ -5517,8 +5430,6 @@
               <w:jc w:val="center"/>
               <w:rPr>
                 <w:rFonts w:eastAsia="Arial" w:cstheme="minorHAnsi"/>
-                <w:bCs w:val="false"/>
-                <w:b w:val="false"/>
                 <w:color w:val="000000"/>
                 <w:sz w:val="20"/>
                 <w:szCs w:val="20"/>
@@ -5604,8 +5515,6 @@
         <w:jc w:val="both"/>
         <w:rPr>
           <w:rFonts w:cstheme="minorHAnsi"/>
-          <w:szCs w:val="20"/>
-          <w:sz w:val="20"/>
         </w:rPr>
       </w:pPr>
       <w:bookmarkStart w:id="13" w:name="_Toc241762339"/>
@@ -5613,8 +5522,6 @@
         <w:rPr>
           <w:rFonts w:eastAsia="Arial" w:cstheme="minorHAnsi"/>
           <w:bCs/>
-          <w:szCs w:val="20"/>
-          <w:sz w:val="20"/>
         </w:rPr>
         <w:t>- Previsão de atendimento:</w:t>
       </w:r>
@@ -5631,38 +5538,22 @@
         <w:jc w:val="both"/>
         <w:rPr>
           <w:rFonts w:cstheme="minorHAnsi"/>
-          <w:bCs w:val="false"/>
-          <w:b w:val="false"/>
-          <w:sz w:val="20"/>
-          <w:szCs w:val="20"/>
-        </w:rPr>
-      </w:pPr>
-      <w:r>
-        <w:rPr>
-          <w:rFonts w:eastAsia="Arial" w:cstheme="minorHAnsi"/>
-          <w:bCs w:val="false"/>
-          <w:b w:val="false"/>
-          <w:sz w:val="20"/>
-          <w:szCs w:val="20"/>
-        </w:rPr>
-        <w:t xml:space="preserve">- </w:t>
-      </w:r>
-      <w:r>
-        <w:rPr>
-          <w:rFonts w:eastAsia="Arial" w:cstheme="minorHAnsi"/>
-          <w:b w:val="false"/>
-          <w:bCs w:val="false"/>
-          <w:sz w:val="20"/>
-          <w:szCs w:val="20"/>
-        </w:rPr>
-        <w:t>{{</w:t>
+          <w:sz w:val="20"/>
+          <w:szCs w:val="20"/>
+        </w:rPr>
+      </w:pPr>
+      <w:r>
+        <w:rPr>
+          <w:rFonts w:eastAsia="Arial" w:cstheme="minorHAnsi"/>
+          <w:sz w:val="20"/>
+          <w:szCs w:val="20"/>
+        </w:rPr>
+        <w:t>- {{</w:t>
       </w:r>
       <w:proofErr w:type="spellStart"/>
       <w:r>
         <w:rPr>
           <w:rFonts w:eastAsia="Arial" w:cstheme="minorHAnsi"/>
-          <w:b w:val="false"/>
-          <w:bCs w:val="false"/>
           <w:sz w:val="20"/>
           <w:szCs w:val="20"/>
         </w:rPr>
@@ -5672,22 +5563,10 @@
       <w:r>
         <w:rPr>
           <w:rFonts w:eastAsia="Arial" w:cstheme="minorHAnsi"/>
-          <w:b w:val="false"/>
-          <w:bCs w:val="false"/>
-          <w:sz w:val="20"/>
-          <w:szCs w:val="20"/>
-        </w:rPr>
-        <w:t xml:space="preserve">}} dias </w:t>
-      </w:r>
-      <w:r>
-        <w:rPr>
-          <w:rFonts w:eastAsia="Arial" w:cstheme="minorHAnsi"/>
-          <w:bCs w:val="false"/>
-          <w:b w:val="false"/>
-          <w:sz w:val="20"/>
-          <w:szCs w:val="20"/>
-        </w:rPr>
-        <w:t>após o recebimento do pedido de compras ou assinatura do contrato.</w:t>
+          <w:sz w:val="20"/>
+          <w:szCs w:val="20"/>
+        </w:rPr>
+        <w:t>}} dias após o recebimento do pedido de compras ou assinatura do contrato.</w:t>
       </w:r>
     </w:p>
     <w:p>
@@ -5701,17 +5580,13 @@
         <w:jc w:val="both"/>
         <w:rPr>
           <w:rFonts w:cstheme="minorHAnsi"/>
-          <w:bCs w:val="false"/>
-          <w:b w:val="false"/>
-          <w:sz w:val="20"/>
-          <w:szCs w:val="20"/>
-        </w:rPr>
-      </w:pPr>
-      <w:r>
-        <w:rPr>
-          <w:rFonts w:eastAsia="Arial" w:cstheme="minorHAnsi"/>
-          <w:bCs w:val="false"/>
-          <w:b w:val="false"/>
+          <w:sz w:val="20"/>
+          <w:szCs w:val="20"/>
+        </w:rPr>
+      </w:pPr>
+      <w:r>
+        <w:rPr>
+          <w:rFonts w:eastAsia="Arial" w:cstheme="minorHAnsi"/>
           <w:sz w:val="20"/>
           <w:szCs w:val="20"/>
         </w:rPr>
@@ -5729,17 +5604,13 @@
         <w:jc w:val="both"/>
         <w:rPr>
           <w:rFonts w:cstheme="minorHAnsi"/>
-          <w:bCs w:val="false"/>
-          <w:b w:val="false"/>
-          <w:sz w:val="20"/>
-          <w:szCs w:val="20"/>
-        </w:rPr>
-      </w:pPr>
-      <w:r>
-        <w:rPr>
-          <w:rFonts w:eastAsia="Arial" w:cstheme="minorHAnsi"/>
-          <w:bCs w:val="false"/>
-          <w:b w:val="false"/>
+          <w:sz w:val="20"/>
+          <w:szCs w:val="20"/>
+        </w:rPr>
+      </w:pPr>
+      <w:r>
+        <w:rPr>
+          <w:rFonts w:eastAsia="Arial" w:cstheme="minorHAnsi"/>
           <w:sz w:val="20"/>
           <w:szCs w:val="20"/>
         </w:rPr>
@@ -5753,8 +5624,6 @@
         <w:jc w:val="both"/>
         <w:rPr>
           <w:rFonts w:cstheme="minorHAnsi"/>
-          <w:szCs w:val="20"/>
-          <w:sz w:val="20"/>
         </w:rPr>
       </w:pPr>
       <w:bookmarkStart w:id="14" w:name="_Toc241762340"/>
@@ -5762,8 +5631,6 @@
         <w:rPr>
           <w:rFonts w:eastAsia="Arial" w:cstheme="minorHAnsi"/>
           <w:bCs/>
-          <w:szCs w:val="20"/>
-          <w:sz w:val="20"/>
         </w:rPr>
         <w:t>- Prazo para execução dos serviços:</w:t>
       </w:r>
@@ -5797,32 +5664,19 @@
         <w:jc w:val="both"/>
         <w:rPr>
           <w:rFonts w:cstheme="minorHAnsi"/>
-          <w:bCs w:val="false"/>
-          <w:b w:val="false"/>
-          <w:szCs w:val="20"/>
-          <w:sz w:val="20"/>
         </w:rPr>
       </w:pPr>
       <w:bookmarkStart w:id="15" w:name="__RefHeading___Toc552_2124872291"/>
       <w:r>
         <w:rPr>
           <w:rFonts w:eastAsia="Arial" w:cstheme="minorHAnsi"/>
-          <w:bCs w:val="false"/>
-          <w:b w:val="false"/>
-          <w:szCs w:val="20"/>
-          <w:sz w:val="20"/>
-        </w:rPr>
-        <w:lastRenderedPageBreak/>
+        </w:rPr>
         <w:t>Prazo previsto de permanência em obra (dias corridos) – {{</w:t>
       </w:r>
       <w:proofErr w:type="spellStart"/>
       <w:r>
         <w:rPr>
           <w:rFonts w:eastAsia="Arial" w:cstheme="minorHAnsi"/>
-          <w:bCs w:val="false"/>
-          <w:b w:val="false"/>
-          <w:szCs w:val="20"/>
-          <w:sz w:val="20"/>
         </w:rPr>
         <w:t>n_dias</w:t>
       </w:r>
@@ -5830,10 +5684,6 @@
       <w:r>
         <w:rPr>
           <w:rFonts w:eastAsia="Arial" w:cstheme="minorHAnsi"/>
-          <w:bCs w:val="false"/>
-          <w:b w:val="false"/>
-          <w:szCs w:val="20"/>
-          <w:sz w:val="20"/>
         </w:rPr>
         <w:t>}} dia(s);</w:t>
       </w:r>
@@ -5846,20 +5696,12 @@
         <w:jc w:val="both"/>
         <w:rPr>
           <w:rFonts w:cstheme="minorHAnsi"/>
-          <w:bCs w:val="false"/>
-          <w:b w:val="false"/>
-          <w:szCs w:val="20"/>
-          <w:sz w:val="20"/>
         </w:rPr>
       </w:pPr>
       <w:bookmarkStart w:id="16" w:name="__RefHeading___Toc554_2124872291"/>
       <w:r>
         <w:rPr>
           <w:rFonts w:eastAsia="Arial" w:cstheme="minorHAnsi"/>
-          <w:bCs w:val="false"/>
-          <w:b w:val="false"/>
-          <w:szCs w:val="20"/>
-          <w:sz w:val="20"/>
         </w:rPr>
         <w:t>Prazo previsto para integração – {{</w:t>
       </w:r>
@@ -5867,10 +5709,6 @@
       <w:r>
         <w:rPr>
           <w:rFonts w:eastAsia="Arial" w:cstheme="minorHAnsi"/>
-          <w:bCs w:val="false"/>
-          <w:b w:val="false"/>
-          <w:szCs w:val="20"/>
-          <w:sz w:val="20"/>
         </w:rPr>
         <w:t>dias_treinamento</w:t>
       </w:r>
@@ -5878,10 +5716,6 @@
       <w:r>
         <w:rPr>
           <w:rFonts w:eastAsia="Arial" w:cstheme="minorHAnsi"/>
-          <w:bCs w:val="false"/>
-          <w:b w:val="false"/>
-          <w:szCs w:val="20"/>
-          <w:sz w:val="20"/>
         </w:rPr>
         <w:t>}} dia(s);</w:t>
       </w:r>
@@ -5894,20 +5728,12 @@
         <w:jc w:val="both"/>
         <w:rPr>
           <w:rFonts w:cstheme="minorHAnsi"/>
-          <w:bCs w:val="false"/>
-          <w:b w:val="false"/>
-          <w:szCs w:val="20"/>
-          <w:sz w:val="20"/>
         </w:rPr>
       </w:pPr>
       <w:bookmarkStart w:id="17" w:name="__RefHeading___Toc556_2124872291"/>
       <w:r>
         <w:rPr>
           <w:rFonts w:eastAsia="Arial" w:cstheme="minorHAnsi"/>
-          <w:bCs w:val="false"/>
-          <w:b w:val="false"/>
-          <w:szCs w:val="20"/>
-          <w:sz w:val="20"/>
         </w:rPr>
         <w:t>Prazo previsto de execução dos serviços (dias trabalhados/uteis) – {{</w:t>
       </w:r>
@@ -5915,10 +5741,6 @@
       <w:r>
         <w:rPr>
           <w:rFonts w:eastAsia="Arial" w:cstheme="minorHAnsi"/>
-          <w:bCs w:val="false"/>
-          <w:b w:val="false"/>
-          <w:szCs w:val="20"/>
-          <w:sz w:val="20"/>
         </w:rPr>
         <w:t>n_dias_trabalhados</w:t>
       </w:r>
@@ -5926,10 +5748,6 @@
       <w:r>
         <w:rPr>
           <w:rFonts w:eastAsia="Arial" w:cstheme="minorHAnsi"/>
-          <w:bCs w:val="false"/>
-          <w:b w:val="false"/>
-          <w:szCs w:val="20"/>
-          <w:sz w:val="20"/>
         </w:rPr>
         <w:t>}} dia(as)</w:t>
       </w:r>
@@ -5942,20 +5760,12 @@
         <w:jc w:val="both"/>
         <w:rPr>
           <w:rFonts w:cstheme="minorHAnsi"/>
-          <w:bCs w:val="false"/>
-          <w:b w:val="false"/>
-          <w:szCs w:val="20"/>
-          <w:sz w:val="20"/>
         </w:rPr>
       </w:pPr>
       <w:bookmarkStart w:id="18" w:name="__RefHeading___Toc558_2124872291"/>
       <w:r>
         <w:rPr>
           <w:rFonts w:eastAsia="Arial" w:cstheme="minorHAnsi"/>
-          <w:bCs w:val="false"/>
-          <w:b w:val="false"/>
-          <w:szCs w:val="20"/>
-          <w:sz w:val="20"/>
         </w:rPr>
         <w:t>Prazo de deslocamento (</w:t>
       </w:r>
@@ -5963,10 +5773,6 @@
       <w:r>
         <w:rPr>
           <w:rFonts w:eastAsia="Arial" w:cstheme="minorHAnsi"/>
-          <w:bCs w:val="false"/>
-          <w:b w:val="false"/>
-          <w:szCs w:val="20"/>
-          <w:sz w:val="20"/>
         </w:rPr>
         <w:t>Mob</w:t>
       </w:r>
@@ -5974,10 +5780,6 @@
       <w:r>
         <w:rPr>
           <w:rFonts w:eastAsia="Arial" w:cstheme="minorHAnsi"/>
-          <w:bCs w:val="false"/>
-          <w:b w:val="false"/>
-          <w:szCs w:val="20"/>
-          <w:sz w:val="20"/>
         </w:rPr>
         <w:t>/</w:t>
       </w:r>
@@ -5985,10 +5787,6 @@
       <w:r>
         <w:rPr>
           <w:rFonts w:eastAsia="Arial" w:cstheme="minorHAnsi"/>
-          <w:bCs w:val="false"/>
-          <w:b w:val="false"/>
-          <w:szCs w:val="20"/>
-          <w:sz w:val="20"/>
         </w:rPr>
         <w:t>desmob</w:t>
       </w:r>
@@ -5996,10 +5794,6 @@
       <w:r>
         <w:rPr>
           <w:rFonts w:eastAsia="Arial" w:cstheme="minorHAnsi"/>
-          <w:bCs w:val="false"/>
-          <w:b w:val="false"/>
-          <w:szCs w:val="20"/>
-          <w:sz w:val="20"/>
         </w:rPr>
         <w:t>) – {{</w:t>
       </w:r>
@@ -6007,10 +5801,6 @@
       <w:r>
         <w:rPr>
           <w:rFonts w:eastAsia="Arial" w:cstheme="minorHAnsi"/>
-          <w:bCs w:val="false"/>
-          <w:b w:val="false"/>
-          <w:szCs w:val="20"/>
-          <w:sz w:val="20"/>
         </w:rPr>
         <w:t>dias_mob</w:t>
       </w:r>
@@ -6018,10 +5808,6 @@
       <w:r>
         <w:rPr>
           <w:rFonts w:eastAsia="Arial" w:cstheme="minorHAnsi"/>
-          <w:bCs w:val="false"/>
-          <w:b w:val="false"/>
-          <w:szCs w:val="20"/>
-          <w:sz w:val="20"/>
         </w:rPr>
         <w:t>}} dia(s).</w:t>
       </w:r>
@@ -6054,8 +5840,6 @@
         <w:jc w:val="both"/>
         <w:rPr>
           <w:rFonts w:cstheme="minorHAnsi"/>
-          <w:szCs w:val="20"/>
-          <w:sz w:val="20"/>
         </w:rPr>
       </w:pPr>
       <w:bookmarkStart w:id="19" w:name="_Toc241762341"/>
@@ -6063,8 +5847,6 @@
         <w:rPr>
           <w:rFonts w:eastAsia="Arial" w:cstheme="minorHAnsi"/>
           <w:bCs/>
-          <w:szCs w:val="20"/>
-          <w:sz w:val="20"/>
         </w:rPr>
         <w:t>- Jornada de trabalho:</w:t>
       </w:r>
@@ -6098,20 +5880,12 @@
         <w:jc w:val="both"/>
         <w:rPr>
           <w:rFonts w:cstheme="minorHAnsi"/>
-          <w:bCs w:val="false"/>
-          <w:b w:val="false"/>
-          <w:szCs w:val="20"/>
-          <w:sz w:val="20"/>
         </w:rPr>
       </w:pPr>
       <w:bookmarkStart w:id="20" w:name="__RefHeading___Toc562_2124872291"/>
       <w:r>
         <w:rPr>
           <w:rFonts w:eastAsia="Arial" w:cstheme="minorHAnsi"/>
-          <w:bCs w:val="false"/>
-          <w:b w:val="false"/>
-          <w:szCs w:val="20"/>
-          <w:sz w:val="20"/>
         </w:rPr>
         <w:t>Turno diurno:</w:t>
       </w:r>
@@ -6128,17 +5902,13 @@
         <w:jc w:val="both"/>
         <w:rPr>
           <w:rFonts w:cstheme="minorHAnsi"/>
-          <w:bCs w:val="false"/>
-          <w:b w:val="false"/>
-          <w:sz w:val="20"/>
-          <w:szCs w:val="20"/>
-        </w:rPr>
-      </w:pPr>
-      <w:r>
-        <w:rPr>
-          <w:rFonts w:eastAsia="Arial" w:cstheme="minorHAnsi"/>
-          <w:bCs w:val="false"/>
-          <w:b w:val="false"/>
+          <w:sz w:val="20"/>
+          <w:szCs w:val="20"/>
+        </w:rPr>
+      </w:pPr>
+      <w:r>
+        <w:rPr>
+          <w:rFonts w:eastAsia="Arial" w:cstheme="minorHAnsi"/>
           <w:sz w:val="20"/>
           <w:szCs w:val="20"/>
         </w:rPr>
@@ -6156,17 +5926,13 @@
         <w:jc w:val="both"/>
         <w:rPr>
           <w:rFonts w:cstheme="minorHAnsi"/>
-          <w:bCs w:val="false"/>
-          <w:b w:val="false"/>
-          <w:sz w:val="20"/>
-          <w:szCs w:val="20"/>
-        </w:rPr>
-      </w:pPr>
-      <w:r>
-        <w:rPr>
-          <w:rFonts w:eastAsia="Arial" w:cstheme="minorHAnsi"/>
-          <w:bCs w:val="false"/>
-          <w:b w:val="false"/>
+          <w:sz w:val="20"/>
+          <w:szCs w:val="20"/>
+        </w:rPr>
+      </w:pPr>
+      <w:r>
+        <w:rPr>
+          <w:rFonts w:eastAsia="Arial" w:cstheme="minorHAnsi"/>
           <w:sz w:val="20"/>
           <w:szCs w:val="20"/>
         </w:rPr>
@@ -6200,8 +5966,6 @@
         <w:jc w:val="both"/>
         <w:rPr>
           <w:rFonts w:cstheme="minorHAnsi"/>
-          <w:szCs w:val="20"/>
-          <w:sz w:val="20"/>
         </w:rPr>
       </w:pPr>
       <w:bookmarkStart w:id="21" w:name="_Toc241762342"/>
@@ -6209,9 +5973,8 @@
         <w:rPr>
           <w:rFonts w:eastAsia="Arial" w:cstheme="minorHAnsi"/>
           <w:bCs/>
-          <w:szCs w:val="20"/>
-          <w:sz w:val="20"/>
-        </w:rPr>
+        </w:rPr>
+        <w:lastRenderedPageBreak/>
         <w:t>- Descrição dos valores:</w:t>
       </w:r>
       <w:bookmarkEnd w:id="21"/>
@@ -6376,8 +6139,6 @@
               <w:jc w:val="both"/>
               <w:rPr>
                 <w:rFonts w:eastAsia="Arial" w:cstheme="minorHAnsi"/>
-                <w:bCs w:val="false"/>
-                <w:b w:val="false"/>
                 <w:sz w:val="20"/>
                 <w:szCs w:val="20"/>
               </w:rPr>
@@ -6554,42 +6315,17 @@
         <w:jc w:val="both"/>
         <w:rPr>
           <w:rFonts w:eastAsia="Arial" w:cstheme="minorHAnsi"/>
-          <w:bCs w:val="false"/>
-          <w:b w:val="false"/>
-          <w:sz w:val="20"/>
-          <w:szCs w:val="20"/>
-        </w:rPr>
-      </w:pPr>
-      <w:r>
-        <w:rPr>
-          <w:rFonts w:eastAsia="Arial" w:cstheme="minorHAnsi"/>
-          <w:bCs w:val="false"/>
-          <w:b w:val="false"/>
-          <w:sz w:val="20"/>
-          <w:szCs w:val="20"/>
-        </w:rPr>
-        <w:lastRenderedPageBreak/>
-        <w:t xml:space="preserve">Para a contratação do serviço de desidratação de óleo sobressalente ou contratar o serviço (extra escopo desta proposta), será cobrado o valor de </w:t>
-      </w:r>
-      <w:r>
-        <w:rPr>
-          <w:rFonts w:eastAsia="Arial" w:cstheme="minorHAnsi"/>
-          <w:b w:val="false"/>
-          <w:bCs w:val="false"/>
-          <w:sz w:val="20"/>
-          <w:szCs w:val="20"/>
-        </w:rPr>
-        <w:t>R$ 4,00</w:t>
-      </w:r>
-      <w:r>
-        <w:rPr>
-          <w:rFonts w:eastAsia="Arial" w:cstheme="minorHAnsi"/>
-          <w:bCs w:val="false"/>
-          <w:b w:val="false"/>
-          <w:sz w:val="20"/>
-          <w:szCs w:val="20"/>
-        </w:rPr>
-        <w:t xml:space="preserve"> por litro de óleo, além dos custos com mobilização e desmobilização do equipamento, caso ele não esteja em campo.</w:t>
+          <w:sz w:val="20"/>
+          <w:szCs w:val="20"/>
+        </w:rPr>
+      </w:pPr>
+      <w:r>
+        <w:rPr>
+          <w:rFonts w:eastAsia="Arial" w:cstheme="minorHAnsi"/>
+          <w:sz w:val="20"/>
+          <w:szCs w:val="20"/>
+        </w:rPr>
+        <w:t>Para a contratação do serviço de desidratação de óleo sobressalente ou contratar o serviço (extra escopo desta proposta), será cobrado o valor de R$ 4,00 por litro de óleo, além dos custos com mobilização e desmobilização do equipamento, caso ele não esteja em campo.</w:t>
       </w:r>
     </w:p>
     <w:p>
@@ -6603,41 +6339,17 @@
         <w:jc w:val="both"/>
         <w:rPr>
           <w:rFonts w:eastAsia="Arial" w:cstheme="minorHAnsi"/>
-          <w:bCs w:val="false"/>
-          <w:b w:val="false"/>
-          <w:sz w:val="20"/>
-          <w:szCs w:val="20"/>
-        </w:rPr>
-      </w:pPr>
-      <w:r>
-        <w:rPr>
-          <w:rFonts w:eastAsia="Arial" w:cstheme="minorHAnsi"/>
-          <w:bCs w:val="false"/>
-          <w:b w:val="false"/>
-          <w:sz w:val="20"/>
-          <w:szCs w:val="20"/>
-        </w:rPr>
-        <w:t xml:space="preserve">Para a contratação do serviço de filtragem de óleo sobressalente ou contratar o serviço (extra escopo desta proposta), será cobrado o valor de </w:t>
-      </w:r>
-      <w:r>
-        <w:rPr>
-          <w:rFonts w:eastAsia="Arial" w:cstheme="minorHAnsi"/>
-          <w:b w:val="false"/>
-          <w:bCs w:val="false"/>
-          <w:sz w:val="20"/>
-          <w:szCs w:val="20"/>
-        </w:rPr>
-        <w:t>R$ 3,00</w:t>
-      </w:r>
-      <w:r>
-        <w:rPr>
-          <w:rFonts w:eastAsia="Arial" w:cstheme="minorHAnsi"/>
-          <w:bCs w:val="false"/>
-          <w:b w:val="false"/>
-          <w:sz w:val="20"/>
-          <w:szCs w:val="20"/>
-        </w:rPr>
-        <w:t xml:space="preserve"> por litro de óleo, além dos custos com mobilização e desmobilização do equipamento, caso ele não esteja em campo.</w:t>
+          <w:sz w:val="20"/>
+          <w:szCs w:val="20"/>
+        </w:rPr>
+      </w:pPr>
+      <w:r>
+        <w:rPr>
+          <w:rFonts w:eastAsia="Arial" w:cstheme="minorHAnsi"/>
+          <w:sz w:val="20"/>
+          <w:szCs w:val="20"/>
+        </w:rPr>
+        <w:t>Para a contratação do serviço de filtragem de óleo sobressalente ou contratar o serviço (extra escopo desta proposta), será cobrado o valor de R$ 3,00 por litro de óleo, além dos custos com mobilização e desmobilização do equipamento, caso ele não esteja em campo.</w:t>
       </w:r>
     </w:p>
     <w:p>
@@ -6647,8 +6359,6 @@
         <w:jc w:val="both"/>
         <w:rPr>
           <w:rFonts w:cstheme="minorHAnsi"/>
-          <w:szCs w:val="20"/>
-          <w:sz w:val="20"/>
         </w:rPr>
       </w:pPr>
       <w:bookmarkStart w:id="22" w:name="_Toc241762343"/>
@@ -6656,8 +6366,6 @@
         <w:rPr>
           <w:rFonts w:eastAsia="Arial" w:cstheme="minorHAnsi"/>
           <w:bCs/>
-          <w:szCs w:val="20"/>
-          <w:sz w:val="20"/>
         </w:rPr>
         <w:t>- Condições de pagamento:</w:t>
       </w:r>
@@ -6674,38 +6382,22 @@
         <w:jc w:val="both"/>
         <w:rPr>
           <w:rFonts w:cstheme="minorHAnsi"/>
-          <w:bCs w:val="false"/>
-          <w:b w:val="false"/>
-          <w:sz w:val="20"/>
-          <w:szCs w:val="20"/>
-        </w:rPr>
-      </w:pPr>
-      <w:r>
-        <w:rPr>
-          <w:rFonts w:eastAsia="Arial" w:cstheme="minorHAnsi"/>
-          <w:bCs w:val="false"/>
-          <w:b w:val="false"/>
-          <w:sz w:val="20"/>
-          <w:szCs w:val="20"/>
-        </w:rPr>
-        <w:t xml:space="preserve">A título de mobilização </w:t>
-      </w:r>
-      <w:r>
-        <w:rPr>
-          <w:rFonts w:eastAsia="Arial" w:cstheme="minorHAnsi"/>
-          <w:b w:val="false"/>
-          <w:bCs w:val="false"/>
-          <w:sz w:val="20"/>
-          <w:szCs w:val="20"/>
-        </w:rPr>
-        <w:t>{{</w:t>
+          <w:sz w:val="20"/>
+          <w:szCs w:val="20"/>
+        </w:rPr>
+      </w:pPr>
+      <w:r>
+        <w:rPr>
+          <w:rFonts w:eastAsia="Arial" w:cstheme="minorHAnsi"/>
+          <w:sz w:val="20"/>
+          <w:szCs w:val="20"/>
+        </w:rPr>
+        <w:t>A título de mobilização {{</w:t>
       </w:r>
       <w:proofErr w:type="spellStart"/>
       <w:r>
         <w:rPr>
           <w:rFonts w:eastAsia="Arial" w:cstheme="minorHAnsi"/>
-          <w:b w:val="false"/>
-          <w:bCs w:val="false"/>
           <w:sz w:val="20"/>
           <w:szCs w:val="20"/>
         </w:rPr>
@@ -6716,8 +6408,6 @@
       <w:r>
         <w:rPr>
           <w:rFonts w:eastAsia="Arial" w:cstheme="minorHAnsi"/>
-          <w:b w:val="false"/>
-          <w:bCs w:val="false"/>
           <w:sz w:val="20"/>
           <w:szCs w:val="20"/>
         </w:rPr>
@@ -6727,8 +6417,6 @@
       <w:r>
         <w:rPr>
           <w:rFonts w:eastAsia="Arial" w:cstheme="minorHAnsi"/>
-          <w:bCs w:val="false"/>
-          <w:b w:val="false"/>
           <w:sz w:val="20"/>
           <w:szCs w:val="20"/>
         </w:rPr>
@@ -6746,38 +6434,22 @@
         <w:jc w:val="both"/>
         <w:rPr>
           <w:rFonts w:cstheme="minorHAnsi"/>
-          <w:bCs w:val="false"/>
-          <w:b w:val="false"/>
-          <w:sz w:val="20"/>
-          <w:szCs w:val="20"/>
-        </w:rPr>
-      </w:pPr>
-      <w:r>
-        <w:rPr>
-          <w:rFonts w:eastAsia="Arial" w:cstheme="minorHAnsi"/>
-          <w:bCs w:val="false"/>
-          <w:b w:val="false"/>
-          <w:sz w:val="20"/>
-          <w:szCs w:val="20"/>
-        </w:rPr>
-        <w:t xml:space="preserve">Medição quinzenal ou após o encerramento dos serviços o que ocorrer primeiro, </w:t>
-      </w:r>
-      <w:r>
-        <w:rPr>
-          <w:rFonts w:eastAsia="Arial" w:cstheme="minorHAnsi"/>
-          <w:b w:val="false"/>
-          <w:bCs w:val="false"/>
-          <w:sz w:val="20"/>
-          <w:szCs w:val="20"/>
-        </w:rPr>
-        <w:t>{{</w:t>
+          <w:sz w:val="20"/>
+          <w:szCs w:val="20"/>
+        </w:rPr>
+      </w:pPr>
+      <w:r>
+        <w:rPr>
+          <w:rFonts w:eastAsia="Arial" w:cstheme="minorHAnsi"/>
+          <w:sz w:val="20"/>
+          <w:szCs w:val="20"/>
+        </w:rPr>
+        <w:t>Medição quinzenal ou após o encerramento dos serviços o que ocorrer primeiro, {{</w:t>
       </w:r>
       <w:proofErr w:type="spellStart"/>
       <w:r>
         <w:rPr>
           <w:rFonts w:eastAsia="Arial" w:cstheme="minorHAnsi"/>
-          <w:b w:val="false"/>
-          <w:bCs w:val="false"/>
           <w:sz w:val="20"/>
           <w:szCs w:val="20"/>
         </w:rPr>
@@ -6787,29 +6459,15 @@
       <w:r>
         <w:rPr>
           <w:rFonts w:eastAsia="Arial" w:cstheme="minorHAnsi"/>
-          <w:b w:val="false"/>
-          <w:bCs w:val="false"/>
-          <w:sz w:val="20"/>
-          <w:szCs w:val="20"/>
-        </w:rPr>
-        <w:t>}}</w:t>
-      </w:r>
-      <w:r>
-        <w:rPr>
-          <w:rFonts w:eastAsia="Arial" w:cstheme="minorHAnsi"/>
-          <w:bCs w:val="false"/>
-          <w:b w:val="false"/>
-          <w:sz w:val="20"/>
-          <w:szCs w:val="20"/>
-        </w:rPr>
-        <w:t xml:space="preserve"> dias para o devido pagamento através de {{</w:t>
+          <w:sz w:val="20"/>
+          <w:szCs w:val="20"/>
+        </w:rPr>
+        <w:t>}} dias para o devido pagamento através de {{</w:t>
       </w:r>
       <w:proofErr w:type="spellStart"/>
       <w:r>
         <w:rPr>
           <w:rFonts w:eastAsia="Arial" w:cstheme="minorHAnsi"/>
-          <w:bCs w:val="false"/>
-          <w:b w:val="false"/>
           <w:sz w:val="20"/>
           <w:szCs w:val="20"/>
         </w:rPr>
@@ -6819,8 +6477,6 @@
       <w:r>
         <w:rPr>
           <w:rFonts w:eastAsia="Arial" w:cstheme="minorHAnsi"/>
-          <w:bCs w:val="false"/>
-          <w:b w:val="false"/>
           <w:sz w:val="20"/>
           <w:szCs w:val="20"/>
         </w:rPr>
@@ -6834,20 +6490,12 @@
         <w:jc w:val="both"/>
         <w:rPr>
           <w:rFonts w:cstheme="minorHAnsi"/>
-          <w:bCs w:val="false"/>
-          <w:b w:val="false"/>
-          <w:szCs w:val="20"/>
-          <w:sz w:val="20"/>
         </w:rPr>
       </w:pPr>
       <w:bookmarkStart w:id="23" w:name="__RefHeading___Toc568_2124872291"/>
       <w:r>
         <w:rPr>
           <w:rFonts w:eastAsia="Arial" w:cstheme="minorHAnsi"/>
-          <w:bCs w:val="false"/>
-          <w:b w:val="false"/>
-          <w:szCs w:val="20"/>
-          <w:sz w:val="20"/>
         </w:rPr>
         <w:t>Multa e juros por atraso:</w:t>
       </w:r>
@@ -6948,8 +6596,6 @@
         <w:jc w:val="both"/>
         <w:rPr>
           <w:rFonts w:cstheme="minorHAnsi"/>
-          <w:szCs w:val="20"/>
-          <w:sz w:val="20"/>
         </w:rPr>
       </w:pPr>
       <w:bookmarkStart w:id="24" w:name="_Toc241762344"/>
@@ -6957,8 +6603,6 @@
         <w:rPr>
           <w:rFonts w:eastAsia="Arial" w:cstheme="minorHAnsi"/>
           <w:bCs/>
-          <w:szCs w:val="20"/>
-          <w:sz w:val="20"/>
         </w:rPr>
         <w:lastRenderedPageBreak/>
         <w:t>- Observações:</w:t>
@@ -6976,38 +6620,22 @@
         <w:jc w:val="both"/>
         <w:rPr>
           <w:rFonts w:cstheme="minorHAnsi"/>
-          <w:bCs w:val="false"/>
-          <w:b w:val="false"/>
-          <w:sz w:val="20"/>
-          <w:szCs w:val="20"/>
-        </w:rPr>
-      </w:pPr>
-      <w:r>
-        <w:rPr>
-          <w:rFonts w:eastAsia="Arial" w:cstheme="minorHAnsi"/>
-          <w:bCs w:val="false"/>
-          <w:b w:val="false"/>
-          <w:sz w:val="20"/>
-          <w:szCs w:val="20"/>
-        </w:rPr>
-        <w:t xml:space="preserve">Os trabalhos em horas extras (sábados, domingos e feriados) poderão ser executados, desde que registrado em RDO no campo Horas Extras, acordados previamente. Valor homem/hora para atividades fora do horário previsto é de </w:t>
-      </w:r>
-      <w:r>
-        <w:rPr>
-          <w:rFonts w:eastAsia="Arial" w:cstheme="minorHAnsi"/>
-          <w:b w:val="false"/>
-          <w:bCs w:val="false"/>
-          <w:sz w:val="20"/>
-          <w:szCs w:val="20"/>
-        </w:rPr>
-        <w:t>{{</w:t>
+          <w:sz w:val="20"/>
+          <w:szCs w:val="20"/>
+        </w:rPr>
+      </w:pPr>
+      <w:r>
+        <w:rPr>
+          <w:rFonts w:eastAsia="Arial" w:cstheme="minorHAnsi"/>
+          <w:sz w:val="20"/>
+          <w:szCs w:val="20"/>
+        </w:rPr>
+        <w:t>Os trabalhos em horas extras (sábados, domingos e feriados) poderão ser executados, desde que registrado em RDO no campo Horas Extras, acordados previamente. Valor homem/hora para atividades fora do horário previsto é de {{</w:t>
       </w:r>
       <w:proofErr w:type="spellStart"/>
       <w:r>
         <w:rPr>
           <w:rFonts w:eastAsia="Arial" w:cstheme="minorHAnsi"/>
-          <w:b w:val="false"/>
-          <w:bCs w:val="false"/>
           <w:sz w:val="20"/>
           <w:szCs w:val="20"/>
         </w:rPr>
@@ -7017,8 +6645,6 @@
       <w:r>
         <w:rPr>
           <w:rFonts w:eastAsia="Arial" w:cstheme="minorHAnsi"/>
-          <w:b w:val="false"/>
-          <w:bCs w:val="false"/>
           <w:sz w:val="20"/>
           <w:szCs w:val="20"/>
         </w:rPr>
@@ -7032,20 +6658,12 @@
         <w:jc w:val="both"/>
         <w:rPr>
           <w:rFonts w:cstheme="minorHAnsi"/>
-          <w:bCs w:val="false"/>
-          <w:b w:val="false"/>
-          <w:szCs w:val="20"/>
-          <w:sz w:val="20"/>
         </w:rPr>
       </w:pPr>
       <w:bookmarkStart w:id="25" w:name="__RefHeading___Toc572_2124872291"/>
       <w:r>
         <w:rPr>
           <w:rFonts w:eastAsia="Arial" w:cstheme="minorHAnsi"/>
-          <w:bCs w:val="false"/>
-          <w:b w:val="false"/>
-          <w:szCs w:val="20"/>
-          <w:sz w:val="20"/>
         </w:rPr>
         <w:t xml:space="preserve">Condições de Stand </w:t>
       </w:r>
@@ -7053,10 +6671,6 @@
       <w:r>
         <w:rPr>
           <w:rFonts w:eastAsia="Arial" w:cstheme="minorHAnsi"/>
-          <w:bCs w:val="false"/>
-          <w:b w:val="false"/>
-          <w:szCs w:val="20"/>
-          <w:sz w:val="20"/>
         </w:rPr>
         <w:t>by</w:t>
       </w:r>
@@ -7064,10 +6678,6 @@
       <w:r>
         <w:rPr>
           <w:rFonts w:eastAsia="Arial" w:cstheme="minorHAnsi"/>
-          <w:bCs w:val="false"/>
-          <w:b w:val="false"/>
-          <w:szCs w:val="20"/>
-          <w:sz w:val="20"/>
         </w:rPr>
         <w:t xml:space="preserve"> e Mobilização Adicional:</w:t>
       </w:r>
@@ -7304,20 +6914,12 @@
         <w:jc w:val="both"/>
         <w:rPr>
           <w:rFonts w:cstheme="minorHAnsi"/>
-          <w:bCs w:val="false"/>
-          <w:b w:val="false"/>
-          <w:szCs w:val="20"/>
-          <w:sz w:val="20"/>
         </w:rPr>
       </w:pPr>
       <w:bookmarkStart w:id="26" w:name="__RefHeading___Toc574_2124872291"/>
       <w:r>
         <w:rPr>
           <w:rFonts w:cstheme="minorHAnsi"/>
-          <w:b w:val="false"/>
-          <w:bCs w:val="false"/>
-          <w:szCs w:val="20"/>
-          <w:sz w:val="20"/>
         </w:rPr>
         <w:t>Stand-by de Equipe:</w:t>
       </w:r>
@@ -7326,12 +6928,10 @@
     <w:p>
       <w:pPr>
         <w:spacing w:after="120" w:line="360" w:lineRule="auto"/>
-        <w:ind w:left="2136" w:right="0" w:firstLine="0"/>
+        <w:ind w:left="2136"/>
         <w:jc w:val="both"/>
         <w:rPr>
           <w:rFonts w:cstheme="minorHAnsi"/>
-          <w:b w:val="false"/>
-          <w:bCs w:val="false"/>
           <w:sz w:val="20"/>
           <w:szCs w:val="20"/>
         </w:rPr>
@@ -7339,8 +6939,6 @@
       <w:r>
         <w:rPr>
           <w:rFonts w:cstheme="minorHAnsi"/>
-          <w:b w:val="false"/>
-          <w:bCs w:val="false"/>
           <w:sz w:val="20"/>
           <w:szCs w:val="20"/>
         </w:rPr>
@@ -7349,14 +6947,11 @@
     </w:p>
     <w:p>
       <w:pPr>
-        <w:pStyle w:val="Normal"/>
         <w:spacing w:after="120" w:line="360" w:lineRule="auto"/>
-        <w:ind w:left="2136" w:right="0" w:firstLine="0"/>
+        <w:ind w:left="2136"/>
         <w:jc w:val="both"/>
         <w:rPr>
           <w:rFonts w:cstheme="minorHAnsi"/>
-          <w:b w:val="false"/>
-          <w:bCs w:val="false"/>
           <w:sz w:val="20"/>
           <w:szCs w:val="20"/>
         </w:rPr>
@@ -7364,8 +6959,6 @@
       <w:r>
         <w:rPr>
           <w:rFonts w:cstheme="minorHAnsi"/>
-          <w:b w:val="false"/>
-          <w:bCs w:val="false"/>
           <w:sz w:val="20"/>
           <w:szCs w:val="20"/>
         </w:rPr>
@@ -7379,20 +6972,12 @@
         <w:jc w:val="both"/>
         <w:rPr>
           <w:rFonts w:cstheme="minorHAnsi"/>
-          <w:bCs w:val="false"/>
-          <w:b w:val="false"/>
-          <w:szCs w:val="20"/>
-          <w:sz w:val="20"/>
         </w:rPr>
       </w:pPr>
       <w:bookmarkStart w:id="27" w:name="__RefHeading___Toc576_2124872291"/>
       <w:r>
         <w:rPr>
           <w:rFonts w:cstheme="minorHAnsi"/>
-          <w:b w:val="false"/>
-          <w:bCs w:val="false"/>
-          <w:szCs w:val="20"/>
-          <w:sz w:val="20"/>
         </w:rPr>
         <w:t>Stand-by de Equipamentos:</w:t>
       </w:r>
@@ -7401,12 +6986,10 @@
     <w:p>
       <w:pPr>
         <w:spacing w:after="120" w:line="360" w:lineRule="auto"/>
-        <w:ind w:left="2136" w:right="0" w:firstLine="0"/>
+        <w:ind w:left="2136"/>
         <w:jc w:val="both"/>
         <w:rPr>
           <w:rFonts w:cstheme="minorHAnsi"/>
-          <w:b w:val="false"/>
-          <w:bCs w:val="false"/>
           <w:sz w:val="20"/>
           <w:szCs w:val="20"/>
         </w:rPr>
@@ -7414,8 +6997,6 @@
       <w:r>
         <w:rPr>
           <w:rFonts w:cstheme="minorHAnsi"/>
-          <w:b w:val="false"/>
-          <w:bCs w:val="false"/>
           <w:sz w:val="20"/>
           <w:szCs w:val="20"/>
         </w:rPr>
@@ -7424,14 +7005,11 @@
     </w:p>
     <w:p>
       <w:pPr>
-        <w:pStyle w:val="Normal"/>
         <w:spacing w:after="120" w:line="360" w:lineRule="auto"/>
-        <w:ind w:left="2136" w:right="0" w:firstLine="0"/>
+        <w:ind w:left="2136"/>
         <w:jc w:val="both"/>
         <w:rPr>
           <w:rFonts w:cstheme="minorHAnsi"/>
-          <w:b w:val="false"/>
-          <w:bCs w:val="false"/>
           <w:sz w:val="20"/>
           <w:szCs w:val="20"/>
         </w:rPr>
@@ -7439,8 +7017,6 @@
       <w:r>
         <w:rPr>
           <w:rFonts w:cstheme="minorHAnsi"/>
-          <w:b w:val="false"/>
-          <w:bCs w:val="false"/>
           <w:sz w:val="20"/>
           <w:szCs w:val="20"/>
         </w:rPr>
@@ -7454,22 +7030,13 @@
         <w:jc w:val="both"/>
         <w:rPr>
           <w:rFonts w:cstheme="minorHAnsi"/>
-          <w:bCs w:val="false"/>
-          <w:b w:val="false"/>
-          <w:szCs w:val="20"/>
-          <w:sz w:val="20"/>
         </w:rPr>
       </w:pPr>
       <w:bookmarkStart w:id="28" w:name="__RefHeading___Toc578_2124872291"/>
       <w:r>
         <w:rPr>
           <w:rFonts w:cstheme="minorHAnsi"/>
-          <w:b w:val="false"/>
-          <w:bCs w:val="false"/>
-          <w:szCs w:val="20"/>
-          <w:sz w:val="20"/>
-        </w:rPr>
-        <w:lastRenderedPageBreak/>
+        </w:rPr>
         <w:t>Desmobilização e Remobilização:</w:t>
       </w:r>
       <w:bookmarkEnd w:id="28"/>
@@ -7477,12 +7044,10 @@
     <w:p>
       <w:pPr>
         <w:spacing w:after="120" w:line="360" w:lineRule="auto"/>
-        <w:ind w:left="2136" w:right="0" w:firstLine="0"/>
+        <w:ind w:left="2136"/>
         <w:jc w:val="both"/>
         <w:rPr>
           <w:rFonts w:cstheme="minorHAnsi"/>
-          <w:b w:val="false"/>
-          <w:bCs w:val="false"/>
           <w:sz w:val="20"/>
           <w:szCs w:val="20"/>
         </w:rPr>
@@ -7490,8 +7055,6 @@
       <w:r>
         <w:rPr>
           <w:rFonts w:cstheme="minorHAnsi"/>
-          <w:b w:val="false"/>
-          <w:bCs w:val="false"/>
           <w:sz w:val="20"/>
           <w:szCs w:val="20"/>
         </w:rPr>
@@ -7500,23 +7063,18 @@
     </w:p>
     <w:p>
       <w:pPr>
-        <w:pStyle w:val="Normal"/>
         <w:spacing w:after="120" w:line="360" w:lineRule="auto"/>
-        <w:ind w:left="2136" w:right="0" w:firstLine="0"/>
+        <w:ind w:left="2136"/>
         <w:jc w:val="both"/>
         <w:rPr>
           <w:rFonts w:eastAsia="Arial" w:cstheme="minorHAnsi"/>
-          <w:b w:val="false"/>
-          <w:bCs w:val="false"/>
-          <w:sz w:val="20"/>
-          <w:szCs w:val="20"/>
-        </w:rPr>
-      </w:pPr>
-      <w:r>
-        <w:rPr>
-          <w:rFonts w:eastAsia="Arial" w:cstheme="minorHAnsi"/>
-          <w:b w:val="false"/>
-          <w:bCs w:val="false"/>
+          <w:sz w:val="20"/>
+          <w:szCs w:val="20"/>
+        </w:rPr>
+      </w:pPr>
+      <w:r>
+        <w:rPr>
+          <w:rFonts w:eastAsia="Arial" w:cstheme="minorHAnsi"/>
           <w:sz w:val="20"/>
           <w:szCs w:val="20"/>
         </w:rPr>
@@ -7534,28 +7092,23 @@
         <w:jc w:val="both"/>
         <w:rPr>
           <w:rFonts w:cstheme="minorHAnsi"/>
-          <w:bCs w:val="false"/>
-          <w:b w:val="false"/>
-          <w:sz w:val="20"/>
-          <w:szCs w:val="20"/>
-        </w:rPr>
-      </w:pPr>
-      <w:r>
-        <w:rPr>
-          <w:rFonts w:eastAsia="Arial" w:cstheme="minorHAnsi"/>
-          <w:bCs w:val="false"/>
-          <w:b w:val="false"/>
-          <w:sz w:val="20"/>
-          <w:szCs w:val="20"/>
-        </w:rPr>
+          <w:sz w:val="20"/>
+          <w:szCs w:val="20"/>
+        </w:rPr>
+      </w:pPr>
+      <w:r>
+        <w:rPr>
+          <w:rFonts w:eastAsia="Arial" w:cstheme="minorHAnsi"/>
+          <w:sz w:val="20"/>
+          <w:szCs w:val="20"/>
+        </w:rPr>
+        <w:lastRenderedPageBreak/>
         <w:t xml:space="preserve">No caso de prorrogação da data de início dos trabalhos já confirmada pela Contratante, por motivos não imputáveis a Filtrovali, será considerado uma diária no valor de R$ 4.500,00 por dia corrido prorrogado a título de stand </w:t>
       </w:r>
       <w:proofErr w:type="spellStart"/>
       <w:r>
         <w:rPr>
           <w:rFonts w:eastAsia="Arial" w:cstheme="minorHAnsi"/>
-          <w:bCs w:val="false"/>
-          <w:b w:val="false"/>
           <w:sz w:val="20"/>
           <w:szCs w:val="20"/>
         </w:rPr>
@@ -7565,8 +7118,6 @@
       <w:r>
         <w:rPr>
           <w:rFonts w:eastAsia="Arial" w:cstheme="minorHAnsi"/>
-          <w:bCs w:val="false"/>
-          <w:b w:val="false"/>
           <w:sz w:val="20"/>
           <w:szCs w:val="20"/>
         </w:rPr>
@@ -7584,17 +7135,13 @@
         <w:jc w:val="both"/>
         <w:rPr>
           <w:rFonts w:cstheme="minorHAnsi"/>
-          <w:bCs w:val="false"/>
-          <w:b w:val="false"/>
-          <w:sz w:val="20"/>
-          <w:szCs w:val="20"/>
-        </w:rPr>
-      </w:pPr>
-      <w:r>
-        <w:rPr>
-          <w:rFonts w:eastAsia="Arial" w:cstheme="minorHAnsi"/>
-          <w:bCs w:val="false"/>
-          <w:b w:val="false"/>
+          <w:sz w:val="20"/>
+          <w:szCs w:val="20"/>
+        </w:rPr>
+      </w:pPr>
+      <w:r>
+        <w:rPr>
+          <w:rFonts w:eastAsia="Arial" w:cstheme="minorHAnsi"/>
           <w:sz w:val="20"/>
           <w:szCs w:val="20"/>
         </w:rPr>
@@ -7612,17 +7159,13 @@
         <w:jc w:val="both"/>
         <w:rPr>
           <w:rFonts w:cstheme="minorHAnsi"/>
-          <w:bCs w:val="false"/>
-          <w:b w:val="false"/>
-          <w:sz w:val="20"/>
-          <w:szCs w:val="20"/>
-        </w:rPr>
-      </w:pPr>
-      <w:r>
-        <w:rPr>
-          <w:rFonts w:eastAsia="Arial" w:cstheme="minorHAnsi"/>
-          <w:bCs w:val="false"/>
-          <w:b w:val="false"/>
+          <w:sz w:val="20"/>
+          <w:szCs w:val="20"/>
+        </w:rPr>
+      </w:pPr>
+      <w:r>
+        <w:rPr>
+          <w:rFonts w:eastAsia="Arial" w:cstheme="minorHAnsi"/>
           <w:sz w:val="20"/>
           <w:szCs w:val="20"/>
         </w:rPr>
@@ -7640,17 +7183,13 @@
         <w:jc w:val="both"/>
         <w:rPr>
           <w:rFonts w:cstheme="minorHAnsi"/>
-          <w:bCs w:val="false"/>
-          <w:b w:val="false"/>
-          <w:sz w:val="20"/>
-          <w:szCs w:val="20"/>
-        </w:rPr>
-      </w:pPr>
-      <w:r>
-        <w:rPr>
-          <w:rFonts w:eastAsia="Arial" w:cstheme="minorHAnsi"/>
-          <w:bCs w:val="false"/>
-          <w:b w:val="false"/>
+          <w:sz w:val="20"/>
+          <w:szCs w:val="20"/>
+        </w:rPr>
+      </w:pPr>
+      <w:r>
+        <w:rPr>
+          <w:rFonts w:eastAsia="Arial" w:cstheme="minorHAnsi"/>
           <w:sz w:val="20"/>
           <w:szCs w:val="20"/>
         </w:rPr>
@@ -7660,8 +7199,6 @@
       <w:r>
         <w:rPr>
           <w:rFonts w:eastAsia="Arial" w:cstheme="minorHAnsi"/>
-          <w:bCs w:val="false"/>
-          <w:b w:val="false"/>
           <w:sz w:val="20"/>
           <w:szCs w:val="20"/>
         </w:rPr>
@@ -7671,8 +7208,6 @@
       <w:r>
         <w:rPr>
           <w:rFonts w:eastAsia="Arial" w:cstheme="minorHAnsi"/>
-          <w:bCs w:val="false"/>
-          <w:b w:val="false"/>
           <w:sz w:val="20"/>
           <w:szCs w:val="20"/>
         </w:rPr>
@@ -7690,17 +7225,13 @@
         <w:jc w:val="both"/>
         <w:rPr>
           <w:rFonts w:cstheme="minorHAnsi"/>
-          <w:bCs w:val="false"/>
-          <w:b w:val="false"/>
-          <w:sz w:val="20"/>
-          <w:szCs w:val="20"/>
-        </w:rPr>
-      </w:pPr>
-      <w:r>
-        <w:rPr>
-          <w:rFonts w:eastAsia="Arial" w:cstheme="minorHAnsi"/>
-          <w:bCs w:val="false"/>
-          <w:b w:val="false"/>
+          <w:sz w:val="20"/>
+          <w:szCs w:val="20"/>
+        </w:rPr>
+      </w:pPr>
+      <w:r>
+        <w:rPr>
+          <w:rFonts w:eastAsia="Arial" w:cstheme="minorHAnsi"/>
           <w:sz w:val="20"/>
           <w:szCs w:val="20"/>
         </w:rPr>
@@ -7718,8 +7249,6 @@
         <w:jc w:val="both"/>
         <w:rPr>
           <w:rFonts w:cstheme="minorHAnsi"/>
-          <w:bCs w:val="false"/>
-          <w:b w:val="false"/>
           <w:sz w:val="20"/>
           <w:szCs w:val="20"/>
         </w:rPr>
@@ -7727,8 +7256,6 @@
       <w:r>
         <w:rPr>
           <w:rFonts w:cstheme="minorHAnsi"/>
-          <w:bCs w:val="false"/>
-          <w:b w:val="false"/>
           <w:sz w:val="20"/>
           <w:szCs w:val="20"/>
         </w:rPr>
@@ -7746,8 +7273,6 @@
         <w:jc w:val="both"/>
         <w:rPr>
           <w:rFonts w:cstheme="minorHAnsi"/>
-          <w:bCs w:val="false"/>
-          <w:b w:val="false"/>
           <w:sz w:val="20"/>
           <w:szCs w:val="20"/>
         </w:rPr>
@@ -7755,8 +7280,6 @@
       <w:r>
         <w:rPr>
           <w:rFonts w:cstheme="minorHAnsi"/>
-          <w:bCs w:val="false"/>
-          <w:b w:val="false"/>
           <w:sz w:val="20"/>
           <w:szCs w:val="20"/>
         </w:rPr>
@@ -7771,8 +7294,6 @@
         <w:rPr>
           <w:rFonts w:eastAsia="Arial" w:cstheme="minorHAnsi"/>
           <w:bCs/>
-          <w:szCs w:val="20"/>
-          <w:sz w:val="20"/>
         </w:rPr>
       </w:pPr>
       <w:bookmarkStart w:id="29" w:name="_Toc241762345"/>
@@ -7780,18 +7301,13 @@
         <w:rPr>
           <w:rFonts w:eastAsia="Arial" w:cstheme="minorHAnsi"/>
           <w:bCs/>
-          <w:szCs w:val="20"/>
-          <w:sz w:val="20"/>
-        </w:rPr>
-        <w:lastRenderedPageBreak/>
+        </w:rPr>
         <w:t>- Impostos:</w:t>
       </w:r>
       <w:bookmarkEnd w:id="29"/>
       <w:r>
         <w:rPr>
           <w:rFonts w:cstheme="minorHAnsi"/>
-          <w:szCs w:val="20"/>
-          <w:sz w:val="20"/>
         </w:rPr>
         <w:t xml:space="preserve"> </w:t>
       </w:r>
@@ -7807,17 +7323,13 @@
         <w:jc w:val="both"/>
         <w:rPr>
           <w:rFonts w:eastAsia="Arial" w:cstheme="minorHAnsi"/>
-          <w:b w:val="false"/>
-          <w:bCs w:val="false"/>
-          <w:sz w:val="20"/>
-          <w:szCs w:val="20"/>
-        </w:rPr>
-      </w:pPr>
-      <w:r>
-        <w:rPr>
-          <w:rFonts w:eastAsia="Arial" w:cstheme="minorHAnsi"/>
-          <w:bCs w:val="false"/>
-          <w:b w:val="false"/>
+          <w:sz w:val="20"/>
+          <w:szCs w:val="20"/>
+        </w:rPr>
+      </w:pPr>
+      <w:r>
+        <w:rPr>
+          <w:rFonts w:eastAsia="Arial" w:cstheme="minorHAnsi"/>
           <w:sz w:val="20"/>
           <w:szCs w:val="20"/>
         </w:rPr>
@@ -7835,17 +7347,13 @@
         <w:jc w:val="both"/>
         <w:rPr>
           <w:rFonts w:eastAsia="Arial" w:cstheme="minorHAnsi"/>
-          <w:b w:val="false"/>
-          <w:bCs w:val="false"/>
-          <w:sz w:val="20"/>
-          <w:szCs w:val="20"/>
-        </w:rPr>
-      </w:pPr>
-      <w:r>
-        <w:rPr>
-          <w:rFonts w:eastAsia="Arial" w:cstheme="minorHAnsi"/>
-          <w:bCs w:val="false"/>
-          <w:b w:val="false"/>
+          <w:sz w:val="20"/>
+          <w:szCs w:val="20"/>
+        </w:rPr>
+      </w:pPr>
+      <w:r>
+        <w:rPr>
+          <w:rFonts w:eastAsia="Arial" w:cstheme="minorHAnsi"/>
           <w:sz w:val="20"/>
           <w:szCs w:val="20"/>
         </w:rPr>
@@ -7919,20 +7427,12 @@
         <w:jc w:val="both"/>
         <w:rPr>
           <w:rFonts w:eastAsia="Arial" w:cstheme="minorHAnsi"/>
-          <w:b w:val="false"/>
-          <w:bCs w:val="false"/>
-          <w:szCs w:val="20"/>
-          <w:sz w:val="20"/>
         </w:rPr>
       </w:pPr>
       <w:bookmarkStart w:id="30" w:name="__RefHeading___Toc582_2124872291"/>
       <w:r>
         <w:rPr>
           <w:rFonts w:eastAsia="Arial" w:cstheme="minorHAnsi"/>
-          <w:bCs w:val="false"/>
-          <w:b w:val="false"/>
-          <w:szCs w:val="20"/>
-          <w:sz w:val="20"/>
         </w:rPr>
         <w:t>Reequilíbrio Tributário</w:t>
       </w:r>
@@ -7975,6 +7475,7 @@
           <w:sz w:val="20"/>
           <w:szCs w:val="20"/>
         </w:rPr>
+        <w:lastRenderedPageBreak/>
         <w:t>O eventual acréscimo de custos decorrente de tais alterações será repassado à CONTRATANTE, mediante comprovação do impacto financeiro e apresentação da respectiva atualização de valores.</w:t>
       </w:r>
     </w:p>
@@ -7985,8 +7486,6 @@
         <w:jc w:val="both"/>
         <w:rPr>
           <w:rFonts w:cstheme="minorHAnsi"/>
-          <w:szCs w:val="20"/>
-          <w:sz w:val="20"/>
         </w:rPr>
       </w:pPr>
       <w:bookmarkStart w:id="31" w:name="_Toc241762346"/>
@@ -7994,8 +7493,6 @@
         <w:rPr>
           <w:rFonts w:eastAsia="Arial" w:cstheme="minorHAnsi"/>
           <w:bCs/>
-          <w:szCs w:val="20"/>
-          <w:sz w:val="20"/>
         </w:rPr>
         <w:t>- Validade da proposta:</w:t>
       </w:r>
@@ -8012,17 +7509,13 @@
         <w:jc w:val="both"/>
         <w:rPr>
           <w:rFonts w:cstheme="minorHAnsi"/>
-          <w:bCs w:val="false"/>
-          <w:b w:val="false"/>
-          <w:sz w:val="20"/>
-          <w:szCs w:val="20"/>
-        </w:rPr>
-      </w:pPr>
-      <w:r>
-        <w:rPr>
-          <w:rFonts w:eastAsia="Arial" w:cstheme="minorHAnsi"/>
-          <w:bCs w:val="false"/>
-          <w:b w:val="false"/>
+          <w:sz w:val="20"/>
+          <w:szCs w:val="20"/>
+        </w:rPr>
+      </w:pPr>
+      <w:r>
+        <w:rPr>
+          <w:rFonts w:eastAsia="Arial" w:cstheme="minorHAnsi"/>
           <w:sz w:val="20"/>
           <w:szCs w:val="20"/>
         </w:rPr>
@@ -8032,8 +7525,6 @@
       <w:r>
         <w:rPr>
           <w:rFonts w:eastAsia="Arial" w:cstheme="minorHAnsi"/>
-          <w:bCs w:val="false"/>
-          <w:b w:val="false"/>
           <w:sz w:val="20"/>
           <w:szCs w:val="20"/>
         </w:rPr>
@@ -8043,8 +7534,6 @@
       <w:r>
         <w:rPr>
           <w:rFonts w:eastAsia="Arial" w:cstheme="minorHAnsi"/>
-          <w:bCs w:val="false"/>
-          <w:b w:val="false"/>
           <w:sz w:val="20"/>
           <w:szCs w:val="20"/>
         </w:rPr>
@@ -8053,8 +7542,6 @@
       <w:r>
         <w:rPr>
           <w:rFonts w:cstheme="minorHAnsi"/>
-          <w:bCs w:val="false"/>
-          <w:b w:val="false"/>
           <w:sz w:val="20"/>
           <w:szCs w:val="20"/>
         </w:rPr>
@@ -8069,8 +7556,6 @@
         <w:rPr>
           <w:rFonts w:eastAsia="Arial" w:cstheme="minorHAnsi"/>
           <w:bCs/>
-          <w:szCs w:val="20"/>
-          <w:sz w:val="20"/>
         </w:rPr>
       </w:pPr>
       <w:bookmarkStart w:id="32" w:name="_Toc241762347"/>
@@ -8078,8 +7563,6 @@
         <w:rPr>
           <w:rFonts w:eastAsia="Arial" w:cstheme="minorHAnsi"/>
           <w:bCs/>
-          <w:szCs w:val="20"/>
-          <w:sz w:val="20"/>
         </w:rPr>
         <w:t>- Proteção à propriedade intelectual e know-how:</w:t>
       </w:r>
@@ -8096,32 +7579,17 @@
         <w:jc w:val="both"/>
         <w:rPr>
           <w:rFonts w:eastAsia="Arial" w:cstheme="minorHAnsi"/>
-          <w:b w:val="false"/>
-          <w:bCs w:val="false"/>
-          <w:sz w:val="20"/>
-          <w:szCs w:val="20"/>
-        </w:rPr>
-      </w:pPr>
-      <w:r>
-        <w:rPr>
-          <w:rFonts w:eastAsia="Arial" w:cstheme="minorHAnsi"/>
-          <w:bCs w:val="false"/>
-          <w:b w:val="false"/>
-          <w:sz w:val="20"/>
-          <w:szCs w:val="20"/>
-        </w:rPr>
-        <w:t xml:space="preserve">Todos os métodos, processos, procedimentos operacionais, técnicas, especificações, relatórios, documentos, estudos, desenhos, fluxogramas, parâmetros operacionais e </w:t>
-      </w:r>
-      <w:r>
-        <w:rPr>
-          <w:rFonts w:eastAsia="Arial" w:cstheme="minorHAnsi"/>
-          <w:bCs w:val="false"/>
-          <w:b w:val="false"/>
-          <w:sz w:val="20"/>
-          <w:szCs w:val="20"/>
-        </w:rPr>
-        <w:lastRenderedPageBreak/>
-        <w:t>quaisquer outras informações técnicas ou comerciais utilizadas ou desenvolvidas pela FILTROVALI para a execução dos serviços constituem propriedade intelectual exclusiva da Filtrovali, sendo protegidos pela legislação vigente aplicável.</w:t>
+          <w:sz w:val="20"/>
+          <w:szCs w:val="20"/>
+        </w:rPr>
+      </w:pPr>
+      <w:r>
+        <w:rPr>
+          <w:rFonts w:eastAsia="Arial" w:cstheme="minorHAnsi"/>
+          <w:sz w:val="20"/>
+          <w:szCs w:val="20"/>
+        </w:rPr>
+        <w:t>Todos os métodos, processos, procedimentos operacionais, técnicas, especificações, relatórios, documentos, estudos, desenhos, fluxogramas, parâmetros operacionais e quaisquer outras informações técnicas ou comerciais utilizadas ou desenvolvidas pela FILTROVALI para a execução dos serviços constituem propriedade intelectual exclusiva da Filtrovali, sendo protegidos pela legislação vigente aplicável.</w:t>
       </w:r>
     </w:p>
     <w:p>
@@ -8135,17 +7603,13 @@
         <w:jc w:val="both"/>
         <w:rPr>
           <w:rFonts w:eastAsia="Arial" w:cstheme="minorHAnsi"/>
-          <w:b w:val="false"/>
-          <w:bCs w:val="false"/>
-          <w:sz w:val="20"/>
-          <w:szCs w:val="20"/>
-        </w:rPr>
-      </w:pPr>
-      <w:r>
-        <w:rPr>
-          <w:rFonts w:eastAsia="Arial" w:cstheme="minorHAnsi"/>
-          <w:bCs w:val="false"/>
-          <w:b w:val="false"/>
+          <w:sz w:val="20"/>
+          <w:szCs w:val="20"/>
+        </w:rPr>
+      </w:pPr>
+      <w:r>
+        <w:rPr>
+          <w:rFonts w:eastAsia="Arial" w:cstheme="minorHAnsi"/>
           <w:sz w:val="20"/>
           <w:szCs w:val="20"/>
         </w:rPr>
@@ -8163,17 +7627,13 @@
         <w:jc w:val="both"/>
         <w:rPr>
           <w:rFonts w:eastAsia="Arial" w:cstheme="minorHAnsi"/>
-          <w:b w:val="false"/>
-          <w:bCs w:val="false"/>
-          <w:sz w:val="20"/>
-          <w:szCs w:val="20"/>
-        </w:rPr>
-      </w:pPr>
-      <w:r>
-        <w:rPr>
-          <w:rFonts w:eastAsia="Arial" w:cstheme="minorHAnsi"/>
-          <w:bCs w:val="false"/>
-          <w:b w:val="false"/>
+          <w:sz w:val="20"/>
+          <w:szCs w:val="20"/>
+        </w:rPr>
+      </w:pPr>
+      <w:r>
+        <w:rPr>
+          <w:rFonts w:eastAsia="Arial" w:cstheme="minorHAnsi"/>
           <w:sz w:val="20"/>
           <w:szCs w:val="20"/>
         </w:rPr>
@@ -8191,17 +7651,13 @@
         <w:jc w:val="both"/>
         <w:rPr>
           <w:rFonts w:eastAsia="Arial" w:cstheme="minorHAnsi"/>
-          <w:b w:val="false"/>
-          <w:bCs w:val="false"/>
-          <w:sz w:val="20"/>
-          <w:szCs w:val="20"/>
-        </w:rPr>
-      </w:pPr>
-      <w:r>
-        <w:rPr>
-          <w:rFonts w:eastAsia="Arial" w:cstheme="minorHAnsi"/>
-          <w:bCs w:val="false"/>
-          <w:b w:val="false"/>
+          <w:sz w:val="20"/>
+          <w:szCs w:val="20"/>
+        </w:rPr>
+      </w:pPr>
+      <w:r>
+        <w:rPr>
+          <w:rFonts w:eastAsia="Arial" w:cstheme="minorHAnsi"/>
           <w:sz w:val="20"/>
           <w:szCs w:val="20"/>
         </w:rPr>
@@ -8219,17 +7675,13 @@
         <w:jc w:val="both"/>
         <w:rPr>
           <w:rFonts w:eastAsia="Arial" w:cstheme="minorHAnsi"/>
-          <w:b w:val="false"/>
-          <w:bCs w:val="false"/>
-          <w:sz w:val="20"/>
-          <w:szCs w:val="20"/>
-        </w:rPr>
-      </w:pPr>
-      <w:r>
-        <w:rPr>
-          <w:rFonts w:eastAsia="Arial" w:cstheme="minorHAnsi"/>
-          <w:bCs w:val="false"/>
-          <w:b w:val="false"/>
+          <w:sz w:val="20"/>
+          <w:szCs w:val="20"/>
+        </w:rPr>
+      </w:pPr>
+      <w:r>
+        <w:rPr>
+          <w:rFonts w:eastAsia="Arial" w:cstheme="minorHAnsi"/>
           <w:sz w:val="20"/>
           <w:szCs w:val="20"/>
         </w:rPr>
@@ -8247,17 +7699,13 @@
         <w:jc w:val="both"/>
         <w:rPr>
           <w:rFonts w:eastAsia="Arial" w:cstheme="minorHAnsi"/>
-          <w:b w:val="false"/>
-          <w:bCs w:val="false"/>
-          <w:sz w:val="20"/>
-          <w:szCs w:val="20"/>
-        </w:rPr>
-      </w:pPr>
-      <w:r>
-        <w:rPr>
-          <w:rFonts w:eastAsia="Arial" w:cstheme="minorHAnsi"/>
-          <w:bCs w:val="false"/>
-          <w:b w:val="false"/>
+          <w:sz w:val="20"/>
+          <w:szCs w:val="20"/>
+        </w:rPr>
+      </w:pPr>
+      <w:r>
+        <w:rPr>
+          <w:rFonts w:eastAsia="Arial" w:cstheme="minorHAnsi"/>
           <w:sz w:val="20"/>
           <w:szCs w:val="20"/>
         </w:rPr>
@@ -8293,8 +7741,6 @@
         <w:rPr>
           <w:rFonts w:cstheme="minorHAnsi"/>
           <w:bCs/>
-          <w:szCs w:val="20"/>
-          <w:sz w:val="20"/>
         </w:rPr>
       </w:pPr>
       <w:bookmarkStart w:id="33" w:name="_Toc241762348"/>
@@ -8302,8 +7748,6 @@
         <w:rPr>
           <w:rFonts w:eastAsia="Arial" w:cstheme="minorHAnsi"/>
           <w:bCs/>
-          <w:szCs w:val="20"/>
-          <w:sz w:val="20"/>
         </w:rPr>
         <w:t>- Aceite e assinatura da proposta:</w:t>
       </w:r>
@@ -8483,51 +7927,23 @@
         <w:pPr>
           <w:pStyle w:val="Rodap"/>
           <w:jc w:val="right"/>
-          <w:rPr>
-            <w:sz w:val="20"/>
-            <w:szCs w:val="20"/>
-          </w:rPr>
         </w:pPr>
         <w:r>
-          <w:rPr>
-            <w:sz w:val="20"/>
-            <w:szCs w:val="20"/>
-          </w:rPr>
           <w:t xml:space="preserve">  </w:t>
         </w:r>
         <w:r>
-          <w:rPr>
-            <w:sz w:val="20"/>
-            <w:szCs w:val="20"/>
-          </w:rPr>
           <w:fldChar w:fldCharType="begin"/>
         </w:r>
         <w:r>
-          <w:rPr>
-            <w:sz w:val="20"/>
-            <w:szCs w:val="20"/>
-          </w:rPr>
           <w:instrText xml:space="preserve"> PAGE </w:instrText>
         </w:r>
         <w:r>
-          <w:rPr>
-            <w:sz w:val="20"/>
-            <w:szCs w:val="20"/>
-          </w:rPr>
           <w:fldChar w:fldCharType="separate"/>
         </w:r>
         <w:r>
-          <w:rPr>
-            <w:sz w:val="20"/>
-            <w:szCs w:val="20"/>
-          </w:rPr>
           <w:t>9</w:t>
         </w:r>
         <w:r>
-          <w:rPr>
-            <w:sz w:val="20"/>
-            <w:szCs w:val="20"/>
-          </w:rPr>
           <w:fldChar w:fldCharType="end"/>
         </w:r>
       </w:p>
@@ -8545,8 +7961,6 @@
       <w:rPr>
         <w:b/>
         <w:bCs/>
-        <w:sz w:val="20"/>
-        <w:szCs w:val="20"/>
       </w:rPr>
     </w:pPr>
   </w:p>
@@ -8569,51 +7983,23 @@
         <w:pPr>
           <w:pStyle w:val="Rodap"/>
           <w:jc w:val="right"/>
-          <w:rPr>
-            <w:sz w:val="20"/>
-            <w:szCs w:val="20"/>
-          </w:rPr>
         </w:pPr>
         <w:r>
-          <w:rPr>
-            <w:sz w:val="20"/>
-            <w:szCs w:val="20"/>
-          </w:rPr>
           <w:t xml:space="preserve">  </w:t>
         </w:r>
         <w:r>
-          <w:rPr>
-            <w:sz w:val="20"/>
-            <w:szCs w:val="20"/>
-          </w:rPr>
           <w:fldChar w:fldCharType="begin"/>
         </w:r>
         <w:r>
-          <w:rPr>
-            <w:sz w:val="20"/>
-            <w:szCs w:val="20"/>
-          </w:rPr>
           <w:instrText xml:space="preserve"> PAGE </w:instrText>
         </w:r>
         <w:r>
-          <w:rPr>
-            <w:sz w:val="20"/>
-            <w:szCs w:val="20"/>
-          </w:rPr>
           <w:fldChar w:fldCharType="separate"/>
         </w:r>
         <w:r>
-          <w:rPr>
-            <w:sz w:val="20"/>
-            <w:szCs w:val="20"/>
-          </w:rPr>
           <w:t>9</w:t>
         </w:r>
         <w:r>
-          <w:rPr>
-            <w:sz w:val="20"/>
-            <w:szCs w:val="20"/>
-          </w:rPr>
           <w:fldChar w:fldCharType="end"/>
         </w:r>
       </w:p>
@@ -8631,8 +8017,6 @@
       <w:rPr>
         <w:b/>
         <w:bCs/>
-        <w:sz w:val="20"/>
-        <w:szCs w:val="20"/>
       </w:rPr>
     </w:pPr>
   </w:p>
@@ -8880,8 +8264,8 @@
         <w:ind w:left="720" w:hanging="360"/>
       </w:pPr>
       <w:rPr>
-        <w:bCs w:val="true"/>
-        <w:b w:val="true"/>
+        <w:b/>
+        <w:bCs/>
         <w:sz w:val="20"/>
         <w:szCs w:val="20"/>
       </w:rPr>
@@ -8930,8 +8314,8 @@
         <w:ind w:left="2880" w:hanging="360"/>
       </w:pPr>
       <w:rPr>
-        <w:bCs w:val="true"/>
-        <w:b w:val="true"/>
+        <w:b/>
+        <w:bCs/>
         <w:sz w:val="20"/>
         <w:szCs w:val="20"/>
       </w:rPr>
@@ -8980,8 +8364,8 @@
         <w:ind w:left="5040" w:hanging="360"/>
       </w:pPr>
       <w:rPr>
-        <w:bCs w:val="true"/>
-        <w:b w:val="true"/>
+        <w:b/>
+        <w:bCs/>
         <w:sz w:val="20"/>
         <w:szCs w:val="20"/>
       </w:rPr>
@@ -9032,8 +8416,8 @@
         <w:ind w:left="720" w:hanging="360"/>
       </w:pPr>
       <w:rPr>
-        <w:bCs w:val="true"/>
-        <w:b w:val="true"/>
+        <w:b/>
+        <w:bCs/>
         <w:sz w:val="20"/>
         <w:szCs w:val="20"/>
       </w:rPr>
@@ -9073,8 +8457,8 @@
         <w:ind w:left="2880" w:hanging="360"/>
       </w:pPr>
       <w:rPr>
-        <w:bCs w:val="true"/>
-        <w:b w:val="true"/>
+        <w:b/>
+        <w:bCs/>
         <w:sz w:val="20"/>
         <w:szCs w:val="20"/>
       </w:rPr>
@@ -9114,8 +8498,8 @@
         <w:ind w:left="5040" w:hanging="360"/>
       </w:pPr>
       <w:rPr>
-        <w:bCs w:val="true"/>
-        <w:b w:val="true"/>
+        <w:b/>
+        <w:bCs/>
         <w:sz w:val="20"/>
         <w:szCs w:val="20"/>
       </w:rPr>
@@ -9164,8 +8548,8 @@
         <w:ind w:left="360" w:hanging="360"/>
       </w:pPr>
       <w:rPr>
-        <w:b w:val="true"/>
-        <w:bCs w:val="true"/>
+        <w:b/>
+        <w:bCs/>
         <w:sz w:val="20"/>
         <w:szCs w:val="20"/>
       </w:rPr>
@@ -9183,8 +8567,8 @@
         <w:ind w:left="1068" w:hanging="360"/>
       </w:pPr>
       <w:rPr>
-        <w:b w:val="true"/>
-        <w:bCs w:val="true"/>
+        <w:b/>
+        <w:bCs/>
         <w:sz w:val="20"/>
         <w:szCs w:val="20"/>
       </w:rPr>
@@ -9202,8 +8586,8 @@
         <w:ind w:left="2136" w:hanging="720"/>
       </w:pPr>
       <w:rPr>
-        <w:bCs w:val="true"/>
-        <w:b w:val="true"/>
+        <w:b/>
+        <w:bCs/>
         <w:sz w:val="20"/>
         <w:szCs w:val="20"/>
       </w:rPr>
@@ -9220,8 +8604,8 @@
         <w:ind w:left="2844" w:hanging="720"/>
       </w:pPr>
       <w:rPr>
-        <w:bCs w:val="true"/>
-        <w:b w:val="true"/>
+        <w:b/>
+        <w:bCs/>
         <w:sz w:val="20"/>
         <w:szCs w:val="20"/>
       </w:rPr>
@@ -9238,8 +8622,8 @@
         <w:ind w:left="3912" w:hanging="1080"/>
       </w:pPr>
       <w:rPr>
-        <w:bCs w:val="true"/>
-        <w:b w:val="true"/>
+        <w:b/>
+        <w:bCs/>
         <w:sz w:val="20"/>
         <w:szCs w:val="20"/>
       </w:rPr>
@@ -9256,8 +8640,8 @@
         <w:ind w:left="4620" w:hanging="1080"/>
       </w:pPr>
       <w:rPr>
-        <w:bCs w:val="true"/>
-        <w:b w:val="true"/>
+        <w:b/>
+        <w:bCs/>
         <w:sz w:val="20"/>
         <w:szCs w:val="20"/>
       </w:rPr>
@@ -9274,8 +8658,8 @@
         <w:ind w:left="5688" w:hanging="1440"/>
       </w:pPr>
       <w:rPr>
-        <w:bCs w:val="true"/>
-        <w:b w:val="true"/>
+        <w:b/>
+        <w:bCs/>
         <w:sz w:val="20"/>
         <w:szCs w:val="20"/>
       </w:rPr>
@@ -9292,8 +8676,8 @@
         <w:ind w:left="6396" w:hanging="1440"/>
       </w:pPr>
       <w:rPr>
-        <w:bCs w:val="true"/>
-        <w:b w:val="true"/>
+        <w:b/>
+        <w:bCs/>
         <w:sz w:val="20"/>
         <w:szCs w:val="20"/>
       </w:rPr>
@@ -9310,8 +8694,8 @@
         <w:ind w:left="7464" w:hanging="1800"/>
       </w:pPr>
       <w:rPr>
-        <w:bCs w:val="true"/>
-        <w:b w:val="true"/>
+        <w:b/>
+        <w:bCs/>
         <w:sz w:val="20"/>
         <w:szCs w:val="20"/>
       </w:rPr>
@@ -9333,8 +8717,8 @@
         <w:ind w:left="720" w:hanging="360"/>
       </w:pPr>
       <w:rPr>
-        <w:bCs w:val="true"/>
-        <w:b w:val="true"/>
+        <w:b/>
+        <w:bCs/>
         <w:sz w:val="20"/>
         <w:szCs w:val="20"/>
       </w:rPr>
@@ -9383,8 +8767,8 @@
         <w:ind w:left="2880" w:hanging="360"/>
       </w:pPr>
       <w:rPr>
-        <w:bCs w:val="true"/>
-        <w:b w:val="true"/>
+        <w:b/>
+        <w:bCs/>
         <w:sz w:val="20"/>
         <w:szCs w:val="20"/>
       </w:rPr>
@@ -9433,8 +8817,8 @@
         <w:ind w:left="5040" w:hanging="360"/>
       </w:pPr>
       <w:rPr>
-        <w:bCs w:val="true"/>
-        <w:b w:val="true"/>
+        <w:b/>
+        <w:bCs/>
         <w:sz w:val="20"/>
         <w:szCs w:val="20"/>
       </w:rPr>
@@ -9488,8 +8872,8 @@
         <w:ind w:left="720" w:hanging="360"/>
       </w:pPr>
       <w:rPr>
-        <w:bCs w:val="true"/>
-        <w:b w:val="true"/>
+        <w:b/>
+        <w:bCs/>
         <w:sz w:val="20"/>
         <w:szCs w:val="20"/>
       </w:rPr>
@@ -9538,8 +8922,8 @@
         <w:ind w:left="2880" w:hanging="360"/>
       </w:pPr>
       <w:rPr>
-        <w:bCs w:val="true"/>
-        <w:b w:val="true"/>
+        <w:b/>
+        <w:bCs/>
         <w:sz w:val="20"/>
         <w:szCs w:val="20"/>
       </w:rPr>
@@ -9588,8 +8972,8 @@
         <w:ind w:left="5040" w:hanging="360"/>
       </w:pPr>
       <w:rPr>
-        <w:bCs w:val="true"/>
-        <w:b w:val="true"/>
+        <w:b/>
+        <w:bCs/>
         <w:sz w:val="20"/>
         <w:szCs w:val="20"/>
       </w:rPr>
@@ -9641,8 +9025,8 @@
       </w:pPr>
       <w:rPr>
         <w:rFonts w:hint="default"/>
-        <w:bCs w:val="true"/>
-        <w:b w:val="true"/>
+        <w:b/>
+        <w:bCs/>
         <w:sz w:val="20"/>
         <w:szCs w:val="20"/>
       </w:rPr>
@@ -9682,8 +9066,8 @@
         <w:ind w:left="2880" w:hanging="360"/>
       </w:pPr>
       <w:rPr>
-        <w:bCs w:val="true"/>
-        <w:b w:val="true"/>
+        <w:b/>
+        <w:bCs/>
         <w:sz w:val="20"/>
         <w:szCs w:val="20"/>
       </w:rPr>
@@ -9723,8 +9107,8 @@
         <w:ind w:left="5040" w:hanging="360"/>
       </w:pPr>
       <w:rPr>
-        <w:bCs w:val="true"/>
-        <w:b w:val="true"/>
+        <w:b/>
+        <w:bCs/>
         <w:sz w:val="20"/>
         <w:szCs w:val="20"/>
       </w:rPr>
@@ -9820,8 +9204,8 @@
         <w:ind w:left="3588" w:hanging="360"/>
       </w:pPr>
       <w:rPr>
-        <w:bCs w:val="true"/>
-        <w:b w:val="true"/>
+        <w:b/>
+        <w:bCs/>
         <w:sz w:val="20"/>
         <w:szCs w:val="20"/>
       </w:rPr>
@@ -9870,8 +9254,8 @@
         <w:ind w:left="5748" w:hanging="360"/>
       </w:pPr>
       <w:rPr>
-        <w:bCs w:val="true"/>
-        <w:b w:val="true"/>
+        <w:b/>
+        <w:bCs/>
         <w:sz w:val="20"/>
         <w:szCs w:val="20"/>
       </w:rPr>
@@ -9925,8 +9309,8 @@
         <w:ind w:left="720" w:hanging="360"/>
       </w:pPr>
       <w:rPr>
-        <w:bCs w:val="true"/>
-        <w:b w:val="true"/>
+        <w:b/>
+        <w:bCs/>
         <w:sz w:val="20"/>
         <w:szCs w:val="20"/>
       </w:rPr>
@@ -9975,8 +9359,8 @@
         <w:ind w:left="2880" w:hanging="360"/>
       </w:pPr>
       <w:rPr>
-        <w:bCs w:val="true"/>
-        <w:b w:val="true"/>
+        <w:b/>
+        <w:bCs/>
         <w:sz w:val="20"/>
         <w:szCs w:val="20"/>
       </w:rPr>
@@ -10025,8 +9409,8 @@
         <w:ind w:left="5040" w:hanging="360"/>
       </w:pPr>
       <w:rPr>
-        <w:bCs w:val="true"/>
-        <w:b w:val="true"/>
+        <w:b/>
+        <w:bCs/>
         <w:sz w:val="20"/>
         <w:szCs w:val="20"/>
       </w:rPr>
@@ -10080,8 +9464,8 @@
         <w:ind w:left="720" w:hanging="360"/>
       </w:pPr>
       <w:rPr>
-        <w:bCs w:val="true"/>
-        <w:b w:val="true"/>
+        <w:b/>
+        <w:bCs/>
         <w:sz w:val="20"/>
         <w:szCs w:val="20"/>
       </w:rPr>
@@ -10099,8 +9483,8 @@
         <w:ind w:left="1068" w:hanging="360"/>
       </w:pPr>
       <w:rPr>
-        <w:bCs w:val="true"/>
-        <w:b w:val="true"/>
+        <w:b/>
+        <w:bCs/>
         <w:sz w:val="20"/>
         <w:szCs w:val="20"/>
       </w:rPr>
@@ -10118,8 +9502,8 @@
         <w:ind w:left="1776" w:hanging="720"/>
       </w:pPr>
       <w:rPr>
-        <w:bCs w:val="true"/>
-        <w:b w:val="true"/>
+        <w:b/>
+        <w:bCs/>
         <w:sz w:val="20"/>
         <w:szCs w:val="20"/>
       </w:rPr>
@@ -10137,8 +9521,8 @@
         <w:ind w:left="2124" w:hanging="720"/>
       </w:pPr>
       <w:rPr>
-        <w:bCs w:val="true"/>
-        <w:b w:val="true"/>
+        <w:b/>
+        <w:bCs/>
         <w:sz w:val="20"/>
         <w:szCs w:val="20"/>
       </w:rPr>
@@ -10156,8 +9540,8 @@
         <w:ind w:left="2832" w:hanging="1080"/>
       </w:pPr>
       <w:rPr>
-        <w:bCs w:val="true"/>
-        <w:b w:val="true"/>
+        <w:b/>
+        <w:bCs/>
         <w:sz w:val="20"/>
         <w:szCs w:val="20"/>
       </w:rPr>
@@ -10175,8 +9559,8 @@
         <w:ind w:left="3180" w:hanging="1080"/>
       </w:pPr>
       <w:rPr>
-        <w:bCs w:val="true"/>
-        <w:b w:val="true"/>
+        <w:b/>
+        <w:bCs/>
         <w:sz w:val="20"/>
         <w:szCs w:val="20"/>
       </w:rPr>
@@ -10194,8 +9578,8 @@
         <w:ind w:left="3888" w:hanging="1440"/>
       </w:pPr>
       <w:rPr>
-        <w:bCs w:val="true"/>
-        <w:b w:val="true"/>
+        <w:b/>
+        <w:bCs/>
         <w:sz w:val="20"/>
         <w:szCs w:val="20"/>
       </w:rPr>
@@ -10213,8 +9597,8 @@
         <w:ind w:left="4236" w:hanging="1440"/>
       </w:pPr>
       <w:rPr>
-        <w:bCs w:val="true"/>
-        <w:b w:val="true"/>
+        <w:b/>
+        <w:bCs/>
         <w:sz w:val="20"/>
         <w:szCs w:val="20"/>
       </w:rPr>
@@ -10232,8 +9616,8 @@
         <w:ind w:left="4944" w:hanging="1800"/>
       </w:pPr>
       <w:rPr>
-        <w:bCs w:val="true"/>
-        <w:b w:val="true"/>
+        <w:b/>
+        <w:bCs/>
         <w:sz w:val="20"/>
         <w:szCs w:val="20"/>
       </w:rPr>
@@ -11040,8 +10424,6 @@
     </w:pPr>
     <w:rPr>
       <w:rFonts w:ascii="Arial" w:hAnsi="Arial" w:cs="Arial"/>
-      <w:bCs w:val="0"/>
-      <w:b w:val="0"/>
       <w:color w:val="000000" w:themeColor="text1"/>
       <w:sz w:val="20"/>
       <w:szCs w:val="20"/>
@@ -11067,8 +10449,6 @@
     </w:pPr>
     <w:rPr>
       <w:rFonts w:ascii="Arial" w:hAnsi="Arial" w:cs="Arial"/>
-      <w:bCs w:val="0"/>
-      <w:b w:val="0"/>
       <w:color w:val="000000" w:themeColor="text1"/>
       <w:sz w:val="20"/>
       <w:szCs w:val="20"/>
@@ -11341,8 +10721,8 @@
     <w:rsid w:val="00E3098F"/>
     <w:rPr>
       <w:rFonts w:asciiTheme="majorHAnsi" w:eastAsiaTheme="majorEastAsia" w:hAnsiTheme="majorHAnsi" w:cstheme="majorBidi"/>
+      <w:b w:val="0"/>
       <w:bCs w:val="0"/>
-      <w:b w:val="0"/>
       <w:color w:val="000000" w:themeColor="text1"/>
       <w:sz w:val="20"/>
       <w:szCs w:val="20"/>
@@ -11672,15 +11052,6 @@
 </file>
 
 <file path=customXml/item1.xml><?xml version="1.0" encoding="utf-8"?>
-<?mso-contentType ?>
-<FormTemplates xmlns="http://schemas.microsoft.com/sharepoint/v3/contenttype/forms">
-  <Display>DocumentLibraryForm</Display>
-  <Edit>DocumentLibraryForm</Edit>
-  <New>DocumentLibraryForm</New>
-</FormTemplates>
-</file>
-
-<file path=customXml/item2.xml><?xml version="1.0" encoding="utf-8"?>
 <p:properties xmlns:p="http://schemas.microsoft.com/office/2006/metadata/properties" xmlns:xsi="http://www.w3.org/2001/XMLSchema-instance" xmlns:pc="http://schemas.microsoft.com/office/infopath/2007/PartnerControls">
   <documentManagement>
     <lcf76f155ced4ddcb4097134ff3c332f xmlns="5ebac46c-3801-4f50-8d40-ff19a3d08a31">
@@ -11692,11 +11063,16 @@
 </p:properties>
 </file>
 
-<file path=customXml/item3.xml><?xml version="1.0" encoding="utf-8"?>
-<b:Sources xmlns:b="http://schemas.openxmlformats.org/officeDocument/2006/bibliography" xmlns="http://schemas.openxmlformats.org/officeDocument/2006/bibliography" SelectedStyle="\APASixthEditionOfficeOnline.xsl" StyleName="APA" Version="6"/>
+<file path=customXml/item2.xml><?xml version="1.0" encoding="utf-8"?>
+<?mso-contentType ?>
+<FormTemplates xmlns="http://schemas.microsoft.com/sharepoint/v3/contenttype/forms">
+  <Display>DocumentLibraryForm</Display>
+  <Edit>DocumentLibraryForm</Edit>
+  <New>DocumentLibraryForm</New>
+</FormTemplates>
 </file>
 
-<file path=customXml/item4.xml><?xml version="1.0" encoding="utf-8"?>
+<file path=customXml/item3.xml><?xml version="1.0" encoding="utf-8"?>
 <ct:contentTypeSchema xmlns:ct="http://schemas.microsoft.com/office/2006/metadata/contentType" xmlns:ma="http://schemas.microsoft.com/office/2006/metadata/properties/metaAttributes" ct:_="" ma:_="" ma:contentTypeName="Documento" ma:contentTypeID="0x01010050D375E88928F94091E6FD7AA4E06D15" ma:contentTypeVersion="13" ma:contentTypeDescription="Crie um novo documento." ma:contentTypeScope="" ma:versionID="7df79d7f540b57f8739ecf349a4839bc">
   <xsd:schema xmlns:xsd="http://www.w3.org/2001/XMLSchema" xmlns:xs="http://www.w3.org/2001/XMLSchema" xmlns:p="http://schemas.microsoft.com/office/2006/metadata/properties" xmlns:ns2="5ebac46c-3801-4f50-8d40-ff19a3d08a31" xmlns:ns3="04f7cffc-3ea8-4655-aac6-2c812ca3e62f" targetNamespace="http://schemas.microsoft.com/office/2006/metadata/properties" ma:root="true" ma:fieldsID="096b32e32a0a7c12d0d47f4c83d7cab2" ns2:_="" ns3:_="">
     <xsd:import namespace="5ebac46c-3801-4f50-8d40-ff19a3d08a31"/>
@@ -11905,15 +11281,11 @@
 </ct:contentTypeSchema>
 </file>
 
-<file path=customXml/itemProps1.xml><?xml version="1.0" encoding="utf-8"?>
-<ds:datastoreItem xmlns:ds="http://schemas.openxmlformats.org/officeDocument/2006/customXml" ds:itemID="{34A391BE-20F1-46BC-8252-C95237E583C0}">
-  <ds:schemaRefs>
-    <ds:schemaRef ds:uri="http://schemas.microsoft.com/sharepoint/v3/contenttype/forms"/>
-  </ds:schemaRefs>
-</ds:datastoreItem>
+<file path=customXml/item4.xml><?xml version="1.0" encoding="utf-8"?>
+<b:Sources xmlns:b="http://schemas.openxmlformats.org/officeDocument/2006/bibliography" xmlns="http://schemas.openxmlformats.org/officeDocument/2006/bibliography" SelectedStyle="\APASixthEditionOfficeOnline.xsl" StyleName="APA" Version="6"/>
 </file>
 
-<file path=customXml/itemProps2.xml><?xml version="1.0" encoding="utf-8"?>
+<file path=customXml/itemProps1.xml><?xml version="1.0" encoding="utf-8"?>
 <ds:datastoreItem xmlns:ds="http://schemas.openxmlformats.org/officeDocument/2006/customXml" ds:itemID="{FA899CDF-3A9C-426B-93AD-3CCFF23C4A5E}">
   <ds:schemaRefs>
     <ds:schemaRef ds:uri="http://schemas.microsoft.com/office/2006/metadata/properties"/>
@@ -11924,15 +11296,15 @@
 </ds:datastoreItem>
 </file>
 
-<file path=customXml/itemProps3.xml><?xml version="1.0" encoding="utf-8"?>
-<ds:datastoreItem xmlns:ds="http://schemas.openxmlformats.org/officeDocument/2006/customXml" ds:itemID="{AB0B6225-2C28-4B59-AC07-D3905D9EBCC2}">
+<file path=customXml/itemProps2.xml><?xml version="1.0" encoding="utf-8"?>
+<ds:datastoreItem xmlns:ds="http://schemas.openxmlformats.org/officeDocument/2006/customXml" ds:itemID="{34A391BE-20F1-46BC-8252-C95237E583C0}">
   <ds:schemaRefs>
-    <ds:schemaRef ds:uri="http://schemas.openxmlformats.org/officeDocument/2006/bibliography"/>
+    <ds:schemaRef ds:uri="http://schemas.microsoft.com/sharepoint/v3/contenttype/forms"/>
   </ds:schemaRefs>
 </ds:datastoreItem>
 </file>
 
-<file path=customXml/itemProps4.xml><?xml version="1.0" encoding="utf-8"?>
+<file path=customXml/itemProps3.xml><?xml version="1.0" encoding="utf-8"?>
 <ds:datastoreItem xmlns:ds="http://schemas.openxmlformats.org/officeDocument/2006/customXml" ds:itemID="{71D38CE4-905C-4C05-8C70-49A1BD3E3A17}">
   <ds:schemaRefs>
     <ds:schemaRef ds:uri="http://schemas.microsoft.com/office/2006/metadata/contentType"/>
@@ -11949,4 +11321,12 @@
     <ds:schemaRef ds:uri="http://schemas.microsoft.com/internal/obd"/>
   </ds:schemaRefs>
 </ds:datastoreItem>
+</file>
+
+<file path=customXml/itemProps4.xml><?xml version="1.0" encoding="utf-8"?>
+<ds:datastoreItem xmlns:ds="http://schemas.openxmlformats.org/officeDocument/2006/customXml" ds:itemID="{AB0B6225-2C28-4B59-AC07-D3905D9EBCC2}">
+  <ds:schemaRefs>
+    <ds:schemaRef ds:uri="http://schemas.openxmlformats.org/officeDocument/2006/bibliography"/>
+  </ds:schemaRefs>
+</ds:datastoreItem>
 </file>
</xml_diff>

<commit_message>
fix: permitir selecionar consultor nas propostas
</commit_message>
<xml_diff>
--- a/backend/models/comercial/Proposta Comercial.docx
+++ b/backend/models/comercial/Proposta Comercial.docx
@@ -826,6 +826,49 @@
     </w:p>
     <w:p>
       <w:pPr>
+        <w:autoSpaceDE w:val="0"/>
+        <w:autoSpaceDN w:val="0"/>
+        <w:adjustRightInd w:val="0"/>
+        <w:spacing w:after="0" w:line="240" w:lineRule="auto"/>
+        <w:rPr>
+          <w:rFonts w:ascii="Arial" w:hAnsi="Arial" w:cs="Arial"/>
+          <w:bCs/>
+          <w:sz w:val="24"/>
+          <w:szCs w:val="24"/>
+        </w:rPr>
+      </w:pPr>
+      <w:r>
+        <w:rPr>
+          <w:rFonts w:ascii="Arial" w:hAnsi="Arial" w:cs="Arial"/>
+          <w:b/>
+          <w:sz w:val="24"/>
+          <w:szCs w:val="24"/>
+        </w:rPr>
+        <w:t>Consultor de Vendas:</w:t>
+      </w:r>
+      <w:r>
+        <w:rPr>
+          <w:rFonts w:ascii="Arial" w:hAnsi="Arial" w:cs="Arial"/>
+          <w:b/>
+          <w:bCs/>
+          <w:sz w:val="24"/>
+          <w:szCs w:val="24"/>
+        </w:rPr>
+        <w:t xml:space="preserve"> </w:t>
+      </w:r>
+      <w:r>
+        <w:rPr>
+          <w:rFonts w:ascii="Arial" w:hAnsi="Arial" w:cs="Arial"/>
+          <w:b/>
+          <w:bCs/>
+          <w:sz w:val="24"/>
+          <w:szCs w:val="24"/>
+        </w:rPr>
+        <w:t>{{consultor}}</w:t>
+      </w:r>
+    </w:p>
+    <w:p>
+      <w:pPr>
         <w:spacing w:after="0" w:line="240" w:lineRule="auto"/>
         <w:rPr>
           <w:rFonts w:ascii="Arial" w:hAnsi="Arial" w:cs="Arial"/>
@@ -2850,6 +2893,7 @@
               <w:sz w:val="24"/>
               <w:szCs w:val="24"/>
             </w:rPr>
+            <w:lastRenderedPageBreak/>
             <w:fldChar w:fldCharType="end"/>
           </w:r>
         </w:p>
@@ -11052,6 +11096,15 @@
 </file>
 
 <file path=customXml/item1.xml><?xml version="1.0" encoding="utf-8"?>
+<?mso-contentType ?>
+<FormTemplates xmlns="http://schemas.microsoft.com/sharepoint/v3/contenttype/forms">
+  <Display>DocumentLibraryForm</Display>
+  <Edit>DocumentLibraryForm</Edit>
+  <New>DocumentLibraryForm</New>
+</FormTemplates>
+</file>
+
+<file path=customXml/item2.xml><?xml version="1.0" encoding="utf-8"?>
 <p:properties xmlns:p="http://schemas.microsoft.com/office/2006/metadata/properties" xmlns:xsi="http://www.w3.org/2001/XMLSchema-instance" xmlns:pc="http://schemas.microsoft.com/office/infopath/2007/PartnerControls">
   <documentManagement>
     <lcf76f155ced4ddcb4097134ff3c332f xmlns="5ebac46c-3801-4f50-8d40-ff19a3d08a31">
@@ -11063,16 +11116,11 @@
 </p:properties>
 </file>
 
-<file path=customXml/item2.xml><?xml version="1.0" encoding="utf-8"?>
-<?mso-contentType ?>
-<FormTemplates xmlns="http://schemas.microsoft.com/sharepoint/v3/contenttype/forms">
-  <Display>DocumentLibraryForm</Display>
-  <Edit>DocumentLibraryForm</Edit>
-  <New>DocumentLibraryForm</New>
-</FormTemplates>
+<file path=customXml/item3.xml><?xml version="1.0" encoding="utf-8"?>
+<b:Sources xmlns:b="http://schemas.openxmlformats.org/officeDocument/2006/bibliography" xmlns="http://schemas.openxmlformats.org/officeDocument/2006/bibliography" SelectedStyle="\APASixthEditionOfficeOnline.xsl" StyleName="APA" Version="6"/>
 </file>
 
-<file path=customXml/item3.xml><?xml version="1.0" encoding="utf-8"?>
+<file path=customXml/item4.xml><?xml version="1.0" encoding="utf-8"?>
 <ct:contentTypeSchema xmlns:ct="http://schemas.microsoft.com/office/2006/metadata/contentType" xmlns:ma="http://schemas.microsoft.com/office/2006/metadata/properties/metaAttributes" ct:_="" ma:_="" ma:contentTypeName="Documento" ma:contentTypeID="0x01010050D375E88928F94091E6FD7AA4E06D15" ma:contentTypeVersion="13" ma:contentTypeDescription="Crie um novo documento." ma:contentTypeScope="" ma:versionID="7df79d7f540b57f8739ecf349a4839bc">
   <xsd:schema xmlns:xsd="http://www.w3.org/2001/XMLSchema" xmlns:xs="http://www.w3.org/2001/XMLSchema" xmlns:p="http://schemas.microsoft.com/office/2006/metadata/properties" xmlns:ns2="5ebac46c-3801-4f50-8d40-ff19a3d08a31" xmlns:ns3="04f7cffc-3ea8-4655-aac6-2c812ca3e62f" targetNamespace="http://schemas.microsoft.com/office/2006/metadata/properties" ma:root="true" ma:fieldsID="096b32e32a0a7c12d0d47f4c83d7cab2" ns2:_="" ns3:_="">
     <xsd:import namespace="5ebac46c-3801-4f50-8d40-ff19a3d08a31"/>
@@ -11281,11 +11329,15 @@
 </ct:contentTypeSchema>
 </file>
 
-<file path=customXml/item4.xml><?xml version="1.0" encoding="utf-8"?>
-<b:Sources xmlns:b="http://schemas.openxmlformats.org/officeDocument/2006/bibliography" xmlns="http://schemas.openxmlformats.org/officeDocument/2006/bibliography" SelectedStyle="\APASixthEditionOfficeOnline.xsl" StyleName="APA" Version="6"/>
+<file path=customXml/itemProps1.xml><?xml version="1.0" encoding="utf-8"?>
+<ds:datastoreItem xmlns:ds="http://schemas.openxmlformats.org/officeDocument/2006/customXml" ds:itemID="{34A391BE-20F1-46BC-8252-C95237E583C0}">
+  <ds:schemaRefs>
+    <ds:schemaRef ds:uri="http://schemas.microsoft.com/sharepoint/v3/contenttype/forms"/>
+  </ds:schemaRefs>
+</ds:datastoreItem>
 </file>
 
-<file path=customXml/itemProps1.xml><?xml version="1.0" encoding="utf-8"?>
+<file path=customXml/itemProps2.xml><?xml version="1.0" encoding="utf-8"?>
 <ds:datastoreItem xmlns:ds="http://schemas.openxmlformats.org/officeDocument/2006/customXml" ds:itemID="{FA899CDF-3A9C-426B-93AD-3CCFF23C4A5E}">
   <ds:schemaRefs>
     <ds:schemaRef ds:uri="http://schemas.microsoft.com/office/2006/metadata/properties"/>
@@ -11296,15 +11348,15 @@
 </ds:datastoreItem>
 </file>
 
-<file path=customXml/itemProps2.xml><?xml version="1.0" encoding="utf-8"?>
-<ds:datastoreItem xmlns:ds="http://schemas.openxmlformats.org/officeDocument/2006/customXml" ds:itemID="{34A391BE-20F1-46BC-8252-C95237E583C0}">
+<file path=customXml/itemProps3.xml><?xml version="1.0" encoding="utf-8"?>
+<ds:datastoreItem xmlns:ds="http://schemas.openxmlformats.org/officeDocument/2006/customXml" ds:itemID="{AB0B6225-2C28-4B59-AC07-D3905D9EBCC2}">
   <ds:schemaRefs>
-    <ds:schemaRef ds:uri="http://schemas.microsoft.com/sharepoint/v3/contenttype/forms"/>
+    <ds:schemaRef ds:uri="http://schemas.openxmlformats.org/officeDocument/2006/bibliography"/>
   </ds:schemaRefs>
 </ds:datastoreItem>
 </file>
 
-<file path=customXml/itemProps3.xml><?xml version="1.0" encoding="utf-8"?>
+<file path=customXml/itemProps4.xml><?xml version="1.0" encoding="utf-8"?>
 <ds:datastoreItem xmlns:ds="http://schemas.openxmlformats.org/officeDocument/2006/customXml" ds:itemID="{71D38CE4-905C-4C05-8C70-49A1BD3E3A17}">
   <ds:schemaRefs>
     <ds:schemaRef ds:uri="http://schemas.microsoft.com/office/2006/metadata/contentType"/>
@@ -11321,12 +11373,4 @@
     <ds:schemaRef ds:uri="http://schemas.microsoft.com/internal/obd"/>
   </ds:schemaRefs>
 </ds:datastoreItem>
-</file>
-
-<file path=customXml/itemProps4.xml><?xml version="1.0" encoding="utf-8"?>
-<ds:datastoreItem xmlns:ds="http://schemas.openxmlformats.org/officeDocument/2006/customXml" ds:itemID="{AB0B6225-2C28-4B59-AC07-D3905D9EBCC2}">
-  <ds:schemaRefs>
-    <ds:schemaRef ds:uri="http://schemas.openxmlformats.org/officeDocument/2006/bibliography"/>
-  </ds:schemaRefs>
-</ds:datastoreItem>
 </file>
</xml_diff>